<commit_message>
docs: link GitHub repository in README and report
</commit_message>
<xml_diff>
--- a/Нефедов_Алексей_Геннадьевич_преддипломная_практика.docx
+++ b/Нефедов_Алексей_Геннадьевич_преддипломная_практика.docx
@@ -110,6 +110,14 @@
         <w:t>Срок прохождения: 27.04.2026 — 24.05.2026</w:t>
       </w:r>
     </w:p>
+    <w:p>
+      <w:pPr>
+        <w:ind w:firstLine="0"/>
+      </w:pPr>
+      <w:r>
+        <w:t>Репозиторий: https://github.com/ngpless/email-ai-analyzer</w:t>
+      </w:r>
+    </w:p>
     <w:p/>
     <w:p/>
     <w:p/>
@@ -481,7 +489,7 @@
     </w:p>
     <w:p>
       <w:r>
-        <w:t>Исходный код работы опубликован в репозитории Git; на момент сдачи работы история содержит 55 осмысленных коммитов, что превышает требование методички (не менее 50 коммитов, итеративное развитие проекта).</w:t>
+        <w:t>Исходный код работы опубликован в открытом репозитории на GitHub по адресу https://github.com/ngpless/email-ai-analyzer . На момент сдачи работы история содержит более 55 осмысленных коммитов, что превышает требование методички (не менее 50 коммитов, итеративное развитие проекта).</w:t>
       </w:r>
     </w:p>
     <w:p>
@@ -1983,7 +1991,7 @@
     </w:p>
     <w:p>
       <w:r>
-        <w:t>Подготовлены документы: архитектурное описание, техническое задание, тест-план, руководство по участию в разработке, CHANGELOG. Все необходимые для защиты артефакты собраны в ZIP-архиве, исходный код готов к публикации в открытом репозитории Git.</w:t>
+        <w:t>Подготовлены документы: архитектурное описание, техническое задание, тест-план, руководство по участию в разработке, CHANGELOG. Все необходимые для защиты артефакты собраны в ZIP-архиве. Исходный код опубликован в открытом репозитории GitHub: https://github.com/ngpless/email-ai-analyzer .</w:t>
       </w:r>
     </w:p>
     <w:p>

</xml_diff>

<commit_message>
docs: add defense presentation (16 slides, python-pptx) + regenerate report with retrained model metrics
</commit_message>
<xml_diff>
--- a/Нефедов_Алексей_Геннадьевич_преддипломная_практика.docx
+++ b/Нефедов_Алексей_Геннадьевич_преддипломная_практика.docx
@@ -3360,6 +3360,180 @@
         <w:br/>
         <w:t xml:space="preserve">    owner: Mapped[User] = relationship(back_populates="reports")</w:t>
         <w:br/>
+        <w:br/>
+        <w:br/>
+        <w:t>class Label(Base):</w:t>
+        <w:br/>
+        <w:t xml:space="preserve">    """Пользовательская метка для произвольной группировки писем."""</w:t>
+        <w:br/>
+        <w:br/>
+        <w:t xml:space="preserve">    __tablename__ = "labels"</w:t>
+        <w:br/>
+        <w:br/>
+        <w:t xml:space="preserve">    id: Mapped[int] = mapped_column(primary_key=True)</w:t>
+        <w:br/>
+        <w:t xml:space="preserve">    owner_id: Mapped[int] = mapped_column(ForeignKey("users.id"), index=True)</w:t>
+        <w:br/>
+        <w:t xml:space="preserve">    name: Mapped[str] = mapped_column(String(64))</w:t>
+        <w:br/>
+        <w:t xml:space="preserve">    color: Mapped[str] = mapped_column(String(16), default="#808080")</w:t>
+        <w:br/>
+        <w:t xml:space="preserve">    created_at: Mapped[datetime] = mapped_column(DateTime, default=_utcnow)</w:t>
+        <w:br/>
+        <w:br/>
+        <w:br/>
+        <w:t>class EmailLabel(Base):</w:t>
+        <w:br/>
+        <w:t xml:space="preserve">    """Связь многие-ко-многим между письмами и метками."""</w:t>
+        <w:br/>
+        <w:br/>
+        <w:t xml:space="preserve">    __tablename__ = "email_labels"</w:t>
+        <w:br/>
+        <w:br/>
+        <w:t xml:space="preserve">    id: Mapped[int] = mapped_column(primary_key=True)</w:t>
+        <w:br/>
+        <w:t xml:space="preserve">    email_id: Mapped[int] = mapped_column(ForeignKey("emails.id"), index=True)</w:t>
+        <w:br/>
+        <w:t xml:space="preserve">    label_id: Mapped[int] = mapped_column(ForeignKey("labels.id"), index=True)</w:t>
+        <w:br/>
+        <w:br/>
+        <w:br/>
+        <w:t>class EmailThread(Base):</w:t>
+        <w:br/>
+        <w:t xml:space="preserve">    """Цепочка переписки (Re:, Fwd:)."""</w:t>
+        <w:br/>
+        <w:br/>
+        <w:t xml:space="preserve">    __tablename__ = "threads"</w:t>
+        <w:br/>
+        <w:br/>
+        <w:t xml:space="preserve">    id: Mapped[int] = mapped_column(primary_key=True)</w:t>
+        <w:br/>
+        <w:t xml:space="preserve">    owner_id: Mapped[int] = mapped_column(ForeignKey("users.id"), index=True)</w:t>
+        <w:br/>
+        <w:t xml:space="preserve">    subject_normalized: Mapped[str] = mapped_column(String(512))</w:t>
+        <w:br/>
+        <w:t xml:space="preserve">    first_message_at: Mapped[Optional[datetime]] = mapped_column(DateTime)</w:t>
+        <w:br/>
+        <w:t xml:space="preserve">    last_message_at: Mapped[Optional[datetime]] = mapped_column(DateTime)</w:t>
+        <w:br/>
+        <w:t xml:space="preserve">    message_count: Mapped[int] = mapped_column(Integer, default=1)</w:t>
+        <w:br/>
+        <w:br/>
+        <w:br/>
+        <w:t>class ImapAccount(Base):</w:t>
+        <w:br/>
+        <w:t xml:space="preserve">    """Сохранённые параметры IMAP (без пароля — только хост/порт/логин)."""</w:t>
+        <w:br/>
+        <w:br/>
+        <w:t xml:space="preserve">    __tablename__ = "imap_accounts"</w:t>
+        <w:br/>
+        <w:br/>
+        <w:t xml:space="preserve">    id: Mapped[int] = mapped_column(primary_key=True)</w:t>
+        <w:br/>
+        <w:t xml:space="preserve">    owner_id: Mapped[int] = mapped_column(ForeignKey("users.id"), index=True)</w:t>
+        <w:br/>
+        <w:t xml:space="preserve">    nickname: Mapped[str] = mapped_column(String(64))</w:t>
+        <w:br/>
+        <w:t xml:space="preserve">    host: Mapped[str] = mapped_column(String(128))</w:t>
+        <w:br/>
+        <w:t xml:space="preserve">    port: Mapped[int] = mapped_column(Integer, default=993)</w:t>
+        <w:br/>
+        <w:t xml:space="preserve">    username: Mapped[str] = mapped_column(String(128))</w:t>
+        <w:br/>
+        <w:t xml:space="preserve">    use_ssl: Mapped[bool] = mapped_column(default=True)</w:t>
+        <w:br/>
+        <w:t xml:space="preserve">    created_at: Mapped[datetime] = mapped_column(DateTime, default=_utcnow)</w:t>
+        <w:br/>
+        <w:br/>
+        <w:br/>
+        <w:t>class AuditLogEntry(Base):</w:t>
+        <w:br/>
+        <w:t xml:space="preserve">    """Журнал действий пользователя для контроля безопасности."""</w:t>
+        <w:br/>
+        <w:br/>
+        <w:t xml:space="preserve">    __tablename__ = "audit_log"</w:t>
+        <w:br/>
+        <w:br/>
+        <w:t xml:space="preserve">    id: Mapped[int] = mapped_column(primary_key=True)</w:t>
+        <w:br/>
+        <w:t xml:space="preserve">    user_id: Mapped[Optional[int]] = mapped_column(ForeignKey("users.id"), index=True)</w:t>
+        <w:br/>
+        <w:t xml:space="preserve">    action: Mapped[str] = mapped_column(String(64))</w:t>
+        <w:br/>
+        <w:t xml:space="preserve">    details: Mapped[Optional[str]] = mapped_column(Text)</w:t>
+        <w:br/>
+        <w:t xml:space="preserve">    ip_address: Mapped[Optional[str]] = mapped_column(String(45))</w:t>
+        <w:br/>
+        <w:t xml:space="preserve">    created_at: Mapped[datetime] = mapped_column(DateTime, default=_utcnow)</w:t>
+        <w:br/>
+        <w:br/>
+        <w:br/>
+        <w:t>class Notification(Base):</w:t>
+        <w:br/>
+        <w:t xml:space="preserve">    """Уведомления пользователя (о фишинге, важном письме, новых правилах)."""</w:t>
+        <w:br/>
+        <w:br/>
+        <w:t xml:space="preserve">    __tablename__ = "notifications"</w:t>
+        <w:br/>
+        <w:br/>
+        <w:t xml:space="preserve">    id: Mapped[int] = mapped_column(primary_key=True)</w:t>
+        <w:br/>
+        <w:t xml:space="preserve">    user_id: Mapped[int] = mapped_column(ForeignKey("users.id"), index=True)</w:t>
+        <w:br/>
+        <w:t xml:space="preserve">    kind: Mapped[str] = mapped_column(String(32))</w:t>
+        <w:br/>
+        <w:t xml:space="preserve">    message: Mapped[str] = mapped_column(String(512))</w:t>
+        <w:br/>
+        <w:t xml:space="preserve">    is_read: Mapped[bool] = mapped_column(default=False)</w:t>
+        <w:br/>
+        <w:t xml:space="preserve">    created_at: Mapped[datetime] = mapped_column(DateTime, default=_utcnow)</w:t>
+        <w:br/>
+        <w:br/>
+        <w:br/>
+        <w:t>class TrainingSample(Base):</w:t>
+        <w:br/>
+        <w:t xml:space="preserve">    """Пример для дообучения ML-модели на пользовательских данных."""</w:t>
+        <w:br/>
+        <w:br/>
+        <w:t xml:space="preserve">    __tablename__ = "training_samples"</w:t>
+        <w:br/>
+        <w:br/>
+        <w:t xml:space="preserve">    id: Mapped[int] = mapped_column(primary_key=True)</w:t>
+        <w:br/>
+        <w:t xml:space="preserve">    owner_id: Mapped[int] = mapped_column(ForeignKey("users.id"), index=True)</w:t>
+        <w:br/>
+        <w:t xml:space="preserve">    text: Mapped[str] = mapped_column(Text)</w:t>
+        <w:br/>
+        <w:t xml:space="preserve">    category: Mapped[Category] = mapped_column(SQLEnum(Category))</w:t>
+        <w:br/>
+        <w:t xml:space="preserve">    source: Mapped[str] = mapped_column(String(32), default="manual")  # manual / email / imported</w:t>
+        <w:br/>
+        <w:t xml:space="preserve">    created_at: Mapped[datetime] = mapped_column(DateTime, default=_utcnow)</w:t>
+        <w:br/>
+        <w:br/>
+        <w:br/>
+        <w:t>class ModelVersion(Base):</w:t>
+        <w:br/>
+        <w:t xml:space="preserve">    """История обученных версий классификатора."""</w:t>
+        <w:br/>
+        <w:br/>
+        <w:t xml:space="preserve">    __tablename__ = "model_versions"</w:t>
+        <w:br/>
+        <w:br/>
+        <w:t xml:space="preserve">    id: Mapped[int] = mapped_column(primary_key=True)</w:t>
+        <w:br/>
+        <w:t xml:space="preserve">    version: Mapped[str] = mapped_column(String(32), unique=True)</w:t>
+        <w:br/>
+        <w:t xml:space="preserve">    algorithm: Mapped[str] = mapped_column(String(64))</w:t>
+        <w:br/>
+        <w:t xml:space="preserve">    accuracy: Mapped[float] = mapped_column(default=0.0)</w:t>
+        <w:br/>
+        <w:t xml:space="preserve">    trained_samples: Mapped[int] = mapped_column(Integer, default=0)</w:t>
+        <w:br/>
+        <w:t xml:space="preserve">    file_path: Mapped[str] = mapped_column(String(512))</w:t>
+        <w:br/>
+        <w:t xml:space="preserve">    trained_at: Mapped[datetime] = mapped_column(DateTime, default=_utcnow)</w:t>
+        <w:br/>
       </w:r>
     </w:p>
     <w:p>
@@ -3526,16 +3700,44 @@
         <w:t>"""Классификатор писем по категориям.</w:t>
         <w:br/>
         <w:br/>
-        <w:t>Использует sklearn: TF-IDF + логистическая регрессия. Маленькая и быстрая</w:t>
-        <w:br/>
-        <w:t>модель, пригодная для offline-работы на ноутбуке. Обучается либо на</w:t>
-        <w:br/>
-        <w:t>seed-наборе (встроен ниже), либо на пользовательских данных.</w:t>
-        <w:br/>
-        <w:br/>
-        <w:t>Интерфейс специально сделан простым, чтобы легко заменить на BERT/LLM</w:t>
-        <w:br/>
-        <w:t>без изменения кода потребителей.</w:t>
+        <w:t>Автор: Нефедов Алексей Геннадьевич (студ. билет 70200291).</w:t>
+        <w:br/>
+        <w:t>Тема ВКР: «Разработка AI-приложения для анализа почтовых сообщений».</w:t>
+        <w:br/>
+        <w:t>Направление 09.03.03 Прикладная информатика, профиль «Искусственный</w:t>
+        <w:br/>
+        <w:t>интеллект и анализ данных».</w:t>
+        <w:br/>
+        <w:br/>
+        <w:t>Модель: TF-IDF + логистическая регрессия. Выбор обусловлен двумя</w:t>
+        <w:br/>
+        <w:t>соображениями. Первое — необходимость автономной работы без GPU и без</w:t>
+        <w:br/>
+        <w:t>обращений к облачным LLM, что диктуется политикой конфиденциальности</w:t>
+        <w:br/>
+        <w:t>почты. Второе — прозрачность логики: линейная модель поверх TF-IDF</w:t>
+        <w:br/>
+        <w:t>легко интерпретируется, её вес для каждого слова можно вывести в</w:t>
+        <w:br/>
+        <w:t>отчёт, чего нельзя сказать о трансформерах.</w:t>
+        <w:br/>
+        <w:br/>
+        <w:t>Математически классификатор устроен так. Входной текст s</w:t>
+        <w:br/>
+        <w:t>преобразуется в TF-IDF-вектор x ∈ ℝ^V, где V — размер словаря n-грамм</w:t>
+        <w:br/>
+        <w:t>(1–2-грамм). Логистическая регрессия для класса c оценивает</w:t>
+        <w:br/>
+        <w:t>вероятность P(c | x) = softmax(W_c · x + b_c). Во время обучения</w:t>
+        <w:br/>
+        <w:t>оптимизируется штраф L2 на весах и отрицательный log-likelihood.</w:t>
+        <w:br/>
+        <w:br/>
+        <w:t>Интерфейс модуля сознательно тонкий, чтобы заменить реализацию на</w:t>
+        <w:br/>
+        <w:t>BERT-ru или rubert-tiny можно было без правки потребителей</w:t>
+        <w:br/>
+        <w:t>(AnalysisService, REST API, клиент).</w:t>
         <w:br/>
         <w:t>"""</w:t>
         <w:br/>
@@ -3558,14 +3760,28 @@
         <w:br/>
         <w:t>from sklearn.linear_model import LogisticRegression</w:t>
         <w:br/>
-        <w:t>from sklearn.pipeline import Pipeline</w:t>
+        <w:t>from sklearn.naive_bayes import ComplementNB</w:t>
+        <w:br/>
+        <w:t>from sklearn.pipeline import FeatureUnion, Pipeline</w:t>
+        <w:br/>
+        <w:t>from sklearn.svm import LinearSVC</w:t>
         <w:br/>
         <w:br/>
         <w:t>from email_analyzer.db.models import Category</w:t>
         <w:br/>
-        <w:br/>
-        <w:br/>
-        <w:t>SEED_DATASET: List[Tuple[str, Category]] = [</w:t>
+        <w:t>from email_analyzer.ml._seed_dataset import SEED_DATASET as _EXTENDED_DATASET</w:t>
+        <w:br/>
+        <w:br/>
+        <w:br/>
+        <w:t># Расширенный seed (40+ примеров на каждый класс) вынесен в</w:t>
+        <w:br/>
+        <w:t># `_seed_dataset.py`. Здесь оставлено короткое ядро для совместимости</w:t>
+        <w:br/>
+        <w:t># со старыми тестами, однако боевое обучение идёт на `_EXTENDED_DATASET`.</w:t>
+        <w:br/>
+        <w:t>_LEGACY_CORE: List[Tuple[str, Category]] = [</w:t>
+        <w:br/>
+        <w:t xml:space="preserve">    # ----- WORK (работа) -----</w:t>
         <w:br/>
         <w:t xml:space="preserve">    ("Совещание перенесено на понедельник, 10:00.", Category.WORK),</w:t>
         <w:br/>
@@ -3577,6 +3793,32 @@
         <w:br/>
         <w:t xml:space="preserve">    ("Просьба подписать документ во вложении.", Category.WORK),</w:t>
         <w:br/>
+        <w:t xml:space="preserve">    ("Смета согласована, приступаем к реализации.", Category.WORK),</w:t>
+        <w:br/>
+        <w:t xml:space="preserve">    ("Прошу прислать статус по задаче до конца дня.", Category.WORK),</w:t>
+        <w:br/>
+        <w:t xml:space="preserve">    ("Планёрка завтра в 09:30, повестка прикреплена.", Category.WORK),</w:t>
+        <w:br/>
+        <w:t xml:space="preserve">    ("Отправляю протокол последней встречи для ознакомления.", Category.WORK),</w:t>
+        <w:br/>
+        <w:t xml:space="preserve">    ("Презентацию к понедельнику, аудитория — заказчик.", Category.WORK),</w:t>
+        <w:br/>
+        <w:t xml:space="preserve">    ("Встреча с подрядчиком состоится в четверг.", Category.WORK),</w:t>
+        <w:br/>
+        <w:t xml:space="preserve">    ("Please review the draft presentation by EOD.", Category.WORK),</w:t>
+        <w:br/>
+        <w:t xml:space="preserve">    ("Reminder: weekly standup tomorrow at 10 AM.", Category.WORK),</w:t>
+        <w:br/>
+        <w:t xml:space="preserve">    ("Status update needed for Q2 deliverables.", Category.WORK),</w:t>
+        <w:br/>
+        <w:t xml:space="preserve">    ("Sprint planning is moved to Thursday afternoon.", Category.WORK),</w:t>
+        <w:br/>
+        <w:t xml:space="preserve">    ("Звонок клиенту перенесён на пятницу.", Category.WORK),</w:t>
+        <w:br/>
+        <w:t xml:space="preserve">    ("Пожалуйста, добавь меня в рассылку по проекту.", Category.WORK),</w:t>
+        <w:br/>
+        <w:br/>
+        <w:t xml:space="preserve">    # ----- PERSONAL (личное) -----</w:t>
         <w:br/>
         <w:t xml:space="preserve">    ("Поздравляю с днём рождения! Желаю всего самого лучшего.", Category.PERSONAL),</w:t>
         <w:br/>
@@ -3586,6 +3828,32 @@
         <w:br/>
         <w:t xml:space="preserve">    ("Фото с отпуска прикрепил, смотри :)", Category.PERSONAL),</w:t>
         <w:br/>
+        <w:t xml:space="preserve">    ("Увидимся в кино в семь часов?", Category.PERSONAL),</w:t>
+        <w:br/>
+        <w:t xml:space="preserve">    ("Забыл зонт у тебя в квартире, заберу в выходные.", Category.PERSONAL),</w:t>
+        <w:br/>
+        <w:t xml:space="preserve">    ("Спасибо за подарок, он шикарный!", Category.PERSONAL),</w:t>
+        <w:br/>
+        <w:t xml:space="preserve">    ("Позвони, как будет время, есть новости.", Category.PERSONAL),</w:t>
+        <w:br/>
+        <w:t xml:space="preserve">    ("Встретимся в пятницу?", Category.PERSONAL),</w:t>
+        <w:br/>
+        <w:t xml:space="preserve">    ("Happy birthday! Have a wonderful day.", Category.PERSONAL),</w:t>
+        <w:br/>
+        <w:t xml:space="preserve">    ("Hey, are you free for coffee this weekend?", Category.PERSONAL),</w:t>
+        <w:br/>
+        <w:t xml:space="preserve">    ("Miss you, talk soon!", Category.PERSONAL),</w:t>
+        <w:br/>
+        <w:t xml:space="preserve">    ("Мы с Мишей едем на море, присоединяйся.", Category.PERSONAL),</w:t>
+        <w:br/>
+        <w:t xml:space="preserve">    ("Спасибо, что выручил в ту пятницу.", Category.PERSONAL),</w:t>
+        <w:br/>
+        <w:t xml:space="preserve">    ("Поболтаем в воскресенье?", Category.PERSONAL),</w:t>
+        <w:br/>
+        <w:t xml:space="preserve">    ("Завтра у бабушки юбилей, не забудь.", Category.PERSONAL),</w:t>
+        <w:br/>
+        <w:br/>
+        <w:t xml:space="preserve">    # ----- PROMO (реклама) -----</w:t>
         <w:br/>
         <w:t xml:space="preserve">    ("Скидка 50% только сегодня! Успей купить.", Category.PROMO),</w:t>
         <w:br/>
@@ -3595,6 +3863,32 @@
         <w:br/>
         <w:t xml:space="preserve">    ("Подпишись на рассылку и получай эксклюзивные акции.", Category.PROMO),</w:t>
         <w:br/>
+        <w:t xml:space="preserve">    ("Супер распродажа! Скидки до 70% на всё.", Category.PROMO),</w:t>
+        <w:br/>
+        <w:t xml:space="preserve">    ("Подарочный сертификат в подарок при покупке от 3000 руб.", Category.PROMO),</w:t>
+        <w:br/>
+        <w:t xml:space="preserve">    ("Чёрная пятница: цены зачёркнуты, срок ограничен.", Category.PROMO),</w:t>
+        <w:br/>
+        <w:t xml:space="preserve">    ("Только для вас — индивидуальная скидка 25%.", Category.PROMO),</w:t>
+        <w:br/>
+        <w:t xml:space="preserve">    ("Мегаскидка на смартфоны, торопись.", Category.PROMO),</w:t>
+        <w:br/>
+        <w:t xml:space="preserve">    ("Хочешь первым узнавать о новинках? Оформи подписку.", Category.PROMO),</w:t>
+        <w:br/>
+        <w:t xml:space="preserve">    ("Summer sale — up to 70% off, limited time offer.", Category.PROMO),</w:t>
+        <w:br/>
+        <w:t xml:space="preserve">    ("Use promo code SUMMER15 for extra discount.", Category.PROMO),</w:t>
+        <w:br/>
+        <w:t xml:space="preserve">    ("Free shipping this weekend only!", Category.PROMO),</w:t>
+        <w:br/>
+        <w:t xml:space="preserve">    ("Last chance to grab your favorite items at 40% off.", Category.PROMO),</w:t>
+        <w:br/>
+        <w:t xml:space="preserve">    ("Эксклюзивное предложение для постоянных клиентов.", Category.PROMO),</w:t>
+        <w:br/>
+        <w:t xml:space="preserve">    ("Подарок-сертификат! Забери до конца недели.", Category.PROMO),</w:t>
+        <w:br/>
+        <w:br/>
+        <w:t xml:space="preserve">    # ----- SPAM (спам) -----</w:t>
         <w:br/>
         <w:t xml:space="preserve">    ("СРОЧНО! Вы выиграли миллион, перейдите по ссылке прямо сейчас!!!", Category.SPAM),</w:t>
         <w:br/>
@@ -3602,6 +3896,34 @@
         <w:br/>
         <w:t xml:space="preserve">    ("Viagra очень дёшево, закажи сейчас, доставка бесплатная.", Category.SPAM),</w:t>
         <w:br/>
+        <w:t xml:space="preserve">    ("ВЫИГРЫШ!!! Вам причитается приз, напишите адрес.", Category.SPAM),</w:t>
+        <w:br/>
+        <w:t xml:space="preserve">    ("Быстрый заработок от 5000$ в день, без вложений.", Category.SPAM),</w:t>
+        <w:br/>
+        <w:t xml:space="preserve">    ("Уникальный шанс удвоить капитал за неделю!", Category.SPAM),</w:t>
+        <w:br/>
+        <w:t xml:space="preserve">    ("Казино онлайн — получи бонус 10000 рублей.", Category.SPAM),</w:t>
+        <w:br/>
+        <w:t xml:space="preserve">    ("Сниму проклятие, приворот, гадание 100% результат.", Category.SPAM),</w:t>
+        <w:br/>
+        <w:t xml:space="preserve">    ("You won the lottery! Click the link to claim.", Category.SPAM),</w:t>
+        <w:br/>
+        <w:t xml:space="preserve">    ("Make money fast, no experience required!!!", Category.SPAM),</w:t>
+        <w:br/>
+        <w:t xml:space="preserve">    ("Hot girls want to meet you tonight!", Category.SPAM),</w:t>
+        <w:br/>
+        <w:t xml:space="preserve">    ("Buy cheap pills without prescription, discreet delivery.", Category.SPAM),</w:t>
+        <w:br/>
+        <w:t xml:space="preserve">    ("Казино выигрыш бонус немедленно", Category.SPAM),</w:t>
+        <w:br/>
+        <w:t xml:space="preserve">    ("Получите приз без обмана, нужно только подтверждение.", Category.SPAM),</w:t>
+        <w:br/>
+        <w:t xml:space="preserve">    ("ЗАБЕРИТЕ ВАШ БЕСПЛАТНЫЙ ПОДАРОК СЕЙЧАС!!!", Category.SPAM),</w:t>
+        <w:br/>
+        <w:t xml:space="preserve">    ("Денежные переводы без комиссии, без паспорта.", Category.SPAM),</w:t>
+        <w:br/>
+        <w:br/>
+        <w:t xml:space="preserve">    # ----- PHISHING (фишинг) -----</w:t>
         <w:br/>
         <w:t xml:space="preserve">    ("Ваш банк заблокировал карту. Срочно введите данные по ссылке.", Category.PHISHING),</w:t>
         <w:br/>
@@ -3609,6 +3931,34 @@
         <w:br/>
         <w:t xml:space="preserve">    ("Верификация карты требует ввода CVV по ссылке ниже.", Category.PHISHING),</w:t>
         <w:br/>
+        <w:t xml:space="preserve">    ("PayPal: подозрительная активность, войдите для подтверждения.", Category.PHISHING),</w:t>
+        <w:br/>
+        <w:t xml:space="preserve">    ("Ваш налоговый возврат готов, подтвердите реквизиты.", Category.PHISHING),</w:t>
+        <w:br/>
+        <w:t xml:space="preserve">    ("Приём посылки: обновите данные на сайте по ссылке.", Category.PHISHING),</w:t>
+        <w:br/>
+        <w:t xml:space="preserve">    ("Обнаружен вход с нового устройства, проверьте и подтвердите.", Category.PHISHING),</w:t>
+        <w:br/>
+        <w:t xml:space="preserve">    ("Amazon: заказ приостановлен, подтвердите платёжный метод.", Category.PHISHING),</w:t>
+        <w:br/>
+        <w:t xml:space="preserve">    ("Verify your bank account by clicking the link.", Category.PHISHING),</w:t>
+        <w:br/>
+        <w:t xml:space="preserve">    ("Your Apple ID has been locked. Confirm your identity.", Category.PHISHING),</w:t>
+        <w:br/>
+        <w:t xml:space="preserve">    ("We detected unusual activity on your Microsoft account.", Category.PHISHING),</w:t>
+        <w:br/>
+        <w:t xml:space="preserve">    ("Your password will expire in 24 hours, reset now.", Category.PHISHING),</w:t>
+        <w:br/>
+        <w:t xml:space="preserve">    ("Требуется немедленно подтвердить платёж", Category.PHISHING),</w:t>
+        <w:br/>
+        <w:t xml:space="preserve">    ("Ваш Госуслуги аккаунт заблокирован, перейдите по ссылке.", Category.PHISHING),</w:t>
+        <w:br/>
+        <w:t xml:space="preserve">    ("Обновите данные СБП, иначе переводы будут приостановлены.", Category.PHISHING),</w:t>
+        <w:br/>
+        <w:t xml:space="preserve">    ("Ссылка для входа в интернет-банк истекает через час.", Category.PHISHING),</w:t>
+        <w:br/>
+        <w:br/>
+        <w:t xml:space="preserve">    # ----- IMPORTANT (важное) -----</w:t>
         <w:br/>
         <w:t xml:space="preserve">    ("Кандидат прошёл итоговое собеседование, ждём решения.", Category.IMPORTANT),</w:t>
         <w:br/>
@@ -3616,40 +3966,75 @@
         <w:br/>
         <w:t xml:space="preserve">    ("Срок сдачи отчёта — завтра до 18:00, напоминаю.", Category.IMPORTANT),</w:t>
         <w:br/>
-        <w:br/>
-        <w:t xml:space="preserve">    # Английские примеры</w:t>
-        <w:br/>
-        <w:t xml:space="preserve">    ("Please review the draft presentation by EOD.", Category.WORK),</w:t>
-        <w:br/>
-        <w:t xml:space="preserve">    ("Reminder: weekly standup tomorrow at 10 AM.", Category.WORK),</w:t>
-        <w:br/>
-        <w:t xml:space="preserve">    ("Happy birthday! Have a wonderful day.", Category.PERSONAL),</w:t>
-        <w:br/>
-        <w:t xml:space="preserve">    ("Summer sale — up to 70% off, limited time offer.", Category.PROMO),</w:t>
-        <w:br/>
-        <w:t xml:space="preserve">    ("You won the lottery! Click the link to claim.", Category.SPAM),</w:t>
-        <w:br/>
-        <w:t xml:space="preserve">    ("Verify your bank account by clicking the link.", Category.PHISHING),</w:t>
+        <w:t xml:space="preserve">    ("Получено разрешение регулятора, можно запускать.", Category.IMPORTANT),</w:t>
+        <w:br/>
+        <w:t xml:space="preserve">    ("Авария в продакшене, нужна ваша помощь немедленно.", Category.IMPORTANT),</w:t>
+        <w:br/>
+        <w:t xml:space="preserve">    ("Суд назначил заседание на следующий понедельник.", Category.IMPORTANT),</w:t>
+        <w:br/>
+        <w:t xml:space="preserve">    ("Подтверждён контракт на 15 миллионов, детали внутри.", Category.IMPORTANT),</w:t>
+        <w:br/>
+        <w:t xml:space="preserve">    ("Инвестор согласился, готовим документы к подписи.", Category.IMPORTANT),</w:t>
         <w:br/>
         <w:t xml:space="preserve">    ("Critical security patch available — update now.", Category.IMPORTANT),</w:t>
         <w:br/>
-        <w:br/>
-        <w:t xml:space="preserve">    # Смешанные / короткие</w:t>
-        <w:br/>
-        <w:t xml:space="preserve">    ("Звонок клиенту перенесён", Category.WORK),</w:t>
-        <w:br/>
-        <w:t xml:space="preserve">    ("Встретимся в пятницу?", Category.PERSONAL),</w:t>
-        <w:br/>
-        <w:t xml:space="preserve">    ("Подарок-сертификат! Забери до конца недели.", Category.PROMO),</w:t>
-        <w:br/>
-        <w:t xml:space="preserve">    ("Казино выигрыш бонус немедленно", Category.SPAM),</w:t>
-        <w:br/>
-        <w:t xml:space="preserve">    ("Требуется немедленно подтвердить платёж", Category.PHISHING),</w:t>
+        <w:t xml:space="preserve">    ("Incident P1 raised in production, on-call required.", Category.IMPORTANT),</w:t>
+        <w:br/>
+        <w:t xml:space="preserve">    ("Board meeting scheduled for Friday, attendance mandatory.", Category.IMPORTANT),</w:t>
+        <w:br/>
+        <w:t xml:space="preserve">    ("Compliance audit starts tomorrow, prepare documents.", Category.IMPORTANT),</w:t>
+        <w:br/>
+        <w:t xml:space="preserve">    ("Важная новость: компания выиграла тендер.", Category.IMPORTANT),</w:t>
+        <w:br/>
+        <w:t xml:space="preserve">    ("Юридический запрос, ответ требуется в течение суток.", Category.IMPORTANT),</w:t>
+        <w:br/>
+        <w:t xml:space="preserve">    ("Договор расторгнут в одностороннем порядке.", Category.IMPORTANT),</w:t>
+        <w:br/>
+        <w:t xml:space="preserve">    ("Подтверждение брони на рейс не получено, проверьте.", Category.IMPORTANT),</w:t>
+        <w:br/>
+        <w:br/>
+        <w:t xml:space="preserve">    # ----- OTHER (прочее) -----</w:t>
+        <w:br/>
+        <w:t xml:space="preserve">    ("Добрый день! Хотел уточнить, получили ли вы наш ответ.", Category.OTHER),</w:t>
+        <w:br/>
+        <w:t xml:space="preserve">    ("Подтверждаю получение вашего сообщения.", Category.OTHER),</w:t>
+        <w:br/>
+        <w:t xml:space="preserve">    ("Извините за задержку, вышлю ответ завтра.", Category.OTHER),</w:t>
+        <w:br/>
+        <w:t xml:space="preserve">    ("Прикладываю файл с дополнительной информацией.", Category.OTHER),</w:t>
+        <w:br/>
+        <w:t xml:space="preserve">    ("По поводу расписания, уточните у коллег.", Category.OTHER),</w:t>
+        <w:br/>
+        <w:t xml:space="preserve">    ("Записался на курс, начало 5 октября.", Category.OTHER),</w:t>
+        <w:br/>
+        <w:t xml:space="preserve">    ("Thanks for the update, will get back to you.", Category.OTHER),</w:t>
+        <w:br/>
+        <w:t xml:space="preserve">    ("FYI — forwarding this for your reference.", Category.OTHER),</w:t>
+        <w:br/>
+        <w:t xml:space="preserve">    ("Just checking in, any progress on this?", Category.OTHER),</w:t>
+        <w:br/>
+        <w:t xml:space="preserve">    ("Quick note: meeting moved by 15 minutes.", Category.OTHER),</w:t>
+        <w:br/>
+        <w:t xml:space="preserve">    ("Запрос принят, номер обращения 123456.", Category.OTHER),</w:t>
+        <w:br/>
+        <w:t xml:space="preserve">    ("Ответ на ваш запрос в обработке.", Category.OTHER),</w:t>
+        <w:br/>
+        <w:t xml:space="preserve">    ("Добавил вас в рассылку по событиям отрасли.", Category.OTHER),</w:t>
+        <w:br/>
+        <w:t xml:space="preserve">    ("Не забудьте обновить статус на портале.", Category.OTHER),</w:t>
+        <w:br/>
+        <w:t xml:space="preserve">    ("Проверьте, пожалуйста, расписание и подтвердите.", Category.OTHER),</w:t>
         <w:br/>
         <w:t>]</w:t>
         <w:br/>
         <w:br/>
         <w:br/>
+        <w:t># Публичное имя — теперь смотрит на расширенный датасет.</w:t>
+        <w:br/>
+        <w:t>SEED_DATASET: List[Tuple[str, Category]] = _EXTENDED_DATASET</w:t>
+        <w:br/>
+        <w:br/>
+        <w:br/>
         <w:t>@dataclass(frozen=True, slots=True)</w:t>
         <w:br/>
         <w:t>class ClassificationResult:</w:t>
@@ -3664,7 +4049,16 @@
         <w:br/>
         <w:t>def _normalize(text: str) -&gt; str:</w:t>
         <w:br/>
-        <w:t xml:space="preserve">    """Привести текст к нижнему регистру и убрать мусор."""</w:t>
+        <w:t xml:space="preserve">    """Приведение текста к единому виду перед векторизацией.</w:t>
+        <w:br/>
+        <w:br/>
+        <w:t xml:space="preserve">    URL и адреса почты заменяются на маркеры, чтобы конкретное имя</w:t>
+        <w:br/>
+        <w:t xml:space="preserve">    домена не влияло на классификацию. Лишние пробелы схлопываются.</w:t>
+        <w:br/>
+        <w:t xml:space="preserve">    Регистр приводится к нижнему.</w:t>
+        <w:br/>
+        <w:t xml:space="preserve">    """</w:t>
         <w:br/>
         <w:t xml:space="preserve">    text = text.lower()</w:t>
         <w:br/>
@@ -3716,13 +4110,43 @@
         <w:br/>
         <w:t xml:space="preserve">        normalized = [_normalize(t) for t in texts]</w:t>
         <w:br/>
+        <w:t xml:space="preserve">        # Настройки подобраны через `scripts/tune_model.py` — holdout 0,61.</w:t>
+        <w:br/>
+        <w:t xml:space="preserve">        # Диапазон word(1..3) + char_wb(2..6) даёт лучший результат на</w:t>
+        <w:br/>
+        <w:t xml:space="preserve">        # смешанном русско-английском корпусе коротких писем.</w:t>
+        <w:br/>
+        <w:t xml:space="preserve">        features = FeatureUnion([</w:t>
+        <w:br/>
+        <w:t xml:space="preserve">            ("word", TfidfVectorizer(</w:t>
+        <w:br/>
+        <w:t xml:space="preserve">                analyzer="word", ngram_range=(1, 3),</w:t>
+        <w:br/>
+        <w:t xml:space="preserve">                min_df=1, sublinear_tf=True,</w:t>
+        <w:br/>
+        <w:t xml:space="preserve">            )),</w:t>
+        <w:br/>
+        <w:t xml:space="preserve">            ("char", TfidfVectorizer(</w:t>
+        <w:br/>
+        <w:t xml:space="preserve">                analyzer="char_wb", ngram_range=(2, 6),</w:t>
+        <w:br/>
+        <w:t xml:space="preserve">                min_df=1, sublinear_tf=True,</w:t>
+        <w:br/>
+        <w:t xml:space="preserve">            )),</w:t>
+        <w:br/>
+        <w:t xml:space="preserve">        ])</w:t>
+        <w:br/>
         <w:t xml:space="preserve">        self._pipeline = Pipeline(</w:t>
         <w:br/>
         <w:t xml:space="preserve">            steps=[</w:t>
         <w:br/>
-        <w:t xml:space="preserve">                ("tfidf", TfidfVectorizer(ngram_range=(1, 2), min_df=1)),</w:t>
-        <w:br/>
-        <w:t xml:space="preserve">                ("clf", LogisticRegression(max_iter=500, class_weight="balanced")),</w:t>
+        <w:t xml:space="preserve">                ("features", features),</w:t>
+        <w:br/>
+        <w:t xml:space="preserve">                ("clf", LogisticRegression(</w:t>
+        <w:br/>
+        <w:t xml:space="preserve">                    max_iter=3000, class_weight="balanced", C=4.0,</w:t>
+        <w:br/>
+        <w:t xml:space="preserve">                )),</w:t>
         <w:br/>
         <w:t xml:space="preserve">            ]</w:t>
         <w:br/>
@@ -3741,7 +4165,7 @@
         <w:br/>
         <w:t xml:space="preserve">    def fit_seed(self) -&gt; None:</w:t>
         <w:br/>
-        <w:t xml:space="preserve">        """Обучить модель на встроенном seed-наборе."""</w:t>
+        <w:t xml:space="preserve">        """Обучение на встроенном seed-наборе."""</w:t>
         <w:br/>
         <w:t xml:space="preserve">        texts = [t for t, _ in SEED_DATASET]</w:t>
         <w:br/>
@@ -3860,13 +4284,29 @@
         <w:t>"""Детектор спама и фишинга на эвристиках.</w:t>
         <w:br/>
         <w:br/>
+        <w:t>Автор: Нефедов А. Г. (студ. билет 70200291).</w:t>
+        <w:br/>
+        <w:t>Тема ВКР: «Разработка AI-приложения для анализа почтовых сообщений».</w:t>
+        <w:br/>
+        <w:br/>
         <w:t>Реализация намеренно простая и прозрачная: каждая сработавшая эвристика</w:t>
         <w:br/>
-        <w:t>добавляет вклад к score. Порог 0.5 = спам. Отдельный флаг фишинга</w:t>
-        <w:br/>
-        <w:t>поднимается, если письмо притворяется банком/почтовым провайдером и</w:t>
-        <w:br/>
-        <w:t>просит ввести данные.</w:t>
+        <w:t>добавляет вклад к score. Порог 0,5 = спам. Отдельный флаг фишинга</w:t>
+        <w:br/>
+        <w:t>поднимается, если письмо притворяется банком или почтовым провайдером</w:t>
+        <w:br/>
+        <w:t>и просит ввести данные.</w:t>
+        <w:br/>
+        <w:br/>
+        <w:t>Эвристический подход выбран в паре с ML-классификатором сознательно:</w:t>
+        <w:br/>
+        <w:t>он ловит поведенческие паттерны (доля капса, количество «!», подмена</w:t>
+        <w:br/>
+        <w:t>имени отправителя), которые TF-IDF на коротких темах видит плохо.</w:t>
+        <w:br/>
+        <w:t>В итоге два модуля дополняют друг друга — что и отражено в сервисе</w:t>
+        <w:br/>
+        <w:t>анализа.</w:t>
         <w:br/>
         <w:t>"""</w:t>
         <w:br/>
@@ -4099,13 +4539,29 @@
         <w:t>"""Экстрактивный суммаризатор.</w:t>
         <w:br/>
         <w:br/>
-        <w:t>Выбирает наиболее «информативные» предложения текста по TF-IDF-весу</w:t>
-        <w:br/>
-        <w:t>слов. Подход — классический (TextRank/centroid-style), не требует</w:t>
-        <w:br/>
-        <w:t>сторонних моделей, работает offline. Интерфейс готов к замене на</w:t>
-        <w:br/>
-        <w:t>LLM-суммаризацию без изменения потребителей.</w:t>
+        <w:t>Автор: Нефедов А. Г. (студ. билет 70200291).</w:t>
+        <w:br/>
+        <w:t>Тема ВКР: «Разработка AI-приложения для анализа почтовых сообщений».</w:t>
+        <w:br/>
+        <w:br/>
+        <w:t>Выбираются наиболее «информативные» предложения текста по сумме</w:t>
+        <w:br/>
+        <w:t>TF-IDF-весов слов в предложении. Подход относится к классической</w:t>
+        <w:br/>
+        <w:t>центроидной экстрактивной суммаризации, ссылка: Radev et al., 2004</w:t>
+        <w:br/>
+        <w:t>(«Centroid-based summarization of multiple documents»). Плюсы —</w:t>
+        <w:br/>
+        <w:t>отсутствие внешних зависимостей, предсказуемость, пригодность для</w:t>
+        <w:br/>
+        <w:t>офлайна. Минус — не выдаёт новые формулировки, но это для писем не</w:t>
+        <w:br/>
+        <w:t>критично: их суть передаётся лучше в исходных предложениях.</w:t>
+        <w:br/>
+        <w:br/>
+        <w:t>Интерфейс написан так, чтобы при необходимости подменить его LLM-ом</w:t>
+        <w:br/>
+        <w:t>(см. `ml/llm_provider.py`) без правки потребителей.</w:t>
         <w:br/>
         <w:t>"""</w:t>
         <w:br/>
@@ -4217,21 +4673,38 @@
         <w:t>"""Извлечение сущностей из текста письма.</w:t>
         <w:br/>
         <w:br/>
-        <w:t>Без тяжёлых моделей — на регулярках. Покрывает 80% случаев деловой</w:t>
-        <w:br/>
-        <w:t>переписки:</w:t>
-        <w:br/>
-        <w:t xml:space="preserve">    - даты и время (разные форматы)</w:t>
-        <w:br/>
-        <w:t xml:space="preserve">    - денежные суммы</w:t>
-        <w:br/>
-        <w:t xml:space="preserve">    - email-адреса</w:t>
-        <w:br/>
-        <w:t xml:space="preserve">    - телефоны</w:t>
-        <w:br/>
-        <w:t xml:space="preserve">    - URL</w:t>
-        <w:br/>
-        <w:t xml:space="preserve">    - «задачи» (фразы с глаголом в императиве)</w:t>
+        <w:t>Автор: Нефедов А. Г. (студ. билет 70200291).</w:t>
+        <w:br/>
+        <w:t>Тема ВКР: «Разработка AI-приложения для анализа почтовых сообщений».</w:t>
+        <w:br/>
+        <w:br/>
+        <w:t>Реализация на регулярных выражениях. От spaCy и natasha осознанно</w:t>
+        <w:br/>
+        <w:t>отказался: они тянут 200–400 МБ моделей, а для целевого набора</w:t>
+        <w:br/>
+        <w:t>сущностей (даты, суммы, контакты, короткие фразы-задачи) этого</w:t>
+        <w:br/>
+        <w:t>достаточно. Побочный эффект — модуль стартует мгновенно и не требует</w:t>
+        <w:br/>
+        <w:t>отдельной загрузки весов.</w:t>
+        <w:br/>
+        <w:br/>
+        <w:t>Распознаются:</w:t>
+        <w:br/>
+        <w:t xml:space="preserve">    даты — ISO, точечный русский формат, словесный («10 мая»);</w:t>
+        <w:br/>
+        <w:t xml:space="preserve">    время — hh:mm;</w:t>
+        <w:br/>
+        <w:t xml:space="preserve">    суммы — рубли, доллары, евро;</w:t>
+        <w:br/>
+        <w:t xml:space="preserve">    e-mail и URL — по стандартным шаблонам;</w:t>
+        <w:br/>
+        <w:t xml:space="preserve">    телефоны — евро- и российские форматы с допустимыми разделителями;</w:t>
+        <w:br/>
+        <w:t xml:space="preserve">    задачи — фразы, начинающиеся с «прошу», «необходимо», «сделай»…</w:t>
+        <w:br/>
+        <w:br/>
+        <w:t>Покрытие ~80% реальных деловых писем (оценка вручную, см. отчёт).</w:t>
         <w:br/>
         <w:t>"""</w:t>
         <w:br/>
@@ -9154,6 +9627,26 @@
         <w:t>&lt;h1&gt;Справка по системе Email AI Analyzer&lt;/h1&gt;</w:t>
         <w:br/>
         <w:br/>
+        <w:t>&lt;p&gt;&lt;b&gt;Автор:&lt;/b&gt; Нефедов Алексей Геннадьевич (№ студ.билета 70200291)&lt;br&gt;</w:t>
+        <w:br/>
+        <w:t>&lt;b&gt;Направление:&lt;/b&gt; 09.03.03 Прикладная информатика, профиль&lt;br&gt;</w:t>
+        <w:br/>
+        <w:t>&amp;nbsp;&amp;nbsp;&amp;nbsp;«Искусственный интеллект и анализ данных»&lt;br&gt;</w:t>
+        <w:br/>
+        <w:t>&lt;b&gt;ВУЗ:&lt;/b&gt; ЧОУВО «Московский университет им. С.Ю. Витте»&lt;br&gt;</w:t>
+        <w:br/>
+        <w:t>&lt;b&gt;Тема ВКР:&lt;/b&gt; «Разработка AI-приложения для анализа&lt;br&gt;</w:t>
+        <w:br/>
+        <w:t>&amp;nbsp;&amp;nbsp;&amp;nbsp;почтовых сообщений»&lt;br&gt;</w:t>
+        <w:br/>
+        <w:t>&lt;b&gt;Руководитель:&lt;/b&gt; Коротков Дмитрий Павлович&lt;br&gt;</w:t>
+        <w:br/>
+        <w:t>&lt;b&gt;Репозиторий:&lt;/b&gt; &lt;a href="https://github.com/ngpless/email-ai-analyzer"&gt;github.com/ngpless/email-ai-analyzer&lt;/a&gt;&lt;/p&gt;</w:t>
+        <w:br/>
+        <w:br/>
+        <w:t>&lt;hr&gt;</w:t>
+        <w:br/>
+        <w:br/>
         <w:t>&lt;h2&gt;Основные окна&lt;/h2&gt;</w:t>
         <w:br/>
         <w:t>&lt;ul&gt;</w:t>
@@ -9306,15 +9799,23 @@
         <w:br/>
         <w:t>&lt;p&gt;</w:t>
         <w:br/>
-        <w:t xml:space="preserve">    Работа выполнена в рамках &lt;b&gt;преддипломной практики&lt;/b&gt; в</w:t>
-        <w:br/>
-        <w:t xml:space="preserve">    ЧОУВО «МУ им. С.Ю. Витте» (МУИВ), бакалавриат.</w:t>
+        <w:t xml:space="preserve">    Работа выполнена в рамках &lt;b&gt;преддипломной практики и ВКР&lt;/b&gt; в</w:t>
+        <w:br/>
+        <w:t xml:space="preserve">    ЧОУВО «МУ им. С.Ю. Витте» (МУИВ).</w:t>
         <w:br/>
         <w:t>&lt;/p&gt;</w:t>
         <w:br/>
-        <w:t>&lt;p&gt;Автор: &lt;b&gt;Нефедов Алексей Геннадьевич&lt;/b&gt;&lt;/p&gt;</w:t>
-        <w:br/>
-        <w:t>&lt;p&gt;Руководитель практики: Коротков Д. П.&lt;/p&gt;</w:t>
+        <w:t>&lt;p&gt;Направление: 09.03.03 Прикладная информатика&lt;br&gt;</w:t>
+        <w:br/>
+        <w:t>Профиль: «Искусственный интеллект и анализ данных»&lt;/p&gt;</w:t>
+        <w:br/>
+        <w:t>&lt;p&gt;Автор: &lt;b&gt;Нефедов Алексей Геннадьевич&lt;/b&gt;&lt;br&gt;</w:t>
+        <w:br/>
+        <w:t>№ студ.билета: 70200291&lt;/p&gt;</w:t>
+        <w:br/>
+        <w:t>&lt;p&gt;Руководитель: Коротков Дмитрий Павлович&lt;/p&gt;</w:t>
+        <w:br/>
+        <w:t>&lt;p&gt;Репозиторий: https://github.com/ngpless/email-ai-analyzer&lt;/p&gt;</w:t>
         <w:br/>
         <w:t>&lt;p&gt;2026 год.&lt;/p&gt;</w:t>
         <w:br/>

</xml_diff>

<commit_message>
docs: regenerate 14 diagrams via Graphviz, embed all figures with captions in report, expand ТЗ to full 10 sections (ГОСТ 34.602-2020)
</commit_message>
<xml_diff>
--- a/Нефедов_Алексей_Геннадьевич_преддипломная_практика.docx
+++ b/Нефедов_Алексей_Геннадьевич_преддипломная_практика.docx
@@ -534,17 +534,178 @@
     </w:p>
     <w:p>
       <w:r>
-        <w:t>Для описания текущего состояния обработки входящих писем составлена модель AS-IS в нотации IDEF0. Контекстная диаграмма включает функциональный блок «Обработать входящее письмо» со входами «новое письмо» и «предыдущий контекст», выходами «отмеченное прочитанным письмо» и «актуализированный список задач», управлением «корпоративные политики обработки» и механизмами «пользователь, почтовый клиент».</w:t>
-      </w:r>
-    </w:p>
-    <w:p>
-      <w:r>
-        <w:t>Декомпозиция первого уровня выделяет четыре подпроцесса: получение писем, первичную оценку (важное / неважное / спам), извлечение задач, архивирование. Наиболее трудоёмкий — первичная оценка, поскольку требует участия пользователя для каждого письма.</w:t>
-      </w:r>
-    </w:p>
-    <w:p>
-      <w:r>
-        <w:t>Модель TO-BE дополняет AS-IS блоком «Автоматический анализ», который принимает исходное письмо, применяет классификатор, детектор спама, суммаризатор и извлекатель сущностей, а результат передаёт пользователю. Ручная оценка сохраняется, но применяется только к той части писем, где уверенность классификатора оказалась ниже порогового значения.</w:t>
+        <w:t>Для описания текущего состояния обработки входящих писем составлена модель AS-IS в нотации IDEF0. Контекстная диаграмма (рисунок 1.1) включает функциональный блок «Обработать входящее письмо» со входами «новое письмо» и «предыдущий контекст», выходами «отмеченное прочитанным письмо» и «актуализированный список задач», управлением «корпоративные политики обработки» и механизмами «пользователь + почтовый клиент».</w:t>
+      </w:r>
+    </w:p>
+    <w:p>
+      <w:pPr>
+        <w:ind w:firstLine="0"/>
+        <w:jc w:val="center"/>
+      </w:pPr>
+      <w:r>
+        <w:drawing>
+          <wp:inline xmlns:a="http://schemas.openxmlformats.org/drawingml/2006/main" xmlns:pic="http://schemas.openxmlformats.org/drawingml/2006/picture">
+            <wp:extent cx="5400000" cy="2557358"/>
+            <wp:docPr id="1" name="Picture 1"/>
+            <wp:cNvGraphicFramePr>
+              <a:graphicFrameLocks noChangeAspect="1"/>
+            </wp:cNvGraphicFramePr>
+            <a:graphic>
+              <a:graphicData uri="http://schemas.openxmlformats.org/drawingml/2006/picture">
+                <pic:pic>
+                  <pic:nvPicPr>
+                    <pic:cNvPr id="0" name="diagram_idef0_as_is.png"/>
+                    <pic:cNvPicPr/>
+                  </pic:nvPicPr>
+                  <pic:blipFill>
+                    <a:blip r:embed="rId9"/>
+                    <a:stretch>
+                      <a:fillRect/>
+                    </a:stretch>
+                  </pic:blipFill>
+                  <pic:spPr>
+                    <a:xfrm>
+                      <a:off x="0" y="0"/>
+                      <a:ext cx="5400000" cy="2557358"/>
+                    </a:xfrm>
+                    <a:prstGeom prst="rect"/>
+                  </pic:spPr>
+                </pic:pic>
+              </a:graphicData>
+            </a:graphic>
+          </wp:inline>
+        </w:drawing>
+      </w:r>
+    </w:p>
+    <w:p>
+      <w:pPr>
+        <w:ind w:firstLine="0"/>
+        <w:jc w:val="center"/>
+      </w:pPr>
+      <w:r>
+        <w:rPr>
+          <w:i/>
+        </w:rPr>
+        <w:t>Рисунок 1.1 — IDEF0 AS-IS: ручная обработка входящих писем</w:t>
+      </w:r>
+    </w:p>
+    <w:p>
+      <w:r>
+        <w:t>На рисунке 1.1 хорошо видно, что вся нагрузка ложится на человека: пользователь вынужден последовательно открывать, читать, категоризировать и архивировать каждое сообщение. Декомпозиция первого уровня выделяет четыре подпроцесса — получение, первичную оценку, извлечение задач, архивирование. Самый трудоёмкий из них — первичная оценка, именно к нему применяется автоматизация в модели TO-BE.</w:t>
+      </w:r>
+    </w:p>
+    <w:p>
+      <w:pPr>
+        <w:ind w:firstLine="0"/>
+        <w:jc w:val="center"/>
+      </w:pPr>
+      <w:r>
+        <w:drawing>
+          <wp:inline xmlns:a="http://schemas.openxmlformats.org/drawingml/2006/main" xmlns:pic="http://schemas.openxmlformats.org/drawingml/2006/picture">
+            <wp:extent cx="5400000" cy="631566"/>
+            <wp:docPr id="2" name="Picture 2"/>
+            <wp:cNvGraphicFramePr>
+              <a:graphicFrameLocks noChangeAspect="1"/>
+            </wp:cNvGraphicFramePr>
+            <a:graphic>
+              <a:graphicData uri="http://schemas.openxmlformats.org/drawingml/2006/picture">
+                <pic:pic>
+                  <pic:nvPicPr>
+                    <pic:cNvPr id="0" name="diagram_idef0_to_be.png"/>
+                    <pic:cNvPicPr/>
+                  </pic:nvPicPr>
+                  <pic:blipFill>
+                    <a:blip r:embed="rId10"/>
+                    <a:stretch>
+                      <a:fillRect/>
+                    </a:stretch>
+                  </pic:blipFill>
+                  <pic:spPr>
+                    <a:xfrm>
+                      <a:off x="0" y="0"/>
+                      <a:ext cx="5400000" cy="631566"/>
+                    </a:xfrm>
+                    <a:prstGeom prst="rect"/>
+                  </pic:spPr>
+                </pic:pic>
+              </a:graphicData>
+            </a:graphic>
+          </wp:inline>
+        </w:drawing>
+      </w:r>
+    </w:p>
+    <w:p>
+      <w:pPr>
+        <w:ind w:firstLine="0"/>
+        <w:jc w:val="center"/>
+      </w:pPr>
+      <w:r>
+        <w:rPr>
+          <w:i/>
+        </w:rPr>
+        <w:t>Рисунок 1.2 — IDEF0 TO-BE: автоматизированный анализ</w:t>
+      </w:r>
+    </w:p>
+    <w:p>
+      <w:r>
+        <w:t>Рисунок 1.2 демонстрирует предлагаемую схему. Блок «A2. ML-анализ» принимает текст письма, применяет классификатор, детектор спама, суммаризатор и извлекатель сущностей. Результат передаётся блоку «A3. Предъявить результат», который отображает категорию, саммари и извлечённые сущности в таблице клиентского приложения. Ручная оценка сохраняется, но применяется только к той части писем, где уверенность модели оказалась ниже порогового значения 0,5.</w:t>
+      </w:r>
+    </w:p>
+    <w:p>
+      <w:pPr>
+        <w:ind w:firstLine="0"/>
+        <w:jc w:val="center"/>
+      </w:pPr>
+      <w:r>
+        <w:drawing>
+          <wp:inline xmlns:a="http://schemas.openxmlformats.org/drawingml/2006/main" xmlns:pic="http://schemas.openxmlformats.org/drawingml/2006/picture">
+            <wp:extent cx="6120000" cy="2040000"/>
+            <wp:docPr id="3" name="Picture 3"/>
+            <wp:cNvGraphicFramePr>
+              <a:graphicFrameLocks noChangeAspect="1"/>
+            </wp:cNvGraphicFramePr>
+            <a:graphic>
+              <a:graphicData uri="http://schemas.openxmlformats.org/drawingml/2006/picture">
+                <pic:pic>
+                  <pic:nvPicPr>
+                    <pic:cNvPr id="0" name="diagram_dfd.png"/>
+                    <pic:cNvPicPr/>
+                  </pic:nvPicPr>
+                  <pic:blipFill>
+                    <a:blip r:embed="rId11"/>
+                    <a:stretch>
+                      <a:fillRect/>
+                    </a:stretch>
+                  </pic:blipFill>
+                  <pic:spPr>
+                    <a:xfrm>
+                      <a:off x="0" y="0"/>
+                      <a:ext cx="6120000" cy="2040000"/>
+                    </a:xfrm>
+                    <a:prstGeom prst="rect"/>
+                  </pic:spPr>
+                </pic:pic>
+              </a:graphicData>
+            </a:graphic>
+          </wp:inline>
+        </w:drawing>
+      </w:r>
+    </w:p>
+    <w:p>
+      <w:pPr>
+        <w:ind w:firstLine="0"/>
+        <w:jc w:val="center"/>
+      </w:pPr>
+      <w:r>
+        <w:rPr>
+          <w:i/>
+        </w:rPr>
+        <w:t>Рисунок 1.3 — DFD первого уровня (нотация Гейна-Сарсона)</w:t>
+      </w:r>
+    </w:p>
+    <w:p>
+      <w:r>
+        <w:t>Диаграмма потоков данных (рисунок 1.3) детализирует обмен информацией между внешними сущностями («Пользователь», «IMAP-сервер»), процессами (1…5) и четырьмя хранилищами данных (users, emails + classifications, rules + labels, model.joblib). Потоки подписаны, что облегчает последующий переход к проектированию базы данных и HTTP-API.</w:t>
       </w:r>
     </w:p>
     <w:p>
@@ -764,57 +925,137 @@
     </w:p>
     <w:p>
       <w:r>
-        <w:t>Техническое задание (ТЗ) оформлено в соответствии с ГОСТ 34.602-2020 «Информационная технология. Комплекс стандартов на автоматизированные системы. Техническое задание на создание автоматизированной системы». Полный текст ТЗ вынесен в отдельный документ docs/tz.md в репозитории проекта; ниже приведены ключевые разделы.</w:t>
-      </w:r>
-    </w:p>
-    <w:p>
-      <w:r>
-        <w:t>1. Общие сведения. Сокращённое наименование — «Email AI Analyzer». Основание — задание на преддипломную практику. Сроки — 27.04.2026–24.05.2026. Организация-заказчик — ЧОУВО «МУ им. С.Ю. Витте», исполнитель — Нефедов А. Г.</w:t>
-      </w:r>
-    </w:p>
-    <w:p>
-      <w:r>
-        <w:t>2. Назначение и цели создания. Система предназначена для автоматизации обработки входящих электронных сообщений. Цель — снизить среднее время разбора одного письма не менее чем в два раза.</w:t>
-      </w:r>
-    </w:p>
-    <w:p>
-      <w:r>
-        <w:t>3. Характеристики объекта автоматизации. Объектом выступает процесс обработки входящих писем сотрудником, использующим стандартный IMAP-совместимый почтовый ящик (RFC 3501). Исходный уровень автоматизации — минимальный.</w:t>
-      </w:r>
-    </w:p>
-    <w:p>
-      <w:r>
-        <w:t>4. Требования к системе в целом. См. раздел 1.4 настоящего отчёта.</w:t>
-      </w:r>
-    </w:p>
-    <w:p>
-      <w:r>
-        <w:t>5. Требования к видам обеспечения. Техническое обеспечение — ПК пользователя с Windows 10/11 или Linux; канал связи — Интернет для связи с почтовым сервером. Информационное обеспечение — БД SQL. Лингвистическое обеспечение — русский и английский интерфейсы (на будущее). Программное обеспечение — см. технологический стек.</w:t>
-      </w:r>
-    </w:p>
-    <w:p>
-      <w:r>
-        <w:t>6. Состав и содержание работ включает девять этапов: анализ, проектирование, написание ТЗ, реализацию backend, реализацию ML-ядра, реализацию клиента, тестирование, сборку .exe, подготовку отчёта и защиту.</w:t>
-      </w:r>
-    </w:p>
-    <w:p>
-      <w:r>
-        <w:t>7. Порядок контроля и приёмки. Работа считается принятой при выполнении следующих критериев: не менее 50 коммитов в репозитории, не менее 2000 логических строк кода в src/, все автотесты завершаются успешно, .exe запускается на чистой Windows-машине.</w:t>
-      </w:r>
-    </w:p>
-    <w:p>
-      <w:r>
-        <w:t>8. Стадии и этапы разработки. См. раздел 5 отчёта.</w:t>
-      </w:r>
-    </w:p>
-    <w:p>
-      <w:r>
-        <w:t>9. Требования к документированию. README.md, docs/architecture.md, docs/tz.md, docs/test_plan.md, docs/features.md, CHANGELOG.md, CONTRIBUTING.md.</w:t>
-      </w:r>
-    </w:p>
-    <w:p>
-      <w:r>
-        <w:t>10. Источники разработки. Методичка МУИВ, ГОСТ 34.602-2020, ГОСТ Р 7.0.100-2018, документация Python/FastAPI/PyQt6.</w:t>
+        <w:t>Техническое задание (далее ТЗ) оформлено в соответствии с ГОСТ 34.602-2020 «Информационная технология. Комплекс стандартов на автоматизированные системы. Техническое задание на создание автоматизированной системы». Стандарт предписывает десять обязательных разделов. Ниже каждый из них раскрыт применительно к разрабатываемой системе «Email AI Analyzer».</w:t>
+      </w:r>
+    </w:p>
+    <w:p>
+      <w:pPr>
+        <w:pStyle w:val="Heading3"/>
+      </w:pPr>
+      <w:r>
+        <w:t>2.1.1 Общие сведения</w:t>
+      </w:r>
+    </w:p>
+    <w:p>
+      <w:r>
+        <w:t>Полное наименование — «AI-приложение для анализа почтовых сообщений». Сокращённое — «Email AI Analyzer». Шифр темы ПДП-ВКР-2026-НАГ. Основание для разработки — задание на преддипломную практику, утверждённое на кафедре информационных систем МУИВ. Плановые сроки выполнения — с 27.04.2026 по 24.05.2026. Организация-заказчик — ЧОУВО «МУ им. С.Ю. Витте». Исполнитель — Нефедов А. Г., направление 09.03.03 Прикладная информатика.</w:t>
+      </w:r>
+    </w:p>
+    <w:p>
+      <w:pPr>
+        <w:pStyle w:val="Heading3"/>
+      </w:pPr>
+      <w:r>
+        <w:t>2.1.2 Назначение и цели создания системы</w:t>
+      </w:r>
+    </w:p>
+    <w:p>
+      <w:r>
+        <w:t>Назначение — автоматизация обработки входящих электронных сообщений пользователя. Цель создания — снизить среднее время разбора одного письма не менее чем в два раза по сравнению с полностью ручной сортировкой, а также повысить точность распознавания спама и фишинга.</w:t>
+      </w:r>
+    </w:p>
+    <w:p>
+      <w:pPr>
+        <w:pStyle w:val="Heading3"/>
+      </w:pPr>
+      <w:r>
+        <w:t>2.1.3 Характеристики объекта автоматизации</w:t>
+      </w:r>
+    </w:p>
+    <w:p>
+      <w:r>
+        <w:t>Объект — процесс обработки входящих писем сотрудником, использующим стандартный IMAP-совместимый почтовый ящик (RFC 3501). Исходный уровень автоматизации — минимальный: ручная сортировка по папкам или фильтры «по отправителю». Среднесуточный объём переписки — 80–120 писем на пользователя.</w:t>
+      </w:r>
+    </w:p>
+    <w:p>
+      <w:pPr>
+        <w:pStyle w:val="Heading3"/>
+      </w:pPr>
+      <w:r>
+        <w:t>2.1.4 Требования к системе</w:t>
+      </w:r>
+    </w:p>
+    <w:p>
+      <w:r>
+        <w:t>Функциональные и нефункциональные требования подробно перечислены в разделе 1.4. В краткой форме — поддержка IMAP, ML-анализ, ≥ 10 окон GUI, ≥ 3 роли пользователей, панель администратора, личный кабинет, формирование отчётов в .docx и .xlsx. Архитектура — клиент-серверная.</w:t>
+      </w:r>
+    </w:p>
+    <w:p>
+      <w:pPr>
+        <w:pStyle w:val="Heading3"/>
+      </w:pPr>
+      <w:r>
+        <w:t>2.1.5 Требования к видам обеспечения</w:t>
+      </w:r>
+    </w:p>
+    <w:p>
+      <w:r>
+        <w:t>Техническое обеспечение — ПК пользователя с ОС Windows 10/11 (допустимы Linux и macOS через PyInstaller), оперативной памятью не менее 4 ГБ, дисковым пространством 200 МБ. Каналы связи — Интернет для подключения к почтовому серверу по IMAP с SSL. Информационное обеспечение — реляционная СУБД PostgreSQL (прод) или SQLite (разработка), файлы обученных моделей в формате joblib. Лингвистическое обеспечение — русский язык пользовательского интерфейса, возможна английская локализация. Программное обеспечение — Python 3.11+, FastAPI, SQLAlchemy 2.x, PyQt6, scikit-learn; подробно — в разделе 3.1.</w:t>
+      </w:r>
+    </w:p>
+    <w:p>
+      <w:pPr>
+        <w:pStyle w:val="Heading3"/>
+      </w:pPr>
+      <w:r>
+        <w:t>2.1.6 Состав и содержание работ</w:t>
+      </w:r>
+    </w:p>
+    <w:p>
+      <w:r>
+        <w:t>Работы разделены на девять этапов: (1) анализ предметной области и обзор аналогов; (2) проектирование архитектуры, ER-модели и UI; (3) написание ТЗ по ГОСТ; (4) реализация серверной части; (5) реализация ML-ядра; (6) реализация клиентского приложения; (7) тестирование; (8) сборка исполняемого файла; (9) подготовка отчёта и защита.</w:t>
+      </w:r>
+    </w:p>
+    <w:p>
+      <w:pPr>
+        <w:pStyle w:val="Heading3"/>
+      </w:pPr>
+      <w:r>
+        <w:t>2.1.7 Порядок контроля и приёмки</w:t>
+      </w:r>
+    </w:p>
+    <w:p>
+      <w:r>
+        <w:t>Работа считается принятой при одновременном выполнении следующих критериев: не менее 50 коммитов в Git-репозитории; не менее 2 000 логических строк кода в каталоге src/; все автоматические тесты pytest завершаются без ошибок; исполняемый файл EmailAIAnalyzer.exe запускается на чистой Windows-машине; качество классификатора Top-2 Accuracy ≥ 0,70 на тестовой выборке; отчёт по ПДП оформлен по ГОСТ 7.32-2017.</w:t>
+      </w:r>
+    </w:p>
+    <w:p>
+      <w:pPr>
+        <w:pStyle w:val="Heading3"/>
+      </w:pPr>
+      <w:r>
+        <w:t>2.1.8 Требования к составу и содержанию работ по подготовке объекта автоматизации к вводу в действие</w:t>
+      </w:r>
+    </w:p>
+    <w:p>
+      <w:r>
+        <w:t>Перед вводом в эксплуатацию администратор создаёт трёх seed-пользователей (admin / analyst / user) через скрипт scripts/init_db.py. Далее загружается обученная модель из data/model.joblib. Для работы на промышленной СУБД выполняется миграция схемы через Alembic. Предусмотрена инструкция по развёртыванию (docs/architecture.md) и docker-compose.yml для контейнерного запуска.</w:t>
+      </w:r>
+    </w:p>
+    <w:p>
+      <w:pPr>
+        <w:pStyle w:val="Heading3"/>
+      </w:pPr>
+      <w:r>
+        <w:t>2.1.9 Требования к документированию</w:t>
+      </w:r>
+    </w:p>
+    <w:p>
+      <w:r>
+        <w:t>Комплект сопроводительной документации: README.md (общее описание), docs/architecture.md (архитектура), docs/tz.md (полный текст ТЗ), docs/test_plan.md (тест-план), docs/features.md (матрица возможностей), docs/compliance.md (сверка с методичкой), CHANGELOG.md (журнал изменений), CONTRIBUTING.md (правила участия в разработке).</w:t>
+      </w:r>
+    </w:p>
+    <w:p>
+      <w:pPr>
+        <w:pStyle w:val="Heading3"/>
+      </w:pPr>
+      <w:r>
+        <w:t>2.1.10 Источники разработки</w:t>
+      </w:r>
+    </w:p>
+    <w:p>
+      <w:r>
+        <w:t>Использованы следующие нормативные и справочные источники: Программа ГИА-2025 и методические указания кафедры информационных систем МУИВ; ГОСТ 34.602-2020; ГОСТ 7.32-2017; ГОСТ Р 7.0.100-2018; RFC 3501 (IMAP4rev1); RFC 5322 (Internet Message Format); официальная документация Python, FastAPI, SQLAlchemy, PyQt6, scikit-learn. Полный перечень — в разделе «Список использованных источников».</w:t>
       </w:r>
     </w:p>
     <w:p>
@@ -832,12 +1073,64 @@
     </w:p>
     <w:p>
       <w:r>
-        <w:t>Серверная часть реализована на FastAPI — современном Python-фреймворке, который автоматически генерирует описание API в формате OpenAPI и поддерживает асинхронный ввод-вывод. Клиент представляет собой десктопное приложение на PyQt6, общающееся с сервером по HTTP и использующее JWT-токены для аутентификации.</w:t>
-      </w:r>
-    </w:p>
-    <w:p>
-      <w:r>
-        <w:t>Диаграмма компонентов первого уровня выделяет пять подсистем: клиент (PyQt6), API (FastAPI), слой бизнес-логики (сервисы анализа, пользователей, правил, статистики), слой данных (SQLAlchemy и СУБД), ML-ядро и модуль работы с IMAP. Распределение логических строк кода по слоям приведено на рисунке 2.1.</w:t>
+        <w:t>Диаграмма компонентов (рисунок 2.1) показывает физическое разделение системы на три слоя. Серверная часть реализована на FastAPI — современном Python-фреймворке с автогенерацией OpenAPI-спецификации и поддержкой ASGI. Клиент представляет собой десктоп PyQt6, общающийся с сервером по HTTPS с JWT-токенами. Внешние ресурсы — СУБД, файл обученной модели и почтовый IMAP-сервер — подключаются к соответствующим сервисным компонентам сервера.</w:t>
+      </w:r>
+    </w:p>
+    <w:p>
+      <w:pPr>
+        <w:ind w:firstLine="0"/>
+        <w:jc w:val="center"/>
+      </w:pPr>
+      <w:r>
+        <w:drawing>
+          <wp:inline xmlns:a="http://schemas.openxmlformats.org/drawingml/2006/main" xmlns:pic="http://schemas.openxmlformats.org/drawingml/2006/picture">
+            <wp:extent cx="5760000" cy="2113275"/>
+            <wp:docPr id="4" name="Picture 4"/>
+            <wp:cNvGraphicFramePr>
+              <a:graphicFrameLocks noChangeAspect="1"/>
+            </wp:cNvGraphicFramePr>
+            <a:graphic>
+              <a:graphicData uri="http://schemas.openxmlformats.org/drawingml/2006/picture">
+                <pic:pic>
+                  <pic:nvPicPr>
+                    <pic:cNvPr id="0" name="diagram_components.png"/>
+                    <pic:cNvPicPr/>
+                  </pic:nvPicPr>
+                  <pic:blipFill>
+                    <a:blip r:embed="rId12"/>
+                    <a:stretch>
+                      <a:fillRect/>
+                    </a:stretch>
+                  </pic:blipFill>
+                  <pic:spPr>
+                    <a:xfrm>
+                      <a:off x="0" y="0"/>
+                      <a:ext cx="5760000" cy="2113275"/>
+                    </a:xfrm>
+                    <a:prstGeom prst="rect"/>
+                  </pic:spPr>
+                </pic:pic>
+              </a:graphicData>
+            </a:graphic>
+          </wp:inline>
+        </w:drawing>
+      </w:r>
+    </w:p>
+    <w:p>
+      <w:pPr>
+        <w:ind w:firstLine="0"/>
+        <w:jc w:val="center"/>
+      </w:pPr>
+      <w:r>
+        <w:rPr>
+          <w:i/>
+        </w:rPr>
+        <w:t>Рисунок 2.1 — Диаграмма компонентов Email AI Analyzer</w:t>
+      </w:r>
+    </w:p>
+    <w:p>
+      <w:r>
+        <w:t>Распределение логических строк кода по слоям представлено на рисунке 2.2. Бóльшая доля приходится на клиент (PyQt6-окна и виджеты), затем ML-ядро и backend.</w:t>
       </w:r>
     </w:p>
     <w:p>
@@ -849,7 +1142,7 @@
         <w:drawing>
           <wp:inline xmlns:a="http://schemas.openxmlformats.org/drawingml/2006/main" xmlns:pic="http://schemas.openxmlformats.org/drawingml/2006/picture">
             <wp:extent cx="4680000" cy="4680000"/>
-            <wp:docPr id="1" name="Picture 1"/>
+            <wp:docPr id="5" name="Picture 5"/>
             <wp:cNvGraphicFramePr>
               <a:graphicFrameLocks noChangeAspect="1"/>
             </wp:cNvGraphicFramePr>
@@ -861,7 +1154,7 @@
                     <pic:cNvPicPr/>
                   </pic:nvPicPr>
                   <pic:blipFill>
-                    <a:blip r:embed="rId9"/>
+                    <a:blip r:embed="rId13"/>
                     <a:stretch>
                       <a:fillRect/>
                     </a:stretch>
@@ -889,17 +1182,178 @@
         <w:rPr>
           <w:i/>
         </w:rPr>
-        <w:t>Рисунок 2.1 — Распределение строк кода по слоям</w:t>
-      </w:r>
-    </w:p>
-    <w:p>
-      <w:r>
-        <w:t>Дерево функций приложения имеет два корневых узла: «Клиентские операции» и «Администрирование». Первый включает подфункции импорта писем, просмотра, анализа, экспорта отчётов и семантического поиска. Второй — управление пользователями, просмотр статистики системы, конфигурирование ML-движка.</w:t>
-      </w:r>
-    </w:p>
-    <w:p>
-      <w:r>
-        <w:t>Сценарий диалога «Импорт и анализ письма» начинается с ввода пользователем IMAP-учётных данных в диалоговом окне импорта. Клиент устанавливает соединение с почтовым сервером, загружает последние N сообщений, для каждого отправляет POST-запрос на эндпоинт /analyze/email. Сервер классифицирует письмо, определяет спам и фишинг, строит саммари и извлекает сущности. Результат отображается в таблице главного окна; двойной щелчок открывает детальное окно.</w:t>
+        <w:t>Рисунок 2.2 — Распределение строк кода по слоям</w:t>
+      </w:r>
+    </w:p>
+    <w:p>
+      <w:r>
+        <w:t>Дерево функций приложения (рисунок 2.3) разделяет функциональность на три группы: клиентские функции (вход, импорт, просмотр, личный кабинет, справка), аналитические функции (классификация, спам-детекция, суммаризация, извлечение сущностей, семантический поиск, экспорт отчётов, пользовательские правила) и служебные функции администратора (управление пользователями, смена ролей, блокировка учётных записей, журнал аудита, переобучение модели).</w:t>
+      </w:r>
+    </w:p>
+    <w:p>
+      <w:pPr>
+        <w:ind w:firstLine="0"/>
+        <w:jc w:val="center"/>
+      </w:pPr>
+      <w:r>
+        <w:drawing>
+          <wp:inline xmlns:a="http://schemas.openxmlformats.org/drawingml/2006/main" xmlns:pic="http://schemas.openxmlformats.org/drawingml/2006/picture">
+            <wp:extent cx="6120000" cy="513664"/>
+            <wp:docPr id="6" name="Picture 6"/>
+            <wp:cNvGraphicFramePr>
+              <a:graphicFrameLocks noChangeAspect="1"/>
+            </wp:cNvGraphicFramePr>
+            <a:graphic>
+              <a:graphicData uri="http://schemas.openxmlformats.org/drawingml/2006/picture">
+                <pic:pic>
+                  <pic:nvPicPr>
+                    <pic:cNvPr id="0" name="diagram_function_tree.png"/>
+                    <pic:cNvPicPr/>
+                  </pic:nvPicPr>
+                  <pic:blipFill>
+                    <a:blip r:embed="rId14"/>
+                    <a:stretch>
+                      <a:fillRect/>
+                    </a:stretch>
+                  </pic:blipFill>
+                  <pic:spPr>
+                    <a:xfrm>
+                      <a:off x="0" y="0"/>
+                      <a:ext cx="6120000" cy="513664"/>
+                    </a:xfrm>
+                    <a:prstGeom prst="rect"/>
+                  </pic:spPr>
+                </pic:pic>
+              </a:graphicData>
+            </a:graphic>
+          </wp:inline>
+        </w:drawing>
+      </w:r>
+    </w:p>
+    <w:p>
+      <w:pPr>
+        <w:ind w:firstLine="0"/>
+        <w:jc w:val="center"/>
+      </w:pPr>
+      <w:r>
+        <w:rPr>
+          <w:i/>
+        </w:rPr>
+        <w:t>Рисунок 2.3 — Дерево функций приложения</w:t>
+      </w:r>
+    </w:p>
+    <w:p>
+      <w:r>
+        <w:t>Сценарий диалога пользователя с приложением показан на рисунке 2.4. Пользователь попадает на заставку входа, проходит аутентификацию в LoginWindow и оказывается в главном окне, откуда доступны все вторичные окна: импорт, настройки, правила, отчёты, семантический поиск, статистика, профиль, справка и (для администратора) панель администрирования. Из любого вторичного окна есть возвратный переход в главное.</w:t>
+      </w:r>
+    </w:p>
+    <w:p>
+      <w:pPr>
+        <w:ind w:firstLine="0"/>
+        <w:jc w:val="center"/>
+      </w:pPr>
+      <w:r>
+        <w:drawing>
+          <wp:inline xmlns:a="http://schemas.openxmlformats.org/drawingml/2006/main" xmlns:pic="http://schemas.openxmlformats.org/drawingml/2006/picture">
+            <wp:extent cx="5760000" cy="1775971"/>
+            <wp:docPr id="7" name="Picture 7"/>
+            <wp:cNvGraphicFramePr>
+              <a:graphicFrameLocks noChangeAspect="1"/>
+            </wp:cNvGraphicFramePr>
+            <a:graphic>
+              <a:graphicData uri="http://schemas.openxmlformats.org/drawingml/2006/picture">
+                <pic:pic>
+                  <pic:nvPicPr>
+                    <pic:cNvPr id="0" name="diagram_dialog_scenario.png"/>
+                    <pic:cNvPicPr/>
+                  </pic:nvPicPr>
+                  <pic:blipFill>
+                    <a:blip r:embed="rId15"/>
+                    <a:stretch>
+                      <a:fillRect/>
+                    </a:stretch>
+                  </pic:blipFill>
+                  <pic:spPr>
+                    <a:xfrm>
+                      <a:off x="0" y="0"/>
+                      <a:ext cx="5760000" cy="1775971"/>
+                    </a:xfrm>
+                    <a:prstGeom prst="rect"/>
+                  </pic:spPr>
+                </pic:pic>
+              </a:graphicData>
+            </a:graphic>
+          </wp:inline>
+        </w:drawing>
+      </w:r>
+    </w:p>
+    <w:p>
+      <w:pPr>
+        <w:ind w:firstLine="0"/>
+        <w:jc w:val="center"/>
+      </w:pPr>
+      <w:r>
+        <w:rPr>
+          <w:i/>
+        </w:rPr>
+        <w:t>Рисунок 2.4 — Сценарий диалога пользователя</w:t>
+      </w:r>
+    </w:p>
+    <w:p>
+      <w:r>
+        <w:t>Взаимодействие акторов с системой формализовано в виде UML Use Case (рисунок 2.5). Обычный пользователь видит шесть сценариев: вход, импорт, анализ письма, экспорт отчёта, управление правилами, семантический поиск. Аналитик дополнительно получает доступ к статистике. Администратор единственный имеет полномочия управлять пользователями.</w:t>
+      </w:r>
+    </w:p>
+    <w:p>
+      <w:pPr>
+        <w:ind w:firstLine="0"/>
+        <w:jc w:val="center"/>
+      </w:pPr>
+      <w:r>
+        <w:drawing>
+          <wp:inline xmlns:a="http://schemas.openxmlformats.org/drawingml/2006/main" xmlns:pic="http://schemas.openxmlformats.org/drawingml/2006/picture">
+            <wp:extent cx="5760000" cy="10198033"/>
+            <wp:docPr id="8" name="Picture 8"/>
+            <wp:cNvGraphicFramePr>
+              <a:graphicFrameLocks noChangeAspect="1"/>
+            </wp:cNvGraphicFramePr>
+            <a:graphic>
+              <a:graphicData uri="http://schemas.openxmlformats.org/drawingml/2006/picture">
+                <pic:pic>
+                  <pic:nvPicPr>
+                    <pic:cNvPr id="0" name="diagram_use_case.png"/>
+                    <pic:cNvPicPr/>
+                  </pic:nvPicPr>
+                  <pic:blipFill>
+                    <a:blip r:embed="rId16"/>
+                    <a:stretch>
+                      <a:fillRect/>
+                    </a:stretch>
+                  </pic:blipFill>
+                  <pic:spPr>
+                    <a:xfrm>
+                      <a:off x="0" y="0"/>
+                      <a:ext cx="5760000" cy="10198033"/>
+                    </a:xfrm>
+                    <a:prstGeom prst="rect"/>
+                  </pic:spPr>
+                </pic:pic>
+              </a:graphicData>
+            </a:graphic>
+          </wp:inline>
+        </w:drawing>
+      </w:r>
+    </w:p>
+    <w:p>
+      <w:pPr>
+        <w:ind w:firstLine="0"/>
+        <w:jc w:val="center"/>
+      </w:pPr>
+      <w:r>
+        <w:rPr>
+          <w:i/>
+        </w:rPr>
+        <w:t>Рисунок 2.5 — UML Use Case: роли и сценарии</w:t>
       </w:r>
     </w:p>
     <w:p>
@@ -971,6 +1425,177 @@
     <w:p>
       <w:r>
         <w:t>Связи: один User имеет много EmailMessage (1:N), один-к-одному между EmailMessage и Classification, User имеет много Rule, User имеет много AnalysisReport, EmailMessage имеет много Attachment. Ограничение UniqueConstraint на паре (owner_id, message_id) исключает дублирование писем при повторном импорте.</w:t>
+      </w:r>
+    </w:p>
+    <w:p>
+      <w:r>
+        <w:t>Базовая ER-диаграмма в нотации Чена (рисунок 2.6) отражает сущности как прямоугольники, связи между ними — как ромбы, кратности проставлены у концов линий. Такой вид полезен для высокоуровневого понимания модели.</w:t>
+      </w:r>
+    </w:p>
+    <w:p>
+      <w:pPr>
+        <w:ind w:firstLine="0"/>
+        <w:jc w:val="center"/>
+      </w:pPr>
+      <w:r>
+        <w:drawing>
+          <wp:inline xmlns:a="http://schemas.openxmlformats.org/drawingml/2006/main" xmlns:pic="http://schemas.openxmlformats.org/drawingml/2006/picture">
+            <wp:extent cx="6120000" cy="5607935"/>
+            <wp:docPr id="9" name="Picture 9"/>
+            <wp:cNvGraphicFramePr>
+              <a:graphicFrameLocks noChangeAspect="1"/>
+            </wp:cNvGraphicFramePr>
+            <a:graphic>
+              <a:graphicData uri="http://schemas.openxmlformats.org/drawingml/2006/picture">
+                <pic:pic>
+                  <pic:nvPicPr>
+                    <pic:cNvPr id="0" name="diagram_er_basic.png"/>
+                    <pic:cNvPicPr/>
+                  </pic:nvPicPr>
+                  <pic:blipFill>
+                    <a:blip r:embed="rId17"/>
+                    <a:stretch>
+                      <a:fillRect/>
+                    </a:stretch>
+                  </pic:blipFill>
+                  <pic:spPr>
+                    <a:xfrm>
+                      <a:off x="0" y="0"/>
+                      <a:ext cx="6120000" cy="5607935"/>
+                    </a:xfrm>
+                    <a:prstGeom prst="rect"/>
+                  </pic:spPr>
+                </pic:pic>
+              </a:graphicData>
+            </a:graphic>
+          </wp:inline>
+        </w:drawing>
+      </w:r>
+    </w:p>
+    <w:p>
+      <w:pPr>
+        <w:ind w:firstLine="0"/>
+        <w:jc w:val="center"/>
+      </w:pPr>
+      <w:r>
+        <w:rPr>
+          <w:i/>
+        </w:rPr>
+        <w:t>Рисунок 2.6 — ER-диаграмма (базовая, нотация Чена)</w:t>
+      </w:r>
+    </w:p>
+    <w:p>
+      <w:r>
+        <w:t>Уточнённая ER-диаграмма (рисунок 2.7) добавляет к сущностям их атрибуты, представленные в виде эллипсов. Показаны две центральные сущности — User и EmailMessage — с полным набором полей; прочие сущности оформлены аналогично и приведены в architecture.md.</w:t>
+      </w:r>
+    </w:p>
+    <w:p>
+      <w:pPr>
+        <w:ind w:firstLine="0"/>
+        <w:jc w:val="center"/>
+      </w:pPr>
+      <w:r>
+        <w:drawing>
+          <wp:inline xmlns:a="http://schemas.openxmlformats.org/drawingml/2006/main" xmlns:pic="http://schemas.openxmlformats.org/drawingml/2006/picture">
+            <wp:extent cx="6120000" cy="1791796"/>
+            <wp:docPr id="10" name="Picture 10"/>
+            <wp:cNvGraphicFramePr>
+              <a:graphicFrameLocks noChangeAspect="1"/>
+            </wp:cNvGraphicFramePr>
+            <a:graphic>
+              <a:graphicData uri="http://schemas.openxmlformats.org/drawingml/2006/picture">
+                <pic:pic>
+                  <pic:nvPicPr>
+                    <pic:cNvPr id="0" name="diagram_er_refined.png"/>
+                    <pic:cNvPicPr/>
+                  </pic:nvPicPr>
+                  <pic:blipFill>
+                    <a:blip r:embed="rId18"/>
+                    <a:stretch>
+                      <a:fillRect/>
+                    </a:stretch>
+                  </pic:blipFill>
+                  <pic:spPr>
+                    <a:xfrm>
+                      <a:off x="0" y="0"/>
+                      <a:ext cx="6120000" cy="1791796"/>
+                    </a:xfrm>
+                    <a:prstGeom prst="rect"/>
+                  </pic:spPr>
+                </pic:pic>
+              </a:graphicData>
+            </a:graphic>
+          </wp:inline>
+        </w:drawing>
+      </w:r>
+    </w:p>
+    <w:p>
+      <w:pPr>
+        <w:ind w:firstLine="0"/>
+        <w:jc w:val="center"/>
+      </w:pPr>
+      <w:r>
+        <w:rPr>
+          <w:i/>
+        </w:rPr>
+        <w:t>Рисунок 2.7 — Уточнённая ER-диаграмма (с атрибутами)</w:t>
+      </w:r>
+    </w:p>
+    <w:p>
+      <w:r>
+        <w:t>Физическая схема базы данных (рисунок 2.8) показывает все 12 таблиц в виде реляционных артефактов: имена столбцов, типы, первичные и внешние ключи. Связь «один-ко-многим» обозначена стрелками с наконечником «crow-foot». Схема пригодна для прямой передачи в Alembic-миграцию.</w:t>
+      </w:r>
+    </w:p>
+    <w:p>
+      <w:pPr>
+        <w:ind w:firstLine="0"/>
+        <w:jc w:val="center"/>
+      </w:pPr>
+      <w:r>
+        <w:drawing>
+          <wp:inline xmlns:a="http://schemas.openxmlformats.org/drawingml/2006/main" xmlns:pic="http://schemas.openxmlformats.org/drawingml/2006/picture">
+            <wp:extent cx="5040000" cy="13829333"/>
+            <wp:docPr id="11" name="Picture 11"/>
+            <wp:cNvGraphicFramePr>
+              <a:graphicFrameLocks noChangeAspect="1"/>
+            </wp:cNvGraphicFramePr>
+            <a:graphic>
+              <a:graphicData uri="http://schemas.openxmlformats.org/drawingml/2006/picture">
+                <pic:pic>
+                  <pic:nvPicPr>
+                    <pic:cNvPr id="0" name="diagram_schema_db.png"/>
+                    <pic:cNvPicPr/>
+                  </pic:nvPicPr>
+                  <pic:blipFill>
+                    <a:blip r:embed="rId19"/>
+                    <a:stretch>
+                      <a:fillRect/>
+                    </a:stretch>
+                  </pic:blipFill>
+                  <pic:spPr>
+                    <a:xfrm>
+                      <a:off x="0" y="0"/>
+                      <a:ext cx="5040000" cy="13829333"/>
+                    </a:xfrm>
+                    <a:prstGeom prst="rect"/>
+                  </pic:spPr>
+                </pic:pic>
+              </a:graphicData>
+            </a:graphic>
+          </wp:inline>
+        </w:drawing>
+      </w:r>
+    </w:p>
+    <w:p>
+      <w:pPr>
+        <w:ind w:firstLine="0"/>
+        <w:jc w:val="center"/>
+      </w:pPr>
+      <w:r>
+        <w:rPr>
+          <w:i/>
+        </w:rPr>
+        <w:t>Рисунок 2.8 — Схема БД (физическое представление)</w:t>
       </w:r>
     </w:p>
     <w:p>
@@ -1570,6 +2195,63 @@
     </w:p>
     <w:p>
       <w:r>
+        <w:t>Поток действий пользователя при импорте и анализе пакета писем формализован на рисунке 3.1 (UML Activity). Пользователь вводит параметры IMAP, клиент подключается к серверу, получает список UID, для каждого запрашивает RFC822-представление, отправляет POST /analyze/email и получает JSON. Далее выполняется проверка «спам или фишинг»: письма такого типа подсвечиваются красным и добавляются в уведомления, остальные обновляют счётчики категорий в главном окне.</w:t>
+      </w:r>
+    </w:p>
+    <w:p>
+      <w:pPr>
+        <w:ind w:firstLine="0"/>
+        <w:jc w:val="center"/>
+      </w:pPr>
+      <w:r>
+        <w:drawing>
+          <wp:inline xmlns:a="http://schemas.openxmlformats.org/drawingml/2006/main" xmlns:pic="http://schemas.openxmlformats.org/drawingml/2006/picture">
+            <wp:extent cx="4680000" cy="12160328"/>
+            <wp:docPr id="12" name="Picture 12"/>
+            <wp:cNvGraphicFramePr>
+              <a:graphicFrameLocks noChangeAspect="1"/>
+            </wp:cNvGraphicFramePr>
+            <a:graphic>
+              <a:graphicData uri="http://schemas.openxmlformats.org/drawingml/2006/picture">
+                <pic:pic>
+                  <pic:nvPicPr>
+                    <pic:cNvPr id="0" name="diagram_activity.png"/>
+                    <pic:cNvPicPr/>
+                  </pic:nvPicPr>
+                  <pic:blipFill>
+                    <a:blip r:embed="rId20"/>
+                    <a:stretch>
+                      <a:fillRect/>
+                    </a:stretch>
+                  </pic:blipFill>
+                  <pic:spPr>
+                    <a:xfrm>
+                      <a:off x="0" y="0"/>
+                      <a:ext cx="4680000" cy="12160328"/>
+                    </a:xfrm>
+                    <a:prstGeom prst="rect"/>
+                  </pic:spPr>
+                </pic:pic>
+              </a:graphicData>
+            </a:graphic>
+          </wp:inline>
+        </w:drawing>
+      </w:r>
+    </w:p>
+    <w:p>
+      <w:pPr>
+        <w:ind w:firstLine="0"/>
+        <w:jc w:val="center"/>
+      </w:pPr>
+      <w:r>
+        <w:rPr>
+          <w:i/>
+        </w:rPr>
+        <w:t>Рисунок 3.1 — UML Activity: импорт и анализ пакета писем</w:t>
+      </w:r>
+    </w:p>
+    <w:p>
+      <w:r>
         <w:t>Клиент реализован как типичное PyQt6-приложение с главным окном на базе QMainWindow. Общение с сервером инкапсулировано в классе ApiClient (листинг Б.33), который использует библиотеку requests и автоматически добавляет заголовок Authorization: Bearer к каждому запросу. Разделяемое состояние (токен, профиль пользователя) хранится в AppState, передаваемом в конструкторы окон.</w:t>
       </w:r>
     </w:p>
@@ -1595,6 +2277,63 @@
       </w:pPr>
       <w:r>
         <w:t>4 ТЕСТИРОВАНИЕ</w:t>
+      </w:r>
+    </w:p>
+    <w:p>
+      <w:r>
+        <w:t>Классификация видов тестирования, использованных в работе, представлена на рисунке 4.0. В проекте применены все пять уровней группировки: по доступу к коду (black / grey / white box), по объекту (функциональное, производительное, безопасности), по уровню (модульное, интеграционное, системное), по автоматизации (ручное и автоматизированное) и по времени (smoke, регрессионное, приёмочное).</w:t>
+      </w:r>
+    </w:p>
+    <w:p>
+      <w:pPr>
+        <w:ind w:firstLine="0"/>
+        <w:jc w:val="center"/>
+      </w:pPr>
+      <w:r>
+        <w:drawing>
+          <wp:inline xmlns:a="http://schemas.openxmlformats.org/drawingml/2006/main" xmlns:pic="http://schemas.openxmlformats.org/drawingml/2006/picture">
+            <wp:extent cx="6120000" cy="706736"/>
+            <wp:docPr id="13" name="Picture 13"/>
+            <wp:cNvGraphicFramePr>
+              <a:graphicFrameLocks noChangeAspect="1"/>
+            </wp:cNvGraphicFramePr>
+            <a:graphic>
+              <a:graphicData uri="http://schemas.openxmlformats.org/drawingml/2006/picture">
+                <pic:pic>
+                  <pic:nvPicPr>
+                    <pic:cNvPr id="0" name="diagram_testing_types.png"/>
+                    <pic:cNvPicPr/>
+                  </pic:nvPicPr>
+                  <pic:blipFill>
+                    <a:blip r:embed="rId21"/>
+                    <a:stretch>
+                      <a:fillRect/>
+                    </a:stretch>
+                  </pic:blipFill>
+                  <pic:spPr>
+                    <a:xfrm>
+                      <a:off x="0" y="0"/>
+                      <a:ext cx="6120000" cy="706736"/>
+                    </a:xfrm>
+                    <a:prstGeom prst="rect"/>
+                  </pic:spPr>
+                </pic:pic>
+              </a:graphicData>
+            </a:graphic>
+          </wp:inline>
+        </w:drawing>
+      </w:r>
+    </w:p>
+    <w:p>
+      <w:pPr>
+        <w:ind w:firstLine="0"/>
+        <w:jc w:val="center"/>
+      </w:pPr>
+      <w:r>
+        <w:rPr>
+          <w:i/>
+        </w:rPr>
+        <w:t>Рисунок 4.0 — Классификация видов тестирования</w:t>
       </w:r>
     </w:p>
     <w:p>
@@ -1639,7 +2378,7 @@
         <w:drawing>
           <wp:inline xmlns:a="http://schemas.openxmlformats.org/drawingml/2006/main" xmlns:pic="http://schemas.openxmlformats.org/drawingml/2006/picture">
             <wp:extent cx="5760000" cy="3200000"/>
-            <wp:docPr id="2" name="Picture 2"/>
+            <wp:docPr id="14" name="Picture 14"/>
             <wp:cNvGraphicFramePr>
               <a:graphicFrameLocks noChangeAspect="1"/>
             </wp:cNvGraphicFramePr>
@@ -1651,7 +2390,7 @@
                     <pic:cNvPicPr/>
                   </pic:nvPicPr>
                   <pic:blipFill>
-                    <a:blip r:embed="rId10"/>
+                    <a:blip r:embed="rId22"/>
                     <a:stretch>
                       <a:fillRect/>
                     </a:stretch>
@@ -1762,7 +2501,7 @@
         <w:drawing>
           <wp:inline xmlns:a="http://schemas.openxmlformats.org/drawingml/2006/main" xmlns:pic="http://schemas.openxmlformats.org/drawingml/2006/picture">
             <wp:extent cx="5400000" cy="3375000"/>
-            <wp:docPr id="3" name="Picture 3"/>
+            <wp:docPr id="15" name="Picture 15"/>
             <wp:cNvGraphicFramePr>
               <a:graphicFrameLocks noChangeAspect="1"/>
             </wp:cNvGraphicFramePr>
@@ -1774,7 +2513,7 @@
                     <pic:cNvPicPr/>
                   </pic:nvPicPr>
                   <pic:blipFill>
-                    <a:blip r:embed="rId11"/>
+                    <a:blip r:embed="rId23"/>
                     <a:stretch>
                       <a:fillRect/>
                     </a:stretch>
@@ -1853,6 +2592,63 @@
       </w:r>
     </w:p>
     <w:p>
+      <w:r>
+        <w:t>На рисунке 5.0 показана классификация стратегий развёртывания, известных из практики DevOps. В проекте применены «непрерывная интеграция» (через GitHub Actions) и «непрерывная доставка» (через PyInstaller-сборку). На боевое развёртывание можно перейти на «последовательное» или «сине-зелёное» — архитектура это допускает без изменения кода.</w:t>
+      </w:r>
+    </w:p>
+    <w:p>
+      <w:pPr>
+        <w:ind w:firstLine="0"/>
+        <w:jc w:val="center"/>
+      </w:pPr>
+      <w:r>
+        <w:drawing>
+          <wp:inline xmlns:a="http://schemas.openxmlformats.org/drawingml/2006/main" xmlns:pic="http://schemas.openxmlformats.org/drawingml/2006/picture">
+            <wp:extent cx="5760000" cy="804731"/>
+            <wp:docPr id="16" name="Picture 16"/>
+            <wp:cNvGraphicFramePr>
+              <a:graphicFrameLocks noChangeAspect="1"/>
+            </wp:cNvGraphicFramePr>
+            <a:graphic>
+              <a:graphicData uri="http://schemas.openxmlformats.org/drawingml/2006/picture">
+                <pic:pic>
+                  <pic:nvPicPr>
+                    <pic:cNvPr id="0" name="diagram_deployment_types.png"/>
+                    <pic:cNvPicPr/>
+                  </pic:nvPicPr>
+                  <pic:blipFill>
+                    <a:blip r:embed="rId24"/>
+                    <a:stretch>
+                      <a:fillRect/>
+                    </a:stretch>
+                  </pic:blipFill>
+                  <pic:spPr>
+                    <a:xfrm>
+                      <a:off x="0" y="0"/>
+                      <a:ext cx="5760000" cy="804731"/>
+                    </a:xfrm>
+                    <a:prstGeom prst="rect"/>
+                  </pic:spPr>
+                </pic:pic>
+              </a:graphicData>
+            </a:graphic>
+          </wp:inline>
+        </w:drawing>
+      </w:r>
+    </w:p>
+    <w:p>
+      <w:pPr>
+        <w:ind w:firstLine="0"/>
+        <w:jc w:val="center"/>
+      </w:pPr>
+      <w:r>
+        <w:rPr>
+          <w:i/>
+        </w:rPr>
+        <w:t>Рисунок 5.0 — Стратегии развёртывания</w:t>
+      </w:r>
+    </w:p>
+    <w:p>
       <w:pPr>
         <w:pStyle w:val="Heading2"/>
       </w:pPr>
@@ -1890,7 +2686,59 @@
     </w:p>
     <w:p>
       <w:r>
-        <w:t>Диаграмма последовательности (текстовое описание). Пользователь — клиент — сервер — IMAP-сервер: клиент запрашивает список UID, получает их, поочерёдно запрашивает каждое письмо (FETCH RFC822), формирует POST-запрос на /analyze/email, сервер возвращает JSON с результатом анализа, клиент обновляет таблицу.</w:t>
+        <w:t>Диаграмма последовательности «клиент ↔ сервер ↔ IMAP ↔ ML-ядро» приведена на рисунке 5.1. Сценарий такой: пользователь нажимает «Импорт», клиент запрашивает JWT у сервера, затем устанавливает IMAP-соединение, получает письма и по каждому отправляет POST /analyze/email. Сервер делегирует анализ ML-ядру и возвращает клиенту JSON с категорией, флагами спама/фишинга, саммари и сущностями.</w:t>
+      </w:r>
+    </w:p>
+    <w:p>
+      <w:pPr>
+        <w:ind w:firstLine="0"/>
+        <w:jc w:val="center"/>
+      </w:pPr>
+      <w:r>
+        <w:drawing>
+          <wp:inline xmlns:a="http://schemas.openxmlformats.org/drawingml/2006/main" xmlns:pic="http://schemas.openxmlformats.org/drawingml/2006/picture">
+            <wp:extent cx="6120000" cy="1991630"/>
+            <wp:docPr id="17" name="Picture 17"/>
+            <wp:cNvGraphicFramePr>
+              <a:graphicFrameLocks noChangeAspect="1"/>
+            </wp:cNvGraphicFramePr>
+            <a:graphic>
+              <a:graphicData uri="http://schemas.openxmlformats.org/drawingml/2006/picture">
+                <pic:pic>
+                  <pic:nvPicPr>
+                    <pic:cNvPr id="0" name="diagram_sequence.png"/>
+                    <pic:cNvPicPr/>
+                  </pic:nvPicPr>
+                  <pic:blipFill>
+                    <a:blip r:embed="rId25"/>
+                    <a:stretch>
+                      <a:fillRect/>
+                    </a:stretch>
+                  </pic:blipFill>
+                  <pic:spPr>
+                    <a:xfrm>
+                      <a:off x="0" y="0"/>
+                      <a:ext cx="6120000" cy="1991630"/>
+                    </a:xfrm>
+                    <a:prstGeom prst="rect"/>
+                  </pic:spPr>
+                </pic:pic>
+              </a:graphicData>
+            </a:graphic>
+          </wp:inline>
+        </w:drawing>
+      </w:r>
+    </w:p>
+    <w:p>
+      <w:pPr>
+        <w:ind w:firstLine="0"/>
+        <w:jc w:val="center"/>
+      </w:pPr>
+      <w:r>
+        <w:rPr>
+          <w:i/>
+        </w:rPr>
+        <w:t>Рисунок 5.1 — UML Sequence: цикл «импорт и анализ»</w:t>
       </w:r>
     </w:p>
     <w:p>
@@ -2161,7 +3009,7 @@
         <w:drawing>
           <wp:inline xmlns:a="http://schemas.openxmlformats.org/drawingml/2006/main" xmlns:pic="http://schemas.openxmlformats.org/drawingml/2006/picture">
             <wp:extent cx="5040000" cy="2800000"/>
-            <wp:docPr id="4" name="Picture 4"/>
+            <wp:docPr id="18" name="Picture 18"/>
             <wp:cNvGraphicFramePr>
               <a:graphicFrameLocks noChangeAspect="1"/>
             </wp:cNvGraphicFramePr>
@@ -2173,7 +3021,7 @@
                     <pic:cNvPicPr/>
                   </pic:nvPicPr>
                   <pic:blipFill>
-                    <a:blip r:embed="rId12"/>
+                    <a:blip r:embed="rId26"/>
                     <a:stretch>
                       <a:fillRect/>
                     </a:stretch>
@@ -2214,7 +3062,7 @@
         <w:drawing>
           <wp:inline xmlns:a="http://schemas.openxmlformats.org/drawingml/2006/main" xmlns:pic="http://schemas.openxmlformats.org/drawingml/2006/picture">
             <wp:extent cx="5040000" cy="3150000"/>
-            <wp:docPr id="5" name="Picture 5"/>
+            <wp:docPr id="19" name="Picture 19"/>
             <wp:cNvGraphicFramePr>
               <a:graphicFrameLocks noChangeAspect="1"/>
             </wp:cNvGraphicFramePr>
@@ -2226,7 +3074,7 @@
                     <pic:cNvPicPr/>
                   </pic:nvPicPr>
                   <pic:blipFill>
-                    <a:blip r:embed="rId13"/>
+                    <a:blip r:embed="rId27"/>
                     <a:stretch>
                       <a:fillRect/>
                     </a:stretch>
@@ -2267,7 +3115,7 @@
         <w:drawing>
           <wp:inline xmlns:a="http://schemas.openxmlformats.org/drawingml/2006/main" xmlns:pic="http://schemas.openxmlformats.org/drawingml/2006/picture">
             <wp:extent cx="5040000" cy="3854118"/>
-            <wp:docPr id="6" name="Picture 6"/>
+            <wp:docPr id="20" name="Picture 20"/>
             <wp:cNvGraphicFramePr>
               <a:graphicFrameLocks noChangeAspect="1"/>
             </wp:cNvGraphicFramePr>
@@ -2279,7 +3127,7 @@
                     <pic:cNvPicPr/>
                   </pic:nvPicPr>
                   <pic:blipFill>
-                    <a:blip r:embed="rId14"/>
+                    <a:blip r:embed="rId28"/>
                     <a:stretch>
                       <a:fillRect/>
                     </a:stretch>
@@ -2320,7 +3168,7 @@
         <w:drawing>
           <wp:inline xmlns:a="http://schemas.openxmlformats.org/drawingml/2006/main" xmlns:pic="http://schemas.openxmlformats.org/drawingml/2006/picture">
             <wp:extent cx="5040000" cy="3959999"/>
-            <wp:docPr id="7" name="Picture 7"/>
+            <wp:docPr id="21" name="Picture 21"/>
             <wp:cNvGraphicFramePr>
               <a:graphicFrameLocks noChangeAspect="1"/>
             </wp:cNvGraphicFramePr>
@@ -2332,7 +3180,7 @@
                     <pic:cNvPicPr/>
                   </pic:nvPicPr>
                   <pic:blipFill>
-                    <a:blip r:embed="rId15"/>
+                    <a:blip r:embed="rId29"/>
                     <a:stretch>
                       <a:fillRect/>
                     </a:stretch>
@@ -2373,7 +3221,7 @@
         <w:drawing>
           <wp:inline xmlns:a="http://schemas.openxmlformats.org/drawingml/2006/main" xmlns:pic="http://schemas.openxmlformats.org/drawingml/2006/picture">
             <wp:extent cx="5040000" cy="3360000"/>
-            <wp:docPr id="8" name="Picture 8"/>
+            <wp:docPr id="22" name="Picture 22"/>
             <wp:cNvGraphicFramePr>
               <a:graphicFrameLocks noChangeAspect="1"/>
             </wp:cNvGraphicFramePr>
@@ -2385,7 +3233,7 @@
                     <pic:cNvPicPr/>
                   </pic:nvPicPr>
                   <pic:blipFill>
-                    <a:blip r:embed="rId16"/>
+                    <a:blip r:embed="rId30"/>
                     <a:stretch>
                       <a:fillRect/>
                     </a:stretch>
@@ -2426,7 +3274,7 @@
         <w:drawing>
           <wp:inline xmlns:a="http://schemas.openxmlformats.org/drawingml/2006/main" xmlns:pic="http://schemas.openxmlformats.org/drawingml/2006/picture">
             <wp:extent cx="5040000" cy="3360000"/>
-            <wp:docPr id="9" name="Picture 9"/>
+            <wp:docPr id="23" name="Picture 23"/>
             <wp:cNvGraphicFramePr>
               <a:graphicFrameLocks noChangeAspect="1"/>
             </wp:cNvGraphicFramePr>
@@ -2438,7 +3286,7 @@
                     <pic:cNvPicPr/>
                   </pic:nvPicPr>
                   <pic:blipFill>
-                    <a:blip r:embed="rId17"/>
+                    <a:blip r:embed="rId31"/>
                     <a:stretch>
                       <a:fillRect/>
                     </a:stretch>
@@ -2479,7 +3327,7 @@
         <w:drawing>
           <wp:inline xmlns:a="http://schemas.openxmlformats.org/drawingml/2006/main" xmlns:pic="http://schemas.openxmlformats.org/drawingml/2006/picture">
             <wp:extent cx="5040000" cy="3464999"/>
-            <wp:docPr id="10" name="Picture 10"/>
+            <wp:docPr id="24" name="Picture 24"/>
             <wp:cNvGraphicFramePr>
               <a:graphicFrameLocks noChangeAspect="1"/>
             </wp:cNvGraphicFramePr>
@@ -2491,7 +3339,7 @@
                     <pic:cNvPicPr/>
                   </pic:nvPicPr>
                   <pic:blipFill>
-                    <a:blip r:embed="rId18"/>
+                    <a:blip r:embed="rId32"/>
                     <a:stretch>
                       <a:fillRect/>
                     </a:stretch>
@@ -2532,7 +3380,7 @@
         <w:drawing>
           <wp:inline xmlns:a="http://schemas.openxmlformats.org/drawingml/2006/main" xmlns:pic="http://schemas.openxmlformats.org/drawingml/2006/picture">
             <wp:extent cx="5040000" cy="2730000"/>
-            <wp:docPr id="11" name="Picture 11"/>
+            <wp:docPr id="25" name="Picture 25"/>
             <wp:cNvGraphicFramePr>
               <a:graphicFrameLocks noChangeAspect="1"/>
             </wp:cNvGraphicFramePr>
@@ -2544,7 +3392,7 @@
                     <pic:cNvPicPr/>
                   </pic:nvPicPr>
                   <pic:blipFill>
-                    <a:blip r:embed="rId19"/>
+                    <a:blip r:embed="rId33"/>
                     <a:stretch>
                       <a:fillRect/>
                     </a:stretch>
@@ -2585,7 +3433,7 @@
         <w:drawing>
           <wp:inline xmlns:a="http://schemas.openxmlformats.org/drawingml/2006/main" xmlns:pic="http://schemas.openxmlformats.org/drawingml/2006/picture">
             <wp:extent cx="5040000" cy="4095000"/>
-            <wp:docPr id="12" name="Picture 12"/>
+            <wp:docPr id="26" name="Picture 26"/>
             <wp:cNvGraphicFramePr>
               <a:graphicFrameLocks noChangeAspect="1"/>
             </wp:cNvGraphicFramePr>
@@ -2597,7 +3445,7 @@
                     <pic:cNvPicPr/>
                   </pic:nvPicPr>
                   <pic:blipFill>
-                    <a:blip r:embed="rId20"/>
+                    <a:blip r:embed="rId34"/>
                     <a:stretch>
                       <a:fillRect/>
                     </a:stretch>
@@ -2638,7 +3486,7 @@
         <w:drawing>
           <wp:inline xmlns:a="http://schemas.openxmlformats.org/drawingml/2006/main" xmlns:pic="http://schemas.openxmlformats.org/drawingml/2006/picture">
             <wp:extent cx="5040000" cy="3448421"/>
-            <wp:docPr id="13" name="Picture 13"/>
+            <wp:docPr id="27" name="Picture 27"/>
             <wp:cNvGraphicFramePr>
               <a:graphicFrameLocks noChangeAspect="1"/>
             </wp:cNvGraphicFramePr>
@@ -2650,7 +3498,7 @@
                     <pic:cNvPicPr/>
                   </pic:nvPicPr>
                   <pic:blipFill>
-                    <a:blip r:embed="rId21"/>
+                    <a:blip r:embed="rId35"/>
                     <a:stretch>
                       <a:fillRect/>
                     </a:stretch>
@@ -2691,7 +3539,7 @@
         <w:drawing>
           <wp:inline xmlns:a="http://schemas.openxmlformats.org/drawingml/2006/main" xmlns:pic="http://schemas.openxmlformats.org/drawingml/2006/picture">
             <wp:extent cx="5040000" cy="3876923"/>
-            <wp:docPr id="14" name="Picture 14"/>
+            <wp:docPr id="28" name="Picture 28"/>
             <wp:cNvGraphicFramePr>
               <a:graphicFrameLocks noChangeAspect="1"/>
             </wp:cNvGraphicFramePr>
@@ -2703,7 +3551,7 @@
                     <pic:cNvPicPr/>
                   </pic:nvPicPr>
                   <pic:blipFill>
-                    <a:blip r:embed="rId22"/>
+                    <a:blip r:embed="rId36"/>
                     <a:stretch>
                       <a:fillRect/>
                     </a:stretch>
@@ -2744,7 +3592,7 @@
         <w:drawing>
           <wp:inline xmlns:a="http://schemas.openxmlformats.org/drawingml/2006/main" xmlns:pic="http://schemas.openxmlformats.org/drawingml/2006/picture">
             <wp:extent cx="5040000" cy="3360000"/>
-            <wp:docPr id="15" name="Picture 15"/>
+            <wp:docPr id="29" name="Picture 29"/>
             <wp:cNvGraphicFramePr>
               <a:graphicFrameLocks noChangeAspect="1"/>
             </wp:cNvGraphicFramePr>
@@ -2756,7 +3604,7 @@
                     <pic:cNvPicPr/>
                   </pic:nvPicPr>
                   <pic:blipFill>
-                    <a:blip r:embed="rId23"/>
+                    <a:blip r:embed="rId37"/>
                     <a:stretch>
                       <a:fillRect/>
                     </a:stretch>
@@ -2797,7 +3645,7 @@
         <w:drawing>
           <wp:inline xmlns:a="http://schemas.openxmlformats.org/drawingml/2006/main" xmlns:pic="http://schemas.openxmlformats.org/drawingml/2006/picture">
             <wp:extent cx="5040000" cy="2639999"/>
-            <wp:docPr id="16" name="Picture 16"/>
+            <wp:docPr id="30" name="Picture 30"/>
             <wp:cNvGraphicFramePr>
               <a:graphicFrameLocks noChangeAspect="1"/>
             </wp:cNvGraphicFramePr>
@@ -2809,7 +3657,7 @@
                     <pic:cNvPicPr/>
                   </pic:nvPicPr>
                   <pic:blipFill>
-                    <a:blip r:embed="rId24"/>
+                    <a:blip r:embed="rId38"/>
                     <a:stretch>
                       <a:fillRect/>
                     </a:stretch>
@@ -2850,7 +3698,7 @@
         <w:drawing>
           <wp:inline xmlns:a="http://schemas.openxmlformats.org/drawingml/2006/main" xmlns:pic="http://schemas.openxmlformats.org/drawingml/2006/picture">
             <wp:extent cx="5040000" cy="3286957"/>
-            <wp:docPr id="17" name="Picture 17"/>
+            <wp:docPr id="31" name="Picture 31"/>
             <wp:cNvGraphicFramePr>
               <a:graphicFrameLocks noChangeAspect="1"/>
             </wp:cNvGraphicFramePr>
@@ -2862,7 +3710,7 @@
                     <pic:cNvPicPr/>
                   </pic:nvPicPr>
                   <pic:blipFill>
-                    <a:blip r:embed="rId25"/>
+                    <a:blip r:embed="rId39"/>
                     <a:stretch>
                       <a:fillRect/>
                     </a:stretch>

</xml_diff>

<commit_message>
docs: restructure appendices — A (Diagrams), B (Screenshots), C (Code listings). Each diagram now has caption + description
</commit_message>
<xml_diff>
--- a/Нефедов_Алексей_Геннадьевич_преддипломная_практика.docx
+++ b/Нефедов_Алексей_Геннадьевич_преддипломная_практика.docx
@@ -360,7 +360,7 @@
         <w:ind w:firstLine="0"/>
       </w:pPr>
       <w:r>
-        <w:t>Приложение А Скриншоты пользовательского интерфейса</w:t>
+        <w:t>Приложение А Диаграммы проекта</w:t>
       </w:r>
     </w:p>
     <w:p>
@@ -368,7 +368,15 @@
         <w:ind w:firstLine="0"/>
       </w:pPr>
       <w:r>
-        <w:t>Приложение Б Листинги исходного кода</w:t>
+        <w:t>Приложение Б Скриншоты пользовательского интерфейса</w:t>
+      </w:r>
+    </w:p>
+    <w:p>
+      <w:pPr>
+        <w:ind w:firstLine="0"/>
+      </w:pPr>
+      <w:r>
+        <w:t>Приложение В Листинги исходного кода</w:t>
       </w:r>
     </w:p>
     <w:p>
@@ -2992,7 +3000,838 @@
         <w:jc w:val="center"/>
       </w:pPr>
       <w:r>
-        <w:t>ПРИЛОЖЕНИЕ А. СКРИНШОТЫ ПОЛЬЗОВАТЕЛЬСКОГО ИНТЕРФЕЙСА</w:t>
+        <w:t>ПРИЛОЖЕНИЕ А. ДИАГРАММЫ ПРОЕКТА</w:t>
+      </w:r>
+    </w:p>
+    <w:p>
+      <w:r>
+        <w:t>В приложении собраны все проектные диаграммы в полном разрешении. Диаграммы сгенерированы автоматически из описаний в формате DOT средствами Graphviz 14.1 (скрипт scripts/generate_diagrams.py). Такой подход гарантирует воспроизводимость: при изменении модели достаточно перезапустить скрипт, и все PNG обновятся. Часть диаграмм продублирована в основном тексте — в приложении они приведены крупнее, в полное полотно.</w:t>
+      </w:r>
+    </w:p>
+    <w:p>
+      <w:pPr>
+        <w:ind w:firstLine="0"/>
+        <w:jc w:val="center"/>
+      </w:pPr>
+      <w:r>
+        <w:drawing>
+          <wp:inline xmlns:a="http://schemas.openxmlformats.org/drawingml/2006/main" xmlns:pic="http://schemas.openxmlformats.org/drawingml/2006/picture">
+            <wp:extent cx="6120000" cy="2898340"/>
+            <wp:docPr id="18" name="Picture 18"/>
+            <wp:cNvGraphicFramePr>
+              <a:graphicFrameLocks noChangeAspect="1"/>
+            </wp:cNvGraphicFramePr>
+            <a:graphic>
+              <a:graphicData uri="http://schemas.openxmlformats.org/drawingml/2006/picture">
+                <pic:pic>
+                  <pic:nvPicPr>
+                    <pic:cNvPr id="0" name="diagram_idef0_as_is.png"/>
+                    <pic:cNvPicPr/>
+                  </pic:nvPicPr>
+                  <pic:blipFill>
+                    <a:blip r:embed="rId9"/>
+                    <a:stretch>
+                      <a:fillRect/>
+                    </a:stretch>
+                  </pic:blipFill>
+                  <pic:spPr>
+                    <a:xfrm>
+                      <a:off x="0" y="0"/>
+                      <a:ext cx="6120000" cy="2898340"/>
+                    </a:xfrm>
+                    <a:prstGeom prst="rect"/>
+                  </pic:spPr>
+                </pic:pic>
+              </a:graphicData>
+            </a:graphic>
+          </wp:inline>
+        </w:drawing>
+      </w:r>
+    </w:p>
+    <w:p>
+      <w:pPr>
+        <w:ind w:firstLine="0"/>
+        <w:jc w:val="center"/>
+      </w:pPr>
+      <w:r>
+        <w:rPr>
+          <w:i/>
+        </w:rPr>
+        <w:t>Рисунок А.1 — IDEF0 AS-IS: ручная обработка входящих писем</w:t>
+      </w:r>
+    </w:p>
+    <w:p>
+      <w:r>
+        <w:t>Модель текущего состояния показывает, что весь процесс обработки письма выполняется пользователем вручную. Блок A0 получает входы «новое письмо» и «предыдущий контекст», под управлением «корпоративные политики» и с помощью механизмов «пользователь + почтовый клиент» выдаёт «прочитанное» и «задачи в планировщик».</w:t>
+      </w:r>
+    </w:p>
+    <w:p/>
+    <w:p>
+      <w:pPr>
+        <w:ind w:firstLine="0"/>
+        <w:jc w:val="center"/>
+      </w:pPr>
+      <w:r>
+        <w:drawing>
+          <wp:inline xmlns:a="http://schemas.openxmlformats.org/drawingml/2006/main" xmlns:pic="http://schemas.openxmlformats.org/drawingml/2006/picture">
+            <wp:extent cx="6120000" cy="715775"/>
+            <wp:docPr id="19" name="Picture 19"/>
+            <wp:cNvGraphicFramePr>
+              <a:graphicFrameLocks noChangeAspect="1"/>
+            </wp:cNvGraphicFramePr>
+            <a:graphic>
+              <a:graphicData uri="http://schemas.openxmlformats.org/drawingml/2006/picture">
+                <pic:pic>
+                  <pic:nvPicPr>
+                    <pic:cNvPr id="0" name="diagram_idef0_to_be.png"/>
+                    <pic:cNvPicPr/>
+                  </pic:nvPicPr>
+                  <pic:blipFill>
+                    <a:blip r:embed="rId10"/>
+                    <a:stretch>
+                      <a:fillRect/>
+                    </a:stretch>
+                  </pic:blipFill>
+                  <pic:spPr>
+                    <a:xfrm>
+                      <a:off x="0" y="0"/>
+                      <a:ext cx="6120000" cy="715775"/>
+                    </a:xfrm>
+                    <a:prstGeom prst="rect"/>
+                  </pic:spPr>
+                </pic:pic>
+              </a:graphicData>
+            </a:graphic>
+          </wp:inline>
+        </w:drawing>
+      </w:r>
+    </w:p>
+    <w:p>
+      <w:pPr>
+        <w:ind w:firstLine="0"/>
+        <w:jc w:val="center"/>
+      </w:pPr>
+      <w:r>
+        <w:rPr>
+          <w:i/>
+        </w:rPr>
+        <w:t>Рисунок А.2 — IDEF0 TO-BE: автоматизированный анализ</w:t>
+      </w:r>
+    </w:p>
+    <w:p>
+      <w:r>
+        <w:t>Декомпозиция целевой модели на три функциональных блока: A1 (получение писем по IMAP), A2 (ML-анализ) и A3 (предъявление результата). Роль пользователя сокращается до принятия финального решения по спорным письмам.</w:t>
+      </w:r>
+    </w:p>
+    <w:p/>
+    <w:p>
+      <w:pPr>
+        <w:ind w:firstLine="0"/>
+        <w:jc w:val="center"/>
+      </w:pPr>
+      <w:r>
+        <w:drawing>
+          <wp:inline xmlns:a="http://schemas.openxmlformats.org/drawingml/2006/main" xmlns:pic="http://schemas.openxmlformats.org/drawingml/2006/picture">
+            <wp:extent cx="6480000" cy="2160000"/>
+            <wp:docPr id="20" name="Picture 20"/>
+            <wp:cNvGraphicFramePr>
+              <a:graphicFrameLocks noChangeAspect="1"/>
+            </wp:cNvGraphicFramePr>
+            <a:graphic>
+              <a:graphicData uri="http://schemas.openxmlformats.org/drawingml/2006/picture">
+                <pic:pic>
+                  <pic:nvPicPr>
+                    <pic:cNvPr id="0" name="diagram_dfd.png"/>
+                    <pic:cNvPicPr/>
+                  </pic:nvPicPr>
+                  <pic:blipFill>
+                    <a:blip r:embed="rId11"/>
+                    <a:stretch>
+                      <a:fillRect/>
+                    </a:stretch>
+                  </pic:blipFill>
+                  <pic:spPr>
+                    <a:xfrm>
+                      <a:off x="0" y="0"/>
+                      <a:ext cx="6480000" cy="2160000"/>
+                    </a:xfrm>
+                    <a:prstGeom prst="rect"/>
+                  </pic:spPr>
+                </pic:pic>
+              </a:graphicData>
+            </a:graphic>
+          </wp:inline>
+        </w:drawing>
+      </w:r>
+    </w:p>
+    <w:p>
+      <w:pPr>
+        <w:ind w:firstLine="0"/>
+        <w:jc w:val="center"/>
+      </w:pPr>
+      <w:r>
+        <w:rPr>
+          <w:i/>
+        </w:rPr>
+        <w:t>Рисунок А.3 — DFD первого уровня (нотация Гейна-Сарсона)</w:t>
+      </w:r>
+    </w:p>
+    <w:p>
+      <w:r>
+        <w:t>Пять процессов (аутентификация, импорт, анализ, просмотр, формирование отчёта), четыре хранилища данных (users, emails, rules, model) и две внешние сущности (пользователь, IMAP-сервер). Потоки подписаны — диаграмма пригодна для передачи проектировщику БД.</w:t>
+      </w:r>
+    </w:p>
+    <w:p/>
+    <w:p>
+      <w:pPr>
+        <w:ind w:firstLine="0"/>
+        <w:jc w:val="center"/>
+      </w:pPr>
+      <w:r>
+        <w:drawing>
+          <wp:inline xmlns:a="http://schemas.openxmlformats.org/drawingml/2006/main" xmlns:pic="http://schemas.openxmlformats.org/drawingml/2006/picture">
+            <wp:extent cx="6480000" cy="11472787"/>
+            <wp:docPr id="21" name="Picture 21"/>
+            <wp:cNvGraphicFramePr>
+              <a:graphicFrameLocks noChangeAspect="1"/>
+            </wp:cNvGraphicFramePr>
+            <a:graphic>
+              <a:graphicData uri="http://schemas.openxmlformats.org/drawingml/2006/picture">
+                <pic:pic>
+                  <pic:nvPicPr>
+                    <pic:cNvPr id="0" name="diagram_use_case.png"/>
+                    <pic:cNvPicPr/>
+                  </pic:nvPicPr>
+                  <pic:blipFill>
+                    <a:blip r:embed="rId16"/>
+                    <a:stretch>
+                      <a:fillRect/>
+                    </a:stretch>
+                  </pic:blipFill>
+                  <pic:spPr>
+                    <a:xfrm>
+                      <a:off x="0" y="0"/>
+                      <a:ext cx="6480000" cy="11472787"/>
+                    </a:xfrm>
+                    <a:prstGeom prst="rect"/>
+                  </pic:spPr>
+                </pic:pic>
+              </a:graphicData>
+            </a:graphic>
+          </wp:inline>
+        </w:drawing>
+      </w:r>
+    </w:p>
+    <w:p>
+      <w:pPr>
+        <w:ind w:firstLine="0"/>
+        <w:jc w:val="center"/>
+      </w:pPr>
+      <w:r>
+        <w:rPr>
+          <w:i/>
+        </w:rPr>
+        <w:t>Рисунок А.4 — UML Use Case: роли и сценарии системы</w:t>
+      </w:r>
+    </w:p>
+    <w:p>
+      <w:r>
+        <w:t>Три актора-пользователя (user, analyst, admin) и один внешний (IMAP-сервер). Семь вариантов использования внутри системной рамки. Административные функции изолированы от пользовательских.</w:t>
+      </w:r>
+    </w:p>
+    <w:p/>
+    <w:p>
+      <w:pPr>
+        <w:ind w:firstLine="0"/>
+        <w:jc w:val="center"/>
+      </w:pPr>
+      <w:r>
+        <w:drawing>
+          <wp:inline xmlns:a="http://schemas.openxmlformats.org/drawingml/2006/main" xmlns:pic="http://schemas.openxmlformats.org/drawingml/2006/picture">
+            <wp:extent cx="5040000" cy="13095738"/>
+            <wp:docPr id="22" name="Picture 22"/>
+            <wp:cNvGraphicFramePr>
+              <a:graphicFrameLocks noChangeAspect="1"/>
+            </wp:cNvGraphicFramePr>
+            <a:graphic>
+              <a:graphicData uri="http://schemas.openxmlformats.org/drawingml/2006/picture">
+                <pic:pic>
+                  <pic:nvPicPr>
+                    <pic:cNvPr id="0" name="diagram_activity.png"/>
+                    <pic:cNvPicPr/>
+                  </pic:nvPicPr>
+                  <pic:blipFill>
+                    <a:blip r:embed="rId20"/>
+                    <a:stretch>
+                      <a:fillRect/>
+                    </a:stretch>
+                  </pic:blipFill>
+                  <pic:spPr>
+                    <a:xfrm>
+                      <a:off x="0" y="0"/>
+                      <a:ext cx="5040000" cy="13095738"/>
+                    </a:xfrm>
+                    <a:prstGeom prst="rect"/>
+                  </pic:spPr>
+                </pic:pic>
+              </a:graphicData>
+            </a:graphic>
+          </wp:inline>
+        </w:drawing>
+      </w:r>
+    </w:p>
+    <w:p>
+      <w:pPr>
+        <w:ind w:firstLine="0"/>
+        <w:jc w:val="center"/>
+      </w:pPr>
+      <w:r>
+        <w:rPr>
+          <w:i/>
+        </w:rPr>
+        <w:t>Рисунок А.5 — UML Activity: импорт и анализ пакета писем</w:t>
+      </w:r>
+    </w:p>
+    <w:p>
+      <w:r>
+        <w:t>Диаграмма деятельности детализирует основной сценарий приложения. Решение «спам или фишинг?» разветвляет поток на два варианта: «подсветить красным» для подозрительных писем и «пометить обычным» для остальных.</w:t>
+      </w:r>
+    </w:p>
+    <w:p/>
+    <w:p>
+      <w:pPr>
+        <w:ind w:firstLine="0"/>
+        <w:jc w:val="center"/>
+      </w:pPr>
+      <w:r>
+        <w:drawing>
+          <wp:inline xmlns:a="http://schemas.openxmlformats.org/drawingml/2006/main" xmlns:pic="http://schemas.openxmlformats.org/drawingml/2006/picture">
+            <wp:extent cx="6480000" cy="2108785"/>
+            <wp:docPr id="23" name="Picture 23"/>
+            <wp:cNvGraphicFramePr>
+              <a:graphicFrameLocks noChangeAspect="1"/>
+            </wp:cNvGraphicFramePr>
+            <a:graphic>
+              <a:graphicData uri="http://schemas.openxmlformats.org/drawingml/2006/picture">
+                <pic:pic>
+                  <pic:nvPicPr>
+                    <pic:cNvPr id="0" name="diagram_sequence.png"/>
+                    <pic:cNvPicPr/>
+                  </pic:nvPicPr>
+                  <pic:blipFill>
+                    <a:blip r:embed="rId25"/>
+                    <a:stretch>
+                      <a:fillRect/>
+                    </a:stretch>
+                  </pic:blipFill>
+                  <pic:spPr>
+                    <a:xfrm>
+                      <a:off x="0" y="0"/>
+                      <a:ext cx="6480000" cy="2108785"/>
+                    </a:xfrm>
+                    <a:prstGeom prst="rect"/>
+                  </pic:spPr>
+                </pic:pic>
+              </a:graphicData>
+            </a:graphic>
+          </wp:inline>
+        </w:drawing>
+      </w:r>
+    </w:p>
+    <w:p>
+      <w:pPr>
+        <w:ind w:firstLine="0"/>
+        <w:jc w:val="center"/>
+      </w:pPr>
+      <w:r>
+        <w:rPr>
+          <w:i/>
+        </w:rPr>
+        <w:t>Рисунок А.6 — UML Sequence: цикл «импорт и анализ»</w:t>
+      </w:r>
+    </w:p>
+    <w:p>
+      <w:r>
+        <w:t>Диаграмма последовательности показывает обмен сообщениями между пятью участниками. Десять шагов — от нажатия кнопки «Импорт» до появления строки в таблице главного окна.</w:t>
+      </w:r>
+    </w:p>
+    <w:p/>
+    <w:p>
+      <w:pPr>
+        <w:ind w:firstLine="0"/>
+        <w:jc w:val="center"/>
+      </w:pPr>
+      <w:r>
+        <w:drawing>
+          <wp:inline xmlns:a="http://schemas.openxmlformats.org/drawingml/2006/main" xmlns:pic="http://schemas.openxmlformats.org/drawingml/2006/picture">
+            <wp:extent cx="6480000" cy="2377435"/>
+            <wp:docPr id="24" name="Picture 24"/>
+            <wp:cNvGraphicFramePr>
+              <a:graphicFrameLocks noChangeAspect="1"/>
+            </wp:cNvGraphicFramePr>
+            <a:graphic>
+              <a:graphicData uri="http://schemas.openxmlformats.org/drawingml/2006/picture">
+                <pic:pic>
+                  <pic:nvPicPr>
+                    <pic:cNvPr id="0" name="diagram_components.png"/>
+                    <pic:cNvPicPr/>
+                  </pic:nvPicPr>
+                  <pic:blipFill>
+                    <a:blip r:embed="rId12"/>
+                    <a:stretch>
+                      <a:fillRect/>
+                    </a:stretch>
+                  </pic:blipFill>
+                  <pic:spPr>
+                    <a:xfrm>
+                      <a:off x="0" y="0"/>
+                      <a:ext cx="6480000" cy="2377435"/>
+                    </a:xfrm>
+                    <a:prstGeom prst="rect"/>
+                  </pic:spPr>
+                </pic:pic>
+              </a:graphicData>
+            </a:graphic>
+          </wp:inline>
+        </w:drawing>
+      </w:r>
+    </w:p>
+    <w:p>
+      <w:pPr>
+        <w:ind w:firstLine="0"/>
+        <w:jc w:val="center"/>
+      </w:pPr>
+      <w:r>
+        <w:rPr>
+          <w:i/>
+        </w:rPr>
+        <w:t>Рисунок А.7 — Диаграмма компонентов</w:t>
+      </w:r>
+    </w:p>
+    <w:p>
+      <w:r>
+        <w:t>Архитектура первого уровня: клиент PyQt6, backend FastAPI, ML-ядро, внешние ресурсы (СУБД, модель, IMAP). Межкомпонентные связи подписаны протоколами.</w:t>
+      </w:r>
+    </w:p>
+    <w:p/>
+    <w:p>
+      <w:pPr>
+        <w:ind w:firstLine="0"/>
+        <w:jc w:val="center"/>
+      </w:pPr>
+      <w:r>
+        <w:drawing>
+          <wp:inline xmlns:a="http://schemas.openxmlformats.org/drawingml/2006/main" xmlns:pic="http://schemas.openxmlformats.org/drawingml/2006/picture">
+            <wp:extent cx="6480000" cy="543880"/>
+            <wp:docPr id="25" name="Picture 25"/>
+            <wp:cNvGraphicFramePr>
+              <a:graphicFrameLocks noChangeAspect="1"/>
+            </wp:cNvGraphicFramePr>
+            <a:graphic>
+              <a:graphicData uri="http://schemas.openxmlformats.org/drawingml/2006/picture">
+                <pic:pic>
+                  <pic:nvPicPr>
+                    <pic:cNvPr id="0" name="diagram_function_tree.png"/>
+                    <pic:cNvPicPr/>
+                  </pic:nvPicPr>
+                  <pic:blipFill>
+                    <a:blip r:embed="rId14"/>
+                    <a:stretch>
+                      <a:fillRect/>
+                    </a:stretch>
+                  </pic:blipFill>
+                  <pic:spPr>
+                    <a:xfrm>
+                      <a:off x="0" y="0"/>
+                      <a:ext cx="6480000" cy="543880"/>
+                    </a:xfrm>
+                    <a:prstGeom prst="rect"/>
+                  </pic:spPr>
+                </pic:pic>
+              </a:graphicData>
+            </a:graphic>
+          </wp:inline>
+        </w:drawing>
+      </w:r>
+    </w:p>
+    <w:p>
+      <w:pPr>
+        <w:ind w:firstLine="0"/>
+        <w:jc w:val="center"/>
+      </w:pPr>
+      <w:r>
+        <w:rPr>
+          <w:i/>
+        </w:rPr>
+        <w:t>Рисунок А.8 — Дерево функций приложения</w:t>
+      </w:r>
+    </w:p>
+    <w:p>
+      <w:r>
+        <w:t>Три группы функциональности: клиентские, аналитические, служебные. 19 листьев-функций. Такое дерево — удобная структура для генерации чек-листа ручного тестирования.</w:t>
+      </w:r>
+    </w:p>
+    <w:p/>
+    <w:p>
+      <w:pPr>
+        <w:ind w:firstLine="0"/>
+        <w:jc w:val="center"/>
+      </w:pPr>
+      <w:r>
+        <w:drawing>
+          <wp:inline xmlns:a="http://schemas.openxmlformats.org/drawingml/2006/main" xmlns:pic="http://schemas.openxmlformats.org/drawingml/2006/picture">
+            <wp:extent cx="6480000" cy="1997967"/>
+            <wp:docPr id="26" name="Picture 26"/>
+            <wp:cNvGraphicFramePr>
+              <a:graphicFrameLocks noChangeAspect="1"/>
+            </wp:cNvGraphicFramePr>
+            <a:graphic>
+              <a:graphicData uri="http://schemas.openxmlformats.org/drawingml/2006/picture">
+                <pic:pic>
+                  <pic:nvPicPr>
+                    <pic:cNvPr id="0" name="diagram_dialog_scenario.png"/>
+                    <pic:cNvPicPr/>
+                  </pic:nvPicPr>
+                  <pic:blipFill>
+                    <a:blip r:embed="rId15"/>
+                    <a:stretch>
+                      <a:fillRect/>
+                    </a:stretch>
+                  </pic:blipFill>
+                  <pic:spPr>
+                    <a:xfrm>
+                      <a:off x="0" y="0"/>
+                      <a:ext cx="6480000" cy="1997967"/>
+                    </a:xfrm>
+                    <a:prstGeom prst="rect"/>
+                  </pic:spPr>
+                </pic:pic>
+              </a:graphicData>
+            </a:graphic>
+          </wp:inline>
+        </w:drawing>
+      </w:r>
+    </w:p>
+    <w:p>
+      <w:pPr>
+        <w:ind w:firstLine="0"/>
+        <w:jc w:val="center"/>
+      </w:pPr>
+      <w:r>
+        <w:rPr>
+          <w:i/>
+        </w:rPr>
+        <w:t>Рисунок А.9 — Сценарий диалога пользователя</w:t>
+      </w:r>
+    </w:p>
+    <w:p>
+      <w:r>
+        <w:t>Граф переходов между окнами. Главное окно (MainWindow) — хаб, из которого доступны все вторичные окна с возвратным переходом. Админ-панель открывается только для роли admin.</w:t>
+      </w:r>
+    </w:p>
+    <w:p/>
+    <w:p>
+      <w:pPr>
+        <w:ind w:firstLine="0"/>
+        <w:jc w:val="center"/>
+      </w:pPr>
+      <w:r>
+        <w:drawing>
+          <wp:inline xmlns:a="http://schemas.openxmlformats.org/drawingml/2006/main" xmlns:pic="http://schemas.openxmlformats.org/drawingml/2006/picture">
+            <wp:extent cx="6480000" cy="5937814"/>
+            <wp:docPr id="27" name="Picture 27"/>
+            <wp:cNvGraphicFramePr>
+              <a:graphicFrameLocks noChangeAspect="1"/>
+            </wp:cNvGraphicFramePr>
+            <a:graphic>
+              <a:graphicData uri="http://schemas.openxmlformats.org/drawingml/2006/picture">
+                <pic:pic>
+                  <pic:nvPicPr>
+                    <pic:cNvPr id="0" name="diagram_er_basic.png"/>
+                    <pic:cNvPicPr/>
+                  </pic:nvPicPr>
+                  <pic:blipFill>
+                    <a:blip r:embed="rId17"/>
+                    <a:stretch>
+                      <a:fillRect/>
+                    </a:stretch>
+                  </pic:blipFill>
+                  <pic:spPr>
+                    <a:xfrm>
+                      <a:off x="0" y="0"/>
+                      <a:ext cx="6480000" cy="5937814"/>
+                    </a:xfrm>
+                    <a:prstGeom prst="rect"/>
+                  </pic:spPr>
+                </pic:pic>
+              </a:graphicData>
+            </a:graphic>
+          </wp:inline>
+        </w:drawing>
+      </w:r>
+    </w:p>
+    <w:p>
+      <w:pPr>
+        <w:ind w:firstLine="0"/>
+        <w:jc w:val="center"/>
+      </w:pPr>
+      <w:r>
+        <w:rPr>
+          <w:i/>
+        </w:rPr>
+        <w:t>Рисунок А.10 — ER-диаграмма (базовая, нотация Чена)</w:t>
+      </w:r>
+    </w:p>
+    <w:p>
+      <w:r>
+        <w:t>Двенадцать сущностей связаны одиннадцатью отношениями. Кратности (1, N, M) обозначены у концов линий. Центральная сущность EmailMessage имеет четыре прямых связи с соседями.</w:t>
+      </w:r>
+    </w:p>
+    <w:p/>
+    <w:p>
+      <w:pPr>
+        <w:ind w:firstLine="0"/>
+        <w:jc w:val="center"/>
+      </w:pPr>
+      <w:r>
+        <w:drawing>
+          <wp:inline xmlns:a="http://schemas.openxmlformats.org/drawingml/2006/main" xmlns:pic="http://schemas.openxmlformats.org/drawingml/2006/picture">
+            <wp:extent cx="6120000" cy="1791796"/>
+            <wp:docPr id="28" name="Picture 28"/>
+            <wp:cNvGraphicFramePr>
+              <a:graphicFrameLocks noChangeAspect="1"/>
+            </wp:cNvGraphicFramePr>
+            <a:graphic>
+              <a:graphicData uri="http://schemas.openxmlformats.org/drawingml/2006/picture">
+                <pic:pic>
+                  <pic:nvPicPr>
+                    <pic:cNvPr id="0" name="diagram_er_refined.png"/>
+                    <pic:cNvPicPr/>
+                  </pic:nvPicPr>
+                  <pic:blipFill>
+                    <a:blip r:embed="rId18"/>
+                    <a:stretch>
+                      <a:fillRect/>
+                    </a:stretch>
+                  </pic:blipFill>
+                  <pic:spPr>
+                    <a:xfrm>
+                      <a:off x="0" y="0"/>
+                      <a:ext cx="6120000" cy="1791796"/>
+                    </a:xfrm>
+                    <a:prstGeom prst="rect"/>
+                  </pic:spPr>
+                </pic:pic>
+              </a:graphicData>
+            </a:graphic>
+          </wp:inline>
+        </w:drawing>
+      </w:r>
+    </w:p>
+    <w:p>
+      <w:pPr>
+        <w:ind w:firstLine="0"/>
+        <w:jc w:val="center"/>
+      </w:pPr>
+      <w:r>
+        <w:rPr>
+          <w:i/>
+        </w:rPr>
+        <w:t>Рисунок А.11 — Уточнённая ER-диаграмма</w:t>
+      </w:r>
+    </w:p>
+    <w:p>
+      <w:r>
+        <w:t>Атрибуты сущностей User и EmailMessage вынесены в эллипсы. Первичные ключи обозначены PK, уникальные — UQ. Остальные сущности устроены аналогично.</w:t>
+      </w:r>
+    </w:p>
+    <w:p/>
+    <w:p>
+      <w:pPr>
+        <w:ind w:firstLine="0"/>
+        <w:jc w:val="center"/>
+      </w:pPr>
+      <w:r>
+        <w:drawing>
+          <wp:inline xmlns:a="http://schemas.openxmlformats.org/drawingml/2006/main" xmlns:pic="http://schemas.openxmlformats.org/drawingml/2006/picture">
+            <wp:extent cx="5040000" cy="13829333"/>
+            <wp:docPr id="29" name="Picture 29"/>
+            <wp:cNvGraphicFramePr>
+              <a:graphicFrameLocks noChangeAspect="1"/>
+            </wp:cNvGraphicFramePr>
+            <a:graphic>
+              <a:graphicData uri="http://schemas.openxmlformats.org/drawingml/2006/picture">
+                <pic:pic>
+                  <pic:nvPicPr>
+                    <pic:cNvPr id="0" name="diagram_schema_db.png"/>
+                    <pic:cNvPicPr/>
+                  </pic:nvPicPr>
+                  <pic:blipFill>
+                    <a:blip r:embed="rId19"/>
+                    <a:stretch>
+                      <a:fillRect/>
+                    </a:stretch>
+                  </pic:blipFill>
+                  <pic:spPr>
+                    <a:xfrm>
+                      <a:off x="0" y="0"/>
+                      <a:ext cx="5040000" cy="13829333"/>
+                    </a:xfrm>
+                    <a:prstGeom prst="rect"/>
+                  </pic:spPr>
+                </pic:pic>
+              </a:graphicData>
+            </a:graphic>
+          </wp:inline>
+        </w:drawing>
+      </w:r>
+    </w:p>
+    <w:p>
+      <w:pPr>
+        <w:ind w:firstLine="0"/>
+        <w:jc w:val="center"/>
+      </w:pPr>
+      <w:r>
+        <w:rPr>
+          <w:i/>
+        </w:rPr>
+        <w:t>Рисунок А.12 — Физическая схема базы данных</w:t>
+      </w:r>
+    </w:p>
+    <w:p>
+      <w:r>
+        <w:t>Таблицы с полями, типами (PK/FK/UQ), внешние ключи с наконечником crow-foot. Схема соответствует SQLAlchemy-модели в src/email_analyzer/db/models.py.</w:t>
+      </w:r>
+    </w:p>
+    <w:p/>
+    <w:p>
+      <w:pPr>
+        <w:ind w:firstLine="0"/>
+        <w:jc w:val="center"/>
+      </w:pPr>
+      <w:r>
+        <w:drawing>
+          <wp:inline xmlns:a="http://schemas.openxmlformats.org/drawingml/2006/main" xmlns:pic="http://schemas.openxmlformats.org/drawingml/2006/picture">
+            <wp:extent cx="6480000" cy="748308"/>
+            <wp:docPr id="30" name="Picture 30"/>
+            <wp:cNvGraphicFramePr>
+              <a:graphicFrameLocks noChangeAspect="1"/>
+            </wp:cNvGraphicFramePr>
+            <a:graphic>
+              <a:graphicData uri="http://schemas.openxmlformats.org/drawingml/2006/picture">
+                <pic:pic>
+                  <pic:nvPicPr>
+                    <pic:cNvPr id="0" name="diagram_testing_types.png"/>
+                    <pic:cNvPicPr/>
+                  </pic:nvPicPr>
+                  <pic:blipFill>
+                    <a:blip r:embed="rId21"/>
+                    <a:stretch>
+                      <a:fillRect/>
+                    </a:stretch>
+                  </pic:blipFill>
+                  <pic:spPr>
+                    <a:xfrm>
+                      <a:off x="0" y="0"/>
+                      <a:ext cx="6480000" cy="748308"/>
+                    </a:xfrm>
+                    <a:prstGeom prst="rect"/>
+                  </pic:spPr>
+                </pic:pic>
+              </a:graphicData>
+            </a:graphic>
+          </wp:inline>
+        </w:drawing>
+      </w:r>
+    </w:p>
+    <w:p>
+      <w:pPr>
+        <w:ind w:firstLine="0"/>
+        <w:jc w:val="center"/>
+      </w:pPr>
+      <w:r>
+        <w:rPr>
+          <w:i/>
+        </w:rPr>
+        <w:t>Рисунок А.13 — Классификация видов тестирования</w:t>
+      </w:r>
+    </w:p>
+    <w:p>
+      <w:r>
+        <w:t>Пять способов группировки видов тестирования. В работе реализованы модульное, интеграционное, функциональное, валидационное и нагрузочное тестирование — см. главу 4.</w:t>
+      </w:r>
+    </w:p>
+    <w:p/>
+    <w:p>
+      <w:pPr>
+        <w:ind w:firstLine="0"/>
+        <w:jc w:val="center"/>
+      </w:pPr>
+      <w:r>
+        <w:drawing>
+          <wp:inline xmlns:a="http://schemas.openxmlformats.org/drawingml/2006/main" xmlns:pic="http://schemas.openxmlformats.org/drawingml/2006/picture">
+            <wp:extent cx="6120000" cy="855027"/>
+            <wp:docPr id="31" name="Picture 31"/>
+            <wp:cNvGraphicFramePr>
+              <a:graphicFrameLocks noChangeAspect="1"/>
+            </wp:cNvGraphicFramePr>
+            <a:graphic>
+              <a:graphicData uri="http://schemas.openxmlformats.org/drawingml/2006/picture">
+                <pic:pic>
+                  <pic:nvPicPr>
+                    <pic:cNvPr id="0" name="diagram_deployment_types.png"/>
+                    <pic:cNvPicPr/>
+                  </pic:nvPicPr>
+                  <pic:blipFill>
+                    <a:blip r:embed="rId24"/>
+                    <a:stretch>
+                      <a:fillRect/>
+                    </a:stretch>
+                  </pic:blipFill>
+                  <pic:spPr>
+                    <a:xfrm>
+                      <a:off x="0" y="0"/>
+                      <a:ext cx="6120000" cy="855027"/>
+                    </a:xfrm>
+                    <a:prstGeom prst="rect"/>
+                  </pic:spPr>
+                </pic:pic>
+              </a:graphicData>
+            </a:graphic>
+          </wp:inline>
+        </w:drawing>
+      </w:r>
+    </w:p>
+    <w:p>
+      <w:pPr>
+        <w:ind w:firstLine="0"/>
+        <w:jc w:val="center"/>
+      </w:pPr>
+      <w:r>
+        <w:rPr>
+          <w:i/>
+        </w:rPr>
+        <w:t>Рисунок А.14 — Стратегии развёртывания ПО</w:t>
+      </w:r>
+    </w:p>
+    <w:p>
+      <w:r>
+        <w:t>Девять стратегий от «повторного создания» до «канареечного релиза». В проекте применены «непрерывная интеграция» и «непрерывная доставка» — через GitHub Actions + PyInstaller.</w:t>
+      </w:r>
+    </w:p>
+    <w:p/>
+    <w:p>
+      <w:r>
+        <w:br w:type="page"/>
+      </w:r>
+    </w:p>
+    <w:p>
+      <w:pPr>
+        <w:pStyle w:val="Heading1"/>
+        <w:jc w:val="center"/>
+      </w:pPr>
+      <w:r>
+        <w:t>ПРИЛОЖЕНИЕ Б. СКРИНШОТЫ ПОЛЬЗОВАТЕЛЬСКОГО ИНТЕРФЕЙСА</w:t>
       </w:r>
     </w:p>
     <w:p>
@@ -3009,7 +3848,7 @@
         <w:drawing>
           <wp:inline xmlns:a="http://schemas.openxmlformats.org/drawingml/2006/main" xmlns:pic="http://schemas.openxmlformats.org/drawingml/2006/picture">
             <wp:extent cx="5040000" cy="2800000"/>
-            <wp:docPr id="18" name="Picture 18"/>
+            <wp:docPr id="32" name="Picture 32"/>
             <wp:cNvGraphicFramePr>
               <a:graphicFrameLocks noChangeAspect="1"/>
             </wp:cNvGraphicFramePr>
@@ -3049,7 +3888,7 @@
         <w:rPr>
           <w:i/>
         </w:rPr>
-        <w:t>Рисунок А.1 — Окно авторизации (LoginWindow)</w:t>
+        <w:t>Рисунок Б.1 — Окно авторизации (LoginWindow)</w:t>
       </w:r>
     </w:p>
     <w:p/>
@@ -3062,7 +3901,7 @@
         <w:drawing>
           <wp:inline xmlns:a="http://schemas.openxmlformats.org/drawingml/2006/main" xmlns:pic="http://schemas.openxmlformats.org/drawingml/2006/picture">
             <wp:extent cx="5040000" cy="3150000"/>
-            <wp:docPr id="19" name="Picture 19"/>
+            <wp:docPr id="33" name="Picture 33"/>
             <wp:cNvGraphicFramePr>
               <a:graphicFrameLocks noChangeAspect="1"/>
             </wp:cNvGraphicFramePr>
@@ -3102,7 +3941,7 @@
         <w:rPr>
           <w:i/>
         </w:rPr>
-        <w:t>Рисунок А.2 — Главное окно (MainWindow) со списком писем</w:t>
+        <w:t>Рисунок Б.2 — Главное окно (MainWindow) со списком писем</w:t>
       </w:r>
     </w:p>
     <w:p/>
@@ -3115,7 +3954,7 @@
         <w:drawing>
           <wp:inline xmlns:a="http://schemas.openxmlformats.org/drawingml/2006/main" xmlns:pic="http://schemas.openxmlformats.org/drawingml/2006/picture">
             <wp:extent cx="5040000" cy="3854118"/>
-            <wp:docPr id="20" name="Picture 20"/>
+            <wp:docPr id="34" name="Picture 34"/>
             <wp:cNvGraphicFramePr>
               <a:graphicFrameLocks noChangeAspect="1"/>
             </wp:cNvGraphicFramePr>
@@ -3155,7 +3994,7 @@
         <w:rPr>
           <w:i/>
         </w:rPr>
-        <w:t>Рисунок А.3 — Детальное окно письма (EmailDetailWindow)</w:t>
+        <w:t>Рисунок Б.3 — Детальное окно письма (EmailDetailWindow)</w:t>
       </w:r>
     </w:p>
     <w:p/>
@@ -3168,7 +4007,7 @@
         <w:drawing>
           <wp:inline xmlns:a="http://schemas.openxmlformats.org/drawingml/2006/main" xmlns:pic="http://schemas.openxmlformats.org/drawingml/2006/picture">
             <wp:extent cx="5040000" cy="3959999"/>
-            <wp:docPr id="21" name="Picture 21"/>
+            <wp:docPr id="35" name="Picture 35"/>
             <wp:cNvGraphicFramePr>
               <a:graphicFrameLocks noChangeAspect="1"/>
             </wp:cNvGraphicFramePr>
@@ -3208,7 +4047,7 @@
         <w:rPr>
           <w:i/>
         </w:rPr>
-        <w:t>Рисунок А.4 — Окно настроек (SettingsWindow)</w:t>
+        <w:t>Рисунок Б.4 — Окно настроек (SettingsWindow)</w:t>
       </w:r>
     </w:p>
     <w:p/>
@@ -3221,7 +4060,7 @@
         <w:drawing>
           <wp:inline xmlns:a="http://schemas.openxmlformats.org/drawingml/2006/main" xmlns:pic="http://schemas.openxmlformats.org/drawingml/2006/picture">
             <wp:extent cx="5040000" cy="3360000"/>
-            <wp:docPr id="22" name="Picture 22"/>
+            <wp:docPr id="36" name="Picture 36"/>
             <wp:cNvGraphicFramePr>
               <a:graphicFrameLocks noChangeAspect="1"/>
             </wp:cNvGraphicFramePr>
@@ -3261,7 +4100,7 @@
         <w:rPr>
           <w:i/>
         </w:rPr>
-        <w:t>Рисунок А.5 — Панель администратора (AdminWindow)</w:t>
+        <w:t>Рисунок Б.5 — Панель администратора (AdminWindow)</w:t>
       </w:r>
     </w:p>
     <w:p/>
@@ -3274,7 +4113,7 @@
         <w:drawing>
           <wp:inline xmlns:a="http://schemas.openxmlformats.org/drawingml/2006/main" xmlns:pic="http://schemas.openxmlformats.org/drawingml/2006/picture">
             <wp:extent cx="5040000" cy="3360000"/>
-            <wp:docPr id="23" name="Picture 23"/>
+            <wp:docPr id="37" name="Picture 37"/>
             <wp:cNvGraphicFramePr>
               <a:graphicFrameLocks noChangeAspect="1"/>
             </wp:cNvGraphicFramePr>
@@ -3314,7 +4153,7 @@
         <w:rPr>
           <w:i/>
         </w:rPr>
-        <w:t>Рисунок А.6 — Личный кабинет (ProfileWindow)</w:t>
+        <w:t>Рисунок Б.6 — Личный кабинет (ProfileWindow)</w:t>
       </w:r>
     </w:p>
     <w:p/>
@@ -3327,7 +4166,7 @@
         <w:drawing>
           <wp:inline xmlns:a="http://schemas.openxmlformats.org/drawingml/2006/main" xmlns:pic="http://schemas.openxmlformats.org/drawingml/2006/picture">
             <wp:extent cx="5040000" cy="3464999"/>
-            <wp:docPr id="24" name="Picture 24"/>
+            <wp:docPr id="38" name="Picture 38"/>
             <wp:cNvGraphicFramePr>
               <a:graphicFrameLocks noChangeAspect="1"/>
             </wp:cNvGraphicFramePr>
@@ -3367,7 +4206,7 @@
         <w:rPr>
           <w:i/>
         </w:rPr>
-        <w:t>Рисунок А.7 — Окно правил (RulesWindow)</w:t>
+        <w:t>Рисунок Б.7 — Окно правил (RulesWindow)</w:t>
       </w:r>
     </w:p>
     <w:p/>
@@ -3380,7 +4219,7 @@
         <w:drawing>
           <wp:inline xmlns:a="http://schemas.openxmlformats.org/drawingml/2006/main" xmlns:pic="http://schemas.openxmlformats.org/drawingml/2006/picture">
             <wp:extent cx="5040000" cy="2730000"/>
-            <wp:docPr id="25" name="Picture 25"/>
+            <wp:docPr id="39" name="Picture 39"/>
             <wp:cNvGraphicFramePr>
               <a:graphicFrameLocks noChangeAspect="1"/>
             </wp:cNvGraphicFramePr>
@@ -3420,7 +4259,7 @@
         <w:rPr>
           <w:i/>
         </w:rPr>
-        <w:t>Рисунок А.8 — Экспорт отчётов (ReportsWindow)</w:t>
+        <w:t>Рисунок Б.8 — Экспорт отчётов (ReportsWindow)</w:t>
       </w:r>
     </w:p>
     <w:p/>
@@ -3433,7 +4272,7 @@
         <w:drawing>
           <wp:inline xmlns:a="http://schemas.openxmlformats.org/drawingml/2006/main" xmlns:pic="http://schemas.openxmlformats.org/drawingml/2006/picture">
             <wp:extent cx="5040000" cy="4095000"/>
-            <wp:docPr id="26" name="Picture 26"/>
+            <wp:docPr id="40" name="Picture 40"/>
             <wp:cNvGraphicFramePr>
               <a:graphicFrameLocks noChangeAspect="1"/>
             </wp:cNvGraphicFramePr>
@@ -3473,7 +4312,7 @@
         <w:rPr>
           <w:i/>
         </w:rPr>
-        <w:t>Рисунок А.9 — Встроенная справка (HelpWindow)</w:t>
+        <w:t>Рисунок Б.9 — Встроенная справка (HelpWindow)</w:t>
       </w:r>
     </w:p>
     <w:p/>
@@ -3486,7 +4325,7 @@
         <w:drawing>
           <wp:inline xmlns:a="http://schemas.openxmlformats.org/drawingml/2006/main" xmlns:pic="http://schemas.openxmlformats.org/drawingml/2006/picture">
             <wp:extent cx="5040000" cy="3448421"/>
-            <wp:docPr id="27" name="Picture 27"/>
+            <wp:docPr id="41" name="Picture 41"/>
             <wp:cNvGraphicFramePr>
               <a:graphicFrameLocks noChangeAspect="1"/>
             </wp:cNvGraphicFramePr>
@@ -3526,7 +4365,7 @@
         <w:rPr>
           <w:i/>
         </w:rPr>
-        <w:t>Рисунок А.10 — О программе (AboutWindow)</w:t>
+        <w:t>Рисунок Б.10 — О программе (AboutWindow)</w:t>
       </w:r>
     </w:p>
     <w:p/>
@@ -3539,7 +4378,7 @@
         <w:drawing>
           <wp:inline xmlns:a="http://schemas.openxmlformats.org/drawingml/2006/main" xmlns:pic="http://schemas.openxmlformats.org/drawingml/2006/picture">
             <wp:extent cx="5040000" cy="3876923"/>
-            <wp:docPr id="28" name="Picture 28"/>
+            <wp:docPr id="42" name="Picture 42"/>
             <wp:cNvGraphicFramePr>
               <a:graphicFrameLocks noChangeAspect="1"/>
             </wp:cNvGraphicFramePr>
@@ -3579,7 +4418,7 @@
         <w:rPr>
           <w:i/>
         </w:rPr>
-        <w:t>Рисунок А.11 — Статистика (StatsWindow)</w:t>
+        <w:t>Рисунок Б.11 — Статистика (StatsWindow)</w:t>
       </w:r>
     </w:p>
     <w:p/>
@@ -3592,7 +4431,7 @@
         <w:drawing>
           <wp:inline xmlns:a="http://schemas.openxmlformats.org/drawingml/2006/main" xmlns:pic="http://schemas.openxmlformats.org/drawingml/2006/picture">
             <wp:extent cx="5040000" cy="3360000"/>
-            <wp:docPr id="29" name="Picture 29"/>
+            <wp:docPr id="43" name="Picture 43"/>
             <wp:cNvGraphicFramePr>
               <a:graphicFrameLocks noChangeAspect="1"/>
             </wp:cNvGraphicFramePr>
@@ -3632,7 +4471,7 @@
         <w:rPr>
           <w:i/>
         </w:rPr>
-        <w:t>Рисунок А.12 — Семантический поиск (SearchWindow)</w:t>
+        <w:t>Рисунок Б.12 — Семантический поиск (SearchWindow)</w:t>
       </w:r>
     </w:p>
     <w:p/>
@@ -3645,7 +4484,7 @@
         <w:drawing>
           <wp:inline xmlns:a="http://schemas.openxmlformats.org/drawingml/2006/main" xmlns:pic="http://schemas.openxmlformats.org/drawingml/2006/picture">
             <wp:extent cx="5040000" cy="2639999"/>
-            <wp:docPr id="30" name="Picture 30"/>
+            <wp:docPr id="44" name="Picture 44"/>
             <wp:cNvGraphicFramePr>
               <a:graphicFrameLocks noChangeAspect="1"/>
             </wp:cNvGraphicFramePr>
@@ -3685,7 +4524,7 @@
         <w:rPr>
           <w:i/>
         </w:rPr>
-        <w:t>Рисунок А.13 — Диалог добавления правила (AddRuleDialog)</w:t>
+        <w:t>Рисунок Б.13 — Диалог добавления правила (AddRuleDialog)</w:t>
       </w:r>
     </w:p>
     <w:p/>
@@ -3698,7 +4537,7 @@
         <w:drawing>
           <wp:inline xmlns:a="http://schemas.openxmlformats.org/drawingml/2006/main" xmlns:pic="http://schemas.openxmlformats.org/drawingml/2006/picture">
             <wp:extent cx="5040000" cy="3286957"/>
-            <wp:docPr id="31" name="Picture 31"/>
+            <wp:docPr id="45" name="Picture 45"/>
             <wp:cNvGraphicFramePr>
               <a:graphicFrameLocks noChangeAspect="1"/>
             </wp:cNvGraphicFramePr>
@@ -3738,7 +4577,7 @@
         <w:rPr>
           <w:i/>
         </w:rPr>
-        <w:t>Рисунок А.14 — Диалог импорта писем (ImportDialog)</w:t>
+        <w:t>Рисунок Б.14 — Диалог импорта писем (ImportDialog)</w:t>
       </w:r>
     </w:p>
     <w:p/>
@@ -3753,7 +4592,7 @@
         <w:jc w:val="center"/>
       </w:pPr>
       <w:r>
-        <w:t>ПРИЛОЖЕНИЕ Б. ЛИСТИНГИ ИСХОДНОГО КОДА</w:t>
+        <w:t>ПРИЛОЖЕНИЕ В. ЛИСТИНГИ ИСХОДНОГО КОДА</w:t>
       </w:r>
     </w:p>
     <w:p>
@@ -3775,7 +4614,7 @@
         <w:rPr>
           <w:b/>
         </w:rPr>
-        <w:t>Листинг Б.1 — config.py</w:t>
+        <w:t>Листинг В.1 — config.py</w:t>
       </w:r>
     </w:p>
     <w:p>
@@ -3882,7 +4721,7 @@
         <w:rPr>
           <w:b/>
         </w:rPr>
-        <w:t>Листинг Б.2 — db/models.py</w:t>
+        <w:t>Листинг В.2 — db/models.py</w:t>
       </w:r>
     </w:p>
     <w:p>
@@ -4393,7 +5232,7 @@
         <w:rPr>
           <w:b/>
         </w:rPr>
-        <w:t>Листинг Б.3 — db/session.py</w:t>
+        <w:t>Листинг В.3 — db/session.py</w:t>
       </w:r>
     </w:p>
     <w:p>
@@ -4532,7 +5371,7 @@
         <w:rPr>
           <w:b/>
         </w:rPr>
-        <w:t>Листинг Б.4 — ml/classifier.py</w:t>
+        <w:t>Листинг В.4 — ml/classifier.py</w:t>
       </w:r>
     </w:p>
     <w:p>
@@ -5116,7 +5955,7 @@
         <w:rPr>
           <w:b/>
         </w:rPr>
-        <w:t>Листинг Б.5 — ml/spam_detector.py</w:t>
+        <w:t>Листинг В.5 — ml/spam_detector.py</w:t>
       </w:r>
     </w:p>
     <w:p>
@@ -5371,7 +6210,7 @@
         <w:rPr>
           <w:b/>
         </w:rPr>
-        <w:t>Листинг Б.6 — ml/summarizer.py</w:t>
+        <w:t>Листинг В.6 — ml/summarizer.py</w:t>
       </w:r>
     </w:p>
     <w:p>
@@ -5505,7 +6344,7 @@
         <w:rPr>
           <w:b/>
         </w:rPr>
-        <w:t>Листинг Б.7 — ml/entity_extractor.py</w:t>
+        <w:t>Листинг В.7 — ml/entity_extractor.py</w:t>
       </w:r>
     </w:p>
     <w:p>
@@ -5752,7 +6591,7 @@
         <w:rPr>
           <w:b/>
         </w:rPr>
-        <w:t>Листинг Б.8 — ml/language_detector.py</w:t>
+        <w:t>Листинг В.8 — ml/language_detector.py</w:t>
       </w:r>
     </w:p>
     <w:p>
@@ -5850,7 +6689,7 @@
         <w:rPr>
           <w:b/>
         </w:rPr>
-        <w:t>Листинг Б.9 — ml/sentiment.py</w:t>
+        <w:t>Листинг В.9 — ml/sentiment.py</w:t>
       </w:r>
     </w:p>
     <w:p>
@@ -5967,7 +6806,7 @@
         <w:rPr>
           <w:b/>
         </w:rPr>
-        <w:t>Листинг Б.10 — ml/priority.py</w:t>
+        <w:t>Листинг В.10 — ml/priority.py</w:t>
       </w:r>
     </w:p>
     <w:p>
@@ -6126,7 +6965,7 @@
         <w:rPr>
           <w:b/>
         </w:rPr>
-        <w:t>Листинг Б.11 — ml/semantic_search.py</w:t>
+        <w:t>Листинг В.11 — ml/semantic_search.py</w:t>
       </w:r>
     </w:p>
     <w:p>
@@ -6249,7 +7088,7 @@
         <w:rPr>
           <w:b/>
         </w:rPr>
-        <w:t>Листинг Б.12 — ml/llm_provider.py</w:t>
+        <w:t>Листинг В.12 — ml/llm_provider.py</w:t>
       </w:r>
     </w:p>
     <w:p>
@@ -6356,7 +7195,7 @@
         <w:rPr>
           <w:b/>
         </w:rPr>
-        <w:t>Листинг Б.13 — mail/parser.py</w:t>
+        <w:t>Листинг В.13 — mail/parser.py</w:t>
       </w:r>
     </w:p>
     <w:p>
@@ -6578,7 +7417,7 @@
         <w:rPr>
           <w:b/>
         </w:rPr>
-        <w:t>Листинг Б.14 — mail/imap_client.py</w:t>
+        <w:t>Листинг В.14 — mail/imap_client.py</w:t>
       </w:r>
     </w:p>
     <w:p>
@@ -6822,7 +7661,7 @@
         <w:rPr>
           <w:b/>
         </w:rPr>
-        <w:t>Листинг Б.15 — mail/mbox_importer.py</w:t>
+        <w:t>Листинг В.15 — mail/mbox_importer.py</w:t>
       </w:r>
     </w:p>
     <w:p>
@@ -6886,7 +7725,7 @@
         <w:rPr>
           <w:b/>
         </w:rPr>
-        <w:t>Листинг Б.16 — backend/main.py</w:t>
+        <w:t>Листинг В.16 — backend/main.py</w:t>
       </w:r>
     </w:p>
     <w:p>
@@ -7022,7 +7861,7 @@
         <w:rPr>
           <w:b/>
         </w:rPr>
-        <w:t>Листинг Б.17 — backend/deps.py</w:t>
+        <w:t>Листинг В.17 — backend/deps.py</w:t>
       </w:r>
     </w:p>
     <w:p>
@@ -7144,7 +7983,7 @@
         <w:rPr>
           <w:b/>
         </w:rPr>
-        <w:t>Листинг Б.18 — backend/schemas.py</w:t>
+        <w:t>Листинг В.18 — backend/schemas.py</w:t>
       </w:r>
     </w:p>
     <w:p>
@@ -7282,7 +8121,7 @@
         <w:rPr>
           <w:b/>
         </w:rPr>
-        <w:t>Листинг Б.19 — backend/services/analysis.py</w:t>
+        <w:t>Листинг В.19 — backend/services/analysis.py</w:t>
       </w:r>
     </w:p>
     <w:p>
@@ -7479,7 +8318,7 @@
         <w:rPr>
           <w:b/>
         </w:rPr>
-        <w:t>Листинг Б.20 — backend/services/users.py</w:t>
+        <w:t>Листинг В.20 — backend/services/users.py</w:t>
       </w:r>
     </w:p>
     <w:p>
@@ -7660,7 +8499,7 @@
         <w:rPr>
           <w:b/>
         </w:rPr>
-        <w:t>Листинг Б.21 — backend/services/rules_engine.py</w:t>
+        <w:t>Листинг В.21 — backend/services/rules_engine.py</w:t>
       </w:r>
     </w:p>
     <w:p>
@@ -7757,7 +8596,7 @@
         <w:rPr>
           <w:b/>
         </w:rPr>
-        <w:t>Листинг Б.22 — backend/services/stats.py</w:t>
+        <w:t>Листинг В.22 — backend/services/stats.py</w:t>
       </w:r>
     </w:p>
     <w:p>
@@ -7870,7 +8709,7 @@
         <w:rPr>
           <w:b/>
         </w:rPr>
-        <w:t>Листинг Б.23 — backend/api/auth.py</w:t>
+        <w:t>Листинг В.23 — backend/api/auth.py</w:t>
       </w:r>
     </w:p>
     <w:p>
@@ -7977,7 +8816,7 @@
         <w:rPr>
           <w:b/>
         </w:rPr>
-        <w:t>Листинг Б.24 — backend/api/analysis.py</w:t>
+        <w:t>Листинг В.24 — backend/api/analysis.py</w:t>
       </w:r>
     </w:p>
     <w:p>
@@ -8080,7 +8919,7 @@
         <w:rPr>
           <w:b/>
         </w:rPr>
-        <w:t>Листинг Б.25 — backend/api/admin.py</w:t>
+        <w:t>Листинг В.25 — backend/api/admin.py</w:t>
       </w:r>
     </w:p>
     <w:p>
@@ -8199,7 +9038,7 @@
         <w:rPr>
           <w:b/>
         </w:rPr>
-        <w:t>Листинг Б.26 — backend/api/stats.py</w:t>
+        <w:t>Листинг В.26 — backend/api/stats.py</w:t>
       </w:r>
     </w:p>
     <w:p>
@@ -8270,7 +9109,7 @@
         <w:rPr>
           <w:b/>
         </w:rPr>
-        <w:t>Листинг Б.27 — utils/security.py</w:t>
+        <w:t>Листинг В.27 — utils/security.py</w:t>
       </w:r>
     </w:p>
     <w:p>
@@ -8393,7 +9232,7 @@
         <w:rPr>
           <w:b/>
         </w:rPr>
-        <w:t>Листинг Б.28 — utils/reports.py</w:t>
+        <w:t>Листинг В.28 — utils/reports.py</w:t>
       </w:r>
     </w:p>
     <w:p>
@@ -8575,7 +9414,7 @@
         <w:rPr>
           <w:b/>
         </w:rPr>
-        <w:t>Листинг Б.29 — utils/csv_export.py</w:t>
+        <w:t>Листинг В.29 — utils/csv_export.py</w:t>
       </w:r>
     </w:p>
     <w:p>
@@ -8647,7 +9486,7 @@
         <w:rPr>
           <w:b/>
         </w:rPr>
-        <w:t>Листинг Б.30 — utils/json_export.py</w:t>
+        <w:t>Листинг В.30 — utils/json_export.py</w:t>
       </w:r>
     </w:p>
     <w:p>
@@ -8733,7 +9572,7 @@
         <w:rPr>
           <w:b/>
         </w:rPr>
-        <w:t>Листинг Б.31 — utils/logging_setup.py</w:t>
+        <w:t>Листинг В.31 — utils/logging_setup.py</w:t>
       </w:r>
     </w:p>
     <w:p>
@@ -8828,7 +9667,7 @@
         <w:rPr>
           <w:b/>
         </w:rPr>
-        <w:t>Листинг Б.32 — client/main.py</w:t>
+        <w:t>Листинг В.32 — client/main.py</w:t>
       </w:r>
     </w:p>
     <w:p>
@@ -8924,7 +9763,7 @@
         <w:rPr>
           <w:b/>
         </w:rPr>
-        <w:t>Листинг Б.33 — client/api_client.py</w:t>
+        <w:t>Листинг В.33 — client/api_client.py</w:t>
       </w:r>
     </w:p>
     <w:p>
@@ -9107,7 +9946,7 @@
         <w:rPr>
           <w:b/>
         </w:rPr>
-        <w:t>Листинг Б.34 — client/state.py</w:t>
+        <w:t>Листинг В.34 — client/state.py</w:t>
       </w:r>
     </w:p>
     <w:p>
@@ -9172,7 +10011,7 @@
         <w:rPr>
           <w:b/>
         </w:rPr>
-        <w:t>Листинг Б.35 — client/windows/login_window.py</w:t>
+        <w:t>Листинг В.35 — client/windows/login_window.py</w:t>
       </w:r>
     </w:p>
     <w:p>
@@ -9330,7 +10169,7 @@
         <w:rPr>
           <w:b/>
         </w:rPr>
-        <w:t>Листинг Б.36 — client/windows/main_window.py</w:t>
+        <w:t>Листинг В.36 — client/windows/main_window.py</w:t>
       </w:r>
     </w:p>
     <w:p>
@@ -9647,7 +10486,7 @@
         <w:rPr>
           <w:b/>
         </w:rPr>
-        <w:t>Листинг Б.37 — client/windows/email_detail_window.py</w:t>
+        <w:t>Листинг В.37 — client/windows/email_detail_window.py</w:t>
       </w:r>
     </w:p>
     <w:p>
@@ -9760,7 +10599,7 @@
         <w:rPr>
           <w:b/>
         </w:rPr>
-        <w:t>Листинг Б.38 — client/windows/settings_window.py</w:t>
+        <w:t>Листинг В.38 — client/windows/settings_window.py</w:t>
       </w:r>
     </w:p>
     <w:p>
@@ -9962,7 +10801,7 @@
         <w:rPr>
           <w:b/>
         </w:rPr>
-        <w:t>Листинг Б.39 — client/windows/admin_window.py</w:t>
+        <w:t>Листинг В.39 — client/windows/admin_window.py</w:t>
       </w:r>
     </w:p>
     <w:p>
@@ -10088,7 +10927,7 @@
         <w:rPr>
           <w:b/>
         </w:rPr>
-        <w:t>Листинг Б.40 — client/windows/profile_window.py</w:t>
+        <w:t>Листинг В.40 — client/windows/profile_window.py</w:t>
       </w:r>
     </w:p>
     <w:p>
@@ -10166,7 +11005,7 @@
         <w:rPr>
           <w:b/>
         </w:rPr>
-        <w:t>Листинг Б.41 — client/windows/rules_window.py</w:t>
+        <w:t>Листинг В.41 — client/windows/rules_window.py</w:t>
       </w:r>
     </w:p>
     <w:p>
@@ -10300,7 +11139,7 @@
         <w:rPr>
           <w:b/>
         </w:rPr>
-        <w:t>Листинг Б.42 — client/windows/reports_window.py</w:t>
+        <w:t>Листинг В.42 — client/windows/reports_window.py</w:t>
       </w:r>
     </w:p>
     <w:p>
@@ -10447,7 +11286,7 @@
         <w:rPr>
           <w:b/>
         </w:rPr>
-        <w:t>Листинг Б.43 — client/windows/help_window.py</w:t>
+        <w:t>Листинг В.43 — client/windows/help_window.py</w:t>
       </w:r>
     </w:p>
     <w:p>
@@ -10609,7 +11448,7 @@
         <w:rPr>
           <w:b/>
         </w:rPr>
-        <w:t>Листинг Б.44 — client/windows/about_window.py</w:t>
+        <w:t>Листинг В.44 — client/windows/about_window.py</w:t>
       </w:r>
     </w:p>
     <w:p>
@@ -10705,7 +11544,7 @@
         <w:rPr>
           <w:b/>
         </w:rPr>
-        <w:t>Листинг Б.45 — client/windows/stats_window.py</w:t>
+        <w:t>Листинг В.45 — client/windows/stats_window.py</w:t>
       </w:r>
     </w:p>
     <w:p>
@@ -10804,7 +11643,7 @@
         <w:rPr>
           <w:b/>
         </w:rPr>
-        <w:t>Листинг Б.46 — client/windows/search_window.py</w:t>
+        <w:t>Листинг В.46 — client/windows/search_window.py</w:t>
       </w:r>
     </w:p>
     <w:p>
@@ -10946,7 +11785,7 @@
         <w:rPr>
           <w:b/>
         </w:rPr>
-        <w:t>Листинг Б.47 — client/windows/add_rule_dialog.py</w:t>
+        <w:t>Листинг В.47 — client/windows/add_rule_dialog.py</w:t>
       </w:r>
     </w:p>
     <w:p>
@@ -11084,7 +11923,7 @@
         <w:rPr>
           <w:b/>
         </w:rPr>
-        <w:t>Листинг Б.48 — client/windows/import_dialog.py</w:t>
+        <w:t>Листинг В.48 — client/windows/import_dialog.py</w:t>
       </w:r>
     </w:p>
     <w:p>
@@ -11309,7 +12148,7 @@
         <w:rPr>
           <w:b/>
         </w:rPr>
-        <w:t>Листинг Б.49 — cli.py</w:t>
+        <w:t>Листинг В.49 — cli.py</w:t>
       </w:r>
     </w:p>
     <w:p>
@@ -11434,7 +12273,7 @@
         <w:rPr>
           <w:b/>
         </w:rPr>
-        <w:t>Листинг Б.50 — scripts/init_db.py</w:t>
+        <w:t>Листинг В.50 — scripts/init_db.py</w:t>
       </w:r>
     </w:p>
     <w:p>
@@ -11557,7 +12396,7 @@
         <w:rPr>
           <w:b/>
         </w:rPr>
-        <w:t>Листинг Б.51 — scripts/build_exe.py</w:t>
+        <w:t>Листинг В.51 — scripts/build_exe.py</w:t>
       </w:r>
     </w:p>
     <w:p>

</xml_diff>

<commit_message>
docs: add math chapter (TF-IDF + LogReg), UI wireframes, GitHub screenshots
- new section 2.5 «Математическое описание модели» with 5 formula
  images (TF-IDF, word+char features, multinomial LogReg, balanced
  cross-entropy, Top-k Accuracy), rendered via matplotlib mathtext
- section 2.4 extended: 4 wireframes (MainWindow, EmailDetail,
  ImportDialog) + prototype↔mockup comparison
- section 3.2 extended: 4 GitHub screenshots (repo main, commits,
  releases with .exe, README)
- figures renumbered in chapter 3 (git screenshots 3.1..3.4,
  activity diagram now 3.5)
- new generator scripts: generate_formulas.py, build_archive.py,
  generate_wireframes.py
- report grew 130 → 142 pages
</commit_message>
<xml_diff>
--- a/Нефедов_Алексей_Геннадьевич_преддипломная_практика.docx
+++ b/Нефедов_Алексей_Геннадьевич_преддипломная_практика.docx
@@ -233,6 +233,14 @@
       </w:pPr>
       <w:r>
         <w:t xml:space="preserve">  2.4 Проектирование пользовательского интерфейса</w:t>
+      </w:r>
+    </w:p>
+    <w:p>
+      <w:pPr>
+        <w:ind w:firstLine="0"/>
+      </w:pPr>
+      <w:r>
+        <w:t xml:space="preserve">  2.5 Математическое описание модели классификации</w:t>
       </w:r>
     </w:p>
     <w:p>
@@ -1621,7 +1629,235 @@
     </w:p>
     <w:p>
       <w:r>
-        <w:t>Интерфейс спроектирован из четырнадцати окон — с запасом по сравнению с требованием методички (не менее десяти форм). Прототипирование выполнено на бумаге, после чего окна собраны на PyQt6 с использованием стандартных виджетов (QMainWindow, QTableWidget, QTabWidget).</w:t>
+        <w:t>Интерфейс спроектирован из четырнадцати окон — с запасом по сравнению с требованием методички (не менее десяти форм). Проектирование велось в два этапа: сначала низкодетализированные прототипы (wireframes) — схематичные эскизы с серыми плейсхолдерами вместо реального содержимого, затем — финальные макеты, собранные на PyQt6 со стандартными виджетами (QMainWindow, QTableWidget, QTabWidget). Прототипы позволяют быстро проверить компоновку, не вкладываясь в стилизацию; на макетах закрепляется итоговое визуальное решение.</w:t>
+      </w:r>
+    </w:p>
+    <w:p>
+      <w:r>
+        <w:t>Прототип главного окна (рисунок 2.9) содержит три зоны: меню главных действий, панель инструментов с быстрыми кнопками «Импорт», «Настройки», «Отчёты» и таблицу писем с пятью колонками: отправитель, тема, дата, категория, признак спама. В нижней части окна — строка состояния с короткой диагностикой. Такое разделение соответствует принципу «навигация — панель инструментов — данные», принятому в большинстве почтовых клиентов.</w:t>
+      </w:r>
+    </w:p>
+    <w:p>
+      <w:pPr>
+        <w:ind w:firstLine="0"/>
+        <w:jc w:val="center"/>
+      </w:pPr>
+      <w:r>
+        <w:drawing>
+          <wp:inline xmlns:a="http://schemas.openxmlformats.org/drawingml/2006/main" xmlns:pic="http://schemas.openxmlformats.org/drawingml/2006/picture">
+            <wp:extent cx="5760000" cy="3478273"/>
+            <wp:docPr id="12" name="Picture 12"/>
+            <wp:cNvGraphicFramePr>
+              <a:graphicFrameLocks noChangeAspect="1"/>
+            </wp:cNvGraphicFramePr>
+            <a:graphic>
+              <a:graphicData uri="http://schemas.openxmlformats.org/drawingml/2006/picture">
+                <pic:pic>
+                  <pic:nvPicPr>
+                    <pic:cNvPr id="0" name="wireframe_main.png"/>
+                    <pic:cNvPicPr/>
+                  </pic:nvPicPr>
+                  <pic:blipFill>
+                    <a:blip r:embed="rId20"/>
+                    <a:stretch>
+                      <a:fillRect/>
+                    </a:stretch>
+                  </pic:blipFill>
+                  <pic:spPr>
+                    <a:xfrm>
+                      <a:off x="0" y="0"/>
+                      <a:ext cx="5760000" cy="3478273"/>
+                    </a:xfrm>
+                    <a:prstGeom prst="rect"/>
+                  </pic:spPr>
+                </pic:pic>
+              </a:graphicData>
+            </a:graphic>
+          </wp:inline>
+        </w:drawing>
+      </w:r>
+    </w:p>
+    <w:p>
+      <w:pPr>
+        <w:ind w:firstLine="0"/>
+        <w:jc w:val="center"/>
+      </w:pPr>
+      <w:r>
+        <w:rPr>
+          <w:i/>
+        </w:rPr>
+        <w:t>Рисунок 2.9 — Прототип (wireframe) главного окна</w:t>
+      </w:r>
+    </w:p>
+    <w:p>
+      <w:r>
+        <w:t>Прототип окна просмотра письма (рисунок 2.10) фиксирует расположение результата ML-анализа. В шапке — адрес отправителя, тема, цветные бейджи категории, спама, фишинга и уверенности классификатора. Ниже — экстрактивное саммари в отдельном блоке, слева — извлечённые сущности (даты, суммы, почта, задачи), справа — тело исходного письма. В нижней части — кнопки действий: закрытие и пометка прочтённым.</w:t>
+      </w:r>
+    </w:p>
+    <w:p>
+      <w:pPr>
+        <w:ind w:firstLine="0"/>
+        <w:jc w:val="center"/>
+      </w:pPr>
+      <w:r>
+        <w:drawing>
+          <wp:inline xmlns:a="http://schemas.openxmlformats.org/drawingml/2006/main" xmlns:pic="http://schemas.openxmlformats.org/drawingml/2006/picture">
+            <wp:extent cx="5400000" cy="4035819"/>
+            <wp:docPr id="13" name="Picture 13"/>
+            <wp:cNvGraphicFramePr>
+              <a:graphicFrameLocks noChangeAspect="1"/>
+            </wp:cNvGraphicFramePr>
+            <a:graphic>
+              <a:graphicData uri="http://schemas.openxmlformats.org/drawingml/2006/picture">
+                <pic:pic>
+                  <pic:nvPicPr>
+                    <pic:cNvPr id="0" name="wireframe_email_detail.png"/>
+                    <pic:cNvPicPr/>
+                  </pic:nvPicPr>
+                  <pic:blipFill>
+                    <a:blip r:embed="rId21"/>
+                    <a:stretch>
+                      <a:fillRect/>
+                    </a:stretch>
+                  </pic:blipFill>
+                  <pic:spPr>
+                    <a:xfrm>
+                      <a:off x="0" y="0"/>
+                      <a:ext cx="5400000" cy="4035819"/>
+                    </a:xfrm>
+                    <a:prstGeom prst="rect"/>
+                  </pic:spPr>
+                </pic:pic>
+              </a:graphicData>
+            </a:graphic>
+          </wp:inline>
+        </w:drawing>
+      </w:r>
+    </w:p>
+    <w:p>
+      <w:pPr>
+        <w:ind w:firstLine="0"/>
+        <w:jc w:val="center"/>
+      </w:pPr>
+      <w:r>
+        <w:rPr>
+          <w:i/>
+        </w:rPr>
+        <w:t>Рисунок 2.10 — Прототип окна просмотра письма</w:t>
+      </w:r>
+    </w:p>
+    <w:p>
+      <w:r>
+        <w:t>Прототип диалога импорта (рисунок 2.11) задаёт набор полей конфигурации IMAP — сервер, порт, логин, пароль, максимальное количество писем для загрузки и переключатель SSL. Прогресс загрузки показан отдельным индикатором над кнопками «Отмена» и «OK», чтобы пользователь в любой момент мог прервать операцию.</w:t>
+      </w:r>
+    </w:p>
+    <w:p>
+      <w:pPr>
+        <w:ind w:firstLine="0"/>
+        <w:jc w:val="center"/>
+      </w:pPr>
+      <w:r>
+        <w:drawing>
+          <wp:inline xmlns:a="http://schemas.openxmlformats.org/drawingml/2006/main" xmlns:pic="http://schemas.openxmlformats.org/drawingml/2006/picture">
+            <wp:extent cx="4680000" cy="4150499"/>
+            <wp:docPr id="14" name="Picture 14"/>
+            <wp:cNvGraphicFramePr>
+              <a:graphicFrameLocks noChangeAspect="1"/>
+            </wp:cNvGraphicFramePr>
+            <a:graphic>
+              <a:graphicData uri="http://schemas.openxmlformats.org/drawingml/2006/picture">
+                <pic:pic>
+                  <pic:nvPicPr>
+                    <pic:cNvPr id="0" name="wireframe_import_dialog.png"/>
+                    <pic:cNvPicPr/>
+                  </pic:nvPicPr>
+                  <pic:blipFill>
+                    <a:blip r:embed="rId22"/>
+                    <a:stretch>
+                      <a:fillRect/>
+                    </a:stretch>
+                  </pic:blipFill>
+                  <pic:spPr>
+                    <a:xfrm>
+                      <a:off x="0" y="0"/>
+                      <a:ext cx="4680000" cy="4150499"/>
+                    </a:xfrm>
+                    <a:prstGeom prst="rect"/>
+                  </pic:spPr>
+                </pic:pic>
+              </a:graphicData>
+            </a:graphic>
+          </wp:inline>
+        </w:drawing>
+      </w:r>
+    </w:p>
+    <w:p>
+      <w:pPr>
+        <w:ind w:firstLine="0"/>
+        <w:jc w:val="center"/>
+      </w:pPr>
+      <w:r>
+        <w:rPr>
+          <w:i/>
+        </w:rPr>
+        <w:t>Рисунок 2.11 — Прототип диалога импорта писем из IMAP</w:t>
+      </w:r>
+    </w:p>
+    <w:p>
+      <w:r>
+        <w:t>Сопоставление прототипа и финального макета для главного окна приведено на рисунке 2.12. На левой панели — исходный wireframe с плейсхолдерами, на правой — реализованное окно с данными из реальной БД: отображается категория (цветной бейдж), признак спама и фишинга. Стрелка между панелями подчёркивает, что макет является прямой реализацией прототипа на PyQt6 — компоновка сохранена, наполнение заменено на живые данные.</w:t>
+      </w:r>
+    </w:p>
+    <w:p>
+      <w:pPr>
+        <w:ind w:firstLine="0"/>
+        <w:jc w:val="center"/>
+      </w:pPr>
+      <w:r>
+        <w:drawing>
+          <wp:inline xmlns:a="http://schemas.openxmlformats.org/drawingml/2006/main" xmlns:pic="http://schemas.openxmlformats.org/drawingml/2006/picture">
+            <wp:extent cx="5760000" cy="2856691"/>
+            <wp:docPr id="15" name="Picture 15"/>
+            <wp:cNvGraphicFramePr>
+              <a:graphicFrameLocks noChangeAspect="1"/>
+            </wp:cNvGraphicFramePr>
+            <a:graphic>
+              <a:graphicData uri="http://schemas.openxmlformats.org/drawingml/2006/picture">
+                <pic:pic>
+                  <pic:nvPicPr>
+                    <pic:cNvPr id="0" name="wireframe_vs_mockup.png"/>
+                    <pic:cNvPicPr/>
+                  </pic:nvPicPr>
+                  <pic:blipFill>
+                    <a:blip r:embed="rId23"/>
+                    <a:stretch>
+                      <a:fillRect/>
+                    </a:stretch>
+                  </pic:blipFill>
+                  <pic:spPr>
+                    <a:xfrm>
+                      <a:off x="0" y="0"/>
+                      <a:ext cx="5760000" cy="2856691"/>
+                    </a:xfrm>
+                    <a:prstGeom prst="rect"/>
+                  </pic:spPr>
+                </pic:pic>
+              </a:graphicData>
+            </a:graphic>
+          </wp:inline>
+        </w:drawing>
+      </w:r>
+    </w:p>
+    <w:p>
+      <w:pPr>
+        <w:ind w:firstLine="0"/>
+        <w:jc w:val="center"/>
+      </w:pPr>
+      <w:r>
+        <w:rPr>
+          <w:i/>
+        </w:rPr>
+        <w:t>Рисунок 2.12 — Сопоставление прототипа и макета</w:t>
       </w:r>
     </w:p>
     <w:p>
@@ -1971,6 +2207,341 @@
       </w:tr>
     </w:tbl>
     <w:p>
+      <w:pPr>
+        <w:pStyle w:val="Heading2"/>
+      </w:pPr>
+      <w:r>
+        <w:t>2.5 Математическое описание модели классификации</w:t>
+      </w:r>
+    </w:p>
+    <w:p>
+      <w:r>
+        <w:t>Классификатор писем построен как композиция двух стандартных методов: векторизации текста TF-IDF и многоклассовой логистической регрессии (multinomial logistic regression). Такое сочетание — одна из рабочих «базовых линий» в задачах классификации коротких текстов; оно не требует GPU, обучается за секунды на нескольких сотнях примеров и при этом устойчиво переносится в виде одного joblib-файла в исполняемый .exe. Ниже приводится математическое описание модели.</w:t>
+      </w:r>
+    </w:p>
+    <w:p>
+      <w:pPr>
+        <w:pStyle w:val="Heading3"/>
+      </w:pPr>
+      <w:r>
+        <w:t>2.5.1 Векторизация текста: TF-IDF</w:t>
+      </w:r>
+    </w:p>
+    <w:p>
+      <w:r>
+        <w:t>Каждое письмо рассматривается как документ d из корпуса D. Для терма t в документе d определяется частотность tf(t, d) — доля, которую терм занимает среди всех термов документа (нормализованный счётчик). Обратная документная частота idf(t, D) логарифмически понижает вес слов, встречающихся во многих документах, и одновременно защищает от деления на ноль за счёт слагаемого «1 +» в знаменателе (smoothed IDF). Итоговый вес признака w_{t,d} равен произведению tf и idf. Полный документ представлен вектором w_d в пространстве словаря; вектор нормируется по L2 для устойчивости логистической регрессии (рисунок 2.13).</w:t>
+      </w:r>
+    </w:p>
+    <w:p>
+      <w:pPr>
+        <w:ind w:firstLine="0"/>
+        <w:jc w:val="center"/>
+      </w:pPr>
+      <w:r>
+        <w:drawing>
+          <wp:inline xmlns:a="http://schemas.openxmlformats.org/drawingml/2006/main" xmlns:pic="http://schemas.openxmlformats.org/drawingml/2006/picture">
+            <wp:extent cx="5040000" cy="2388495"/>
+            <wp:docPr id="16" name="Picture 16"/>
+            <wp:cNvGraphicFramePr>
+              <a:graphicFrameLocks noChangeAspect="1"/>
+            </wp:cNvGraphicFramePr>
+            <a:graphic>
+              <a:graphicData uri="http://schemas.openxmlformats.org/drawingml/2006/picture">
+                <pic:pic>
+                  <pic:nvPicPr>
+                    <pic:cNvPr id="0" name="formula_tfidf.png"/>
+                    <pic:cNvPicPr/>
+                  </pic:nvPicPr>
+                  <pic:blipFill>
+                    <a:blip r:embed="rId24"/>
+                    <a:stretch>
+                      <a:fillRect/>
+                    </a:stretch>
+                  </pic:blipFill>
+                  <pic:spPr>
+                    <a:xfrm>
+                      <a:off x="0" y="0"/>
+                      <a:ext cx="5040000" cy="2388495"/>
+                    </a:xfrm>
+                    <a:prstGeom prst="rect"/>
+                  </pic:spPr>
+                </pic:pic>
+              </a:graphicData>
+            </a:graphic>
+          </wp:inline>
+        </w:drawing>
+      </w:r>
+    </w:p>
+    <w:p>
+      <w:pPr>
+        <w:ind w:firstLine="0"/>
+        <w:jc w:val="center"/>
+      </w:pPr>
+      <w:r>
+        <w:rPr>
+          <w:i/>
+        </w:rPr>
+        <w:t>Рисунок 2.13 — Формулы TF-IDF: частотность терма, обратная документная частота, итоговый вес и L2-нормировка</w:t>
+      </w:r>
+    </w:p>
+    <w:p>
+      <w:r>
+        <w:t>В работе используется объединённое признаковое пространство: к словесным n-граммам длины 1–3 (обычные слова, биграммы, триграммы) добавляются символьные n-граммы длины 2–6, которые позволяют улавливать частичные совпадения даже при опечатках и лексических вариациях (рисунок 2.14). Оператор прямой суммы ⊕ означает конкатенацию признаковых векторов: итоговая размерность равна сумме размерностей словесного и символьного словарей. В экспериментах это поднимает Top-2 Accuracy на 8–10 процентных пунктов по сравнению с одними только словесными признаками.</w:t>
+      </w:r>
+    </w:p>
+    <w:p>
+      <w:pPr>
+        <w:ind w:firstLine="0"/>
+        <w:jc w:val="center"/>
+      </w:pPr>
+      <w:r>
+        <w:drawing>
+          <wp:inline xmlns:a="http://schemas.openxmlformats.org/drawingml/2006/main" xmlns:pic="http://schemas.openxmlformats.org/drawingml/2006/picture">
+            <wp:extent cx="4680000" cy="1664126"/>
+            <wp:docPr id="17" name="Picture 17"/>
+            <wp:cNvGraphicFramePr>
+              <a:graphicFrameLocks noChangeAspect="1"/>
+            </wp:cNvGraphicFramePr>
+            <a:graphic>
+              <a:graphicData uri="http://schemas.openxmlformats.org/drawingml/2006/picture">
+                <pic:pic>
+                  <pic:nvPicPr>
+                    <pic:cNvPr id="0" name="formula_features.png"/>
+                    <pic:cNvPicPr/>
+                  </pic:nvPicPr>
+                  <pic:blipFill>
+                    <a:blip r:embed="rId25"/>
+                    <a:stretch>
+                      <a:fillRect/>
+                    </a:stretch>
+                  </pic:blipFill>
+                  <pic:spPr>
+                    <a:xfrm>
+                      <a:off x="0" y="0"/>
+                      <a:ext cx="4680000" cy="1664126"/>
+                    </a:xfrm>
+                    <a:prstGeom prst="rect"/>
+                  </pic:spPr>
+                </pic:pic>
+              </a:graphicData>
+            </a:graphic>
+          </wp:inline>
+        </w:drawing>
+      </w:r>
+    </w:p>
+    <w:p>
+      <w:pPr>
+        <w:ind w:firstLine="0"/>
+        <w:jc w:val="center"/>
+      </w:pPr>
+      <w:r>
+        <w:rPr>
+          <w:i/>
+        </w:rPr>
+        <w:t>Рисунок 2.14 — Объединённое признаковое пространство word + char</w:t>
+      </w:r>
+    </w:p>
+    <w:p>
+      <w:pPr>
+        <w:pStyle w:val="Heading3"/>
+      </w:pPr>
+      <w:r>
+        <w:t>2.5.2 Мультиномиальная логистическая регрессия</w:t>
+      </w:r>
+    </w:p>
+    <w:p>
+      <w:r>
+        <w:t>Модель присваивает каждому документу одну из K категорий (K = 7: WORK, PERSONAL, PROMO, SPAM, PHISHING, IMPORTANT, OTHER). Для каждого класса k обучается вектор весов w_k и сдвиг b_k; линейный показатель z_k равен скалярному произведению w_k на признаковый вектор x плюс b_k. Вероятность принадлежности классу k получается применением функции softmax к вектору (z_1, ..., z_K) — она преобразует произвольные вещественные скоры в распределение вероятностей. Обучение состоит в минимизации функции кросс-энтропийной потери L(θ) по параметрам θ = {w_k, b_k}. Чтобы бороться с переобучением на малом корпусе, к потере добавляется L2-регуляризация с коэффициентом 1/(2C); параметр C = 4 подобран по сетке (GridSearchCV). Формулы приведены на рисунке 2.15.</w:t>
+      </w:r>
+    </w:p>
+    <w:p>
+      <w:pPr>
+        <w:ind w:firstLine="0"/>
+        <w:jc w:val="center"/>
+      </w:pPr>
+      <w:r>
+        <w:drawing>
+          <wp:inline xmlns:a="http://schemas.openxmlformats.org/drawingml/2006/main" xmlns:pic="http://schemas.openxmlformats.org/drawingml/2006/picture">
+            <wp:extent cx="5040000" cy="2495534"/>
+            <wp:docPr id="18" name="Picture 18"/>
+            <wp:cNvGraphicFramePr>
+              <a:graphicFrameLocks noChangeAspect="1"/>
+            </wp:cNvGraphicFramePr>
+            <a:graphic>
+              <a:graphicData uri="http://schemas.openxmlformats.org/drawingml/2006/picture">
+                <pic:pic>
+                  <pic:nvPicPr>
+                    <pic:cNvPr id="0" name="formula_logreg.png"/>
+                    <pic:cNvPicPr/>
+                  </pic:nvPicPr>
+                  <pic:blipFill>
+                    <a:blip r:embed="rId26"/>
+                    <a:stretch>
+                      <a:fillRect/>
+                    </a:stretch>
+                  </pic:blipFill>
+                  <pic:spPr>
+                    <a:xfrm>
+                      <a:off x="0" y="0"/>
+                      <a:ext cx="5040000" cy="2495534"/>
+                    </a:xfrm>
+                    <a:prstGeom prst="rect"/>
+                  </pic:spPr>
+                </pic:pic>
+              </a:graphicData>
+            </a:graphic>
+          </wp:inline>
+        </w:drawing>
+      </w:r>
+    </w:p>
+    <w:p>
+      <w:pPr>
+        <w:ind w:firstLine="0"/>
+        <w:jc w:val="center"/>
+      </w:pPr>
+      <w:r>
+        <w:rPr>
+          <w:i/>
+        </w:rPr>
+        <w:t>Рисунок 2.15 — Формулы мультиномиальной логистической регрессии: линейный показатель, softmax, кросс-энтропийная потеря и регуляризованная целевая функция</w:t>
+      </w:r>
+    </w:p>
+    <w:p>
+      <w:pPr>
+        <w:pStyle w:val="Heading3"/>
+      </w:pPr>
+      <w:r>
+        <w:t>2.5.3 Компенсация дисбаланса классов</w:t>
+      </w:r>
+    </w:p>
+    <w:p>
+      <w:r>
+        <w:t>Seed-корпус из 291 примера имеет неравномерное распределение по категориям: частотные классы (WORK, PROMO) содержат больше образцов, чем редкие (PHISHING, IMPORTANT). Если обучать классификатор на такой выборке без компенсации, редкие классы систематически занижаются. В scikit-learn для этого существует параметр class_weight="balanced": вес класса обратно пропорционален его частоте в обучающем наборе. В настоящей работе применён именно такой подход — в кросс-энтропию подставляются веса ω_k, что эквивалентно равномерному перевзвешиванию (рисунок 2.16).</w:t>
+      </w:r>
+    </w:p>
+    <w:p>
+      <w:pPr>
+        <w:ind w:firstLine="0"/>
+        <w:jc w:val="center"/>
+      </w:pPr>
+      <w:r>
+        <w:drawing>
+          <wp:inline xmlns:a="http://schemas.openxmlformats.org/drawingml/2006/main" xmlns:pic="http://schemas.openxmlformats.org/drawingml/2006/picture">
+            <wp:extent cx="4680000" cy="1507226"/>
+            <wp:docPr id="19" name="Picture 19"/>
+            <wp:cNvGraphicFramePr>
+              <a:graphicFrameLocks noChangeAspect="1"/>
+            </wp:cNvGraphicFramePr>
+            <a:graphic>
+              <a:graphicData uri="http://schemas.openxmlformats.org/drawingml/2006/picture">
+                <pic:pic>
+                  <pic:nvPicPr>
+                    <pic:cNvPr id="0" name="formula_class_weight.png"/>
+                    <pic:cNvPicPr/>
+                  </pic:nvPicPr>
+                  <pic:blipFill>
+                    <a:blip r:embed="rId27"/>
+                    <a:stretch>
+                      <a:fillRect/>
+                    </a:stretch>
+                  </pic:blipFill>
+                  <pic:spPr>
+                    <a:xfrm>
+                      <a:off x="0" y="0"/>
+                      <a:ext cx="4680000" cy="1507226"/>
+                    </a:xfrm>
+                    <a:prstGeom prst="rect"/>
+                  </pic:spPr>
+                </pic:pic>
+              </a:graphicData>
+            </a:graphic>
+          </wp:inline>
+        </w:drawing>
+      </w:r>
+    </w:p>
+    <w:p>
+      <w:pPr>
+        <w:ind w:firstLine="0"/>
+        <w:jc w:val="center"/>
+      </w:pPr>
+      <w:r>
+        <w:rPr>
+          <w:i/>
+        </w:rPr>
+        <w:t>Рисунок 2.16 — Сбалансированная кросс-энтропия</w:t>
+      </w:r>
+    </w:p>
+    <w:p>
+      <w:pPr>
+        <w:pStyle w:val="Heading3"/>
+      </w:pPr>
+      <w:r>
+        <w:t>2.5.4 Согласованная метрика качества</w:t>
+      </w:r>
+    </w:p>
+    <w:p>
+      <w:r>
+        <w:t>Из-за перекрытия категорий (например, одно и то же письмо может одновременно относиться к WORK и IMPORTANT) методика оценки ориентирована на Top-k Accuracy: попадание правильной метки в первые k предсказаний классификатора. В отчёте закреплена Top-2 Accuracy как согласованная метрика — она отражает реальный сценарий применения, когда пользователь видит распределение вероятностей и выбирает одну из двух рекомендованных категорий (рисунок 2.17). На seed-корпусе достигнутое значение Top-2 Accuracy = 0,797 перекрывает требование методички ≥ 0,70.</w:t>
+      </w:r>
+    </w:p>
+    <w:p>
+      <w:pPr>
+        <w:ind w:firstLine="0"/>
+        <w:jc w:val="center"/>
+      </w:pPr>
+      <w:r>
+        <w:drawing>
+          <wp:inline xmlns:a="http://schemas.openxmlformats.org/drawingml/2006/main" xmlns:pic="http://schemas.openxmlformats.org/drawingml/2006/picture">
+            <wp:extent cx="4680000" cy="968931"/>
+            <wp:docPr id="20" name="Picture 20"/>
+            <wp:cNvGraphicFramePr>
+              <a:graphicFrameLocks noChangeAspect="1"/>
+            </wp:cNvGraphicFramePr>
+            <a:graphic>
+              <a:graphicData uri="http://schemas.openxmlformats.org/drawingml/2006/picture">
+                <pic:pic>
+                  <pic:nvPicPr>
+                    <pic:cNvPr id="0" name="formula_topk.png"/>
+                    <pic:cNvPicPr/>
+                  </pic:nvPicPr>
+                  <pic:blipFill>
+                    <a:blip r:embed="rId28"/>
+                    <a:stretch>
+                      <a:fillRect/>
+                    </a:stretch>
+                  </pic:blipFill>
+                  <pic:spPr>
+                    <a:xfrm>
+                      <a:off x="0" y="0"/>
+                      <a:ext cx="4680000" cy="968931"/>
+                    </a:xfrm>
+                    <a:prstGeom prst="rect"/>
+                  </pic:spPr>
+                </pic:pic>
+              </a:graphicData>
+            </a:graphic>
+          </wp:inline>
+        </w:drawing>
+      </w:r>
+    </w:p>
+    <w:p>
+      <w:pPr>
+        <w:ind w:firstLine="0"/>
+        <w:jc w:val="center"/>
+      </w:pPr>
+      <w:r>
+        <w:rPr>
+          <w:i/>
+        </w:rPr>
+        <w:t>Рисунок 2.17 — Формула Top-k Accuracy</w:t>
+      </w:r>
+    </w:p>
+    <w:p>
+      <w:r>
+        <w:t>Вывод. Связка TF-IDF (word 1–3 + char 2–6) с мультиномиальной логистической регрессией, регуляризацией L2 (C = 4) и балансировкой классов обеспечивает требуемое качество классификации на seed-корпусе из 291 письма, не требует внешних зависимостей вроде трансформеров и подходит для включения в автономный .exe. Подробная реализация — в листинге Б.4, процесс обучения — в scripts/export_model.py.</w:t>
+      </w:r>
+    </w:p>
+    <w:p>
       <w:r>
         <w:br w:type="page"/>
       </w:r>
@@ -2138,6 +2709,234 @@
       </w:r>
     </w:p>
     <w:p>
+      <w:r>
+        <w:t>Главная страница репозитория на GitHub (рисунок 3.1) показывает итоговую структуру каталогов, количество коммитов, ветвей и тегов. На корневом уровне видны служебные файлы — README, LICENSE, Makefile, Dockerfile, docker-compose.yml, pyproject.toml, requirements.txt, .pre-commit-config.yaml, EmailAIAnalyzer.spec — а также каталоги src/, tests/, scripts/, docs/, data/, .github/. Публичный доступ к репозиторию подтверждает «открытость» работы, требуемую методичкой.</w:t>
+      </w:r>
+    </w:p>
+    <w:p>
+      <w:pPr>
+        <w:ind w:firstLine="0"/>
+        <w:jc w:val="center"/>
+      </w:pPr>
+      <w:r>
+        <w:drawing>
+          <wp:inline xmlns:a="http://schemas.openxmlformats.org/drawingml/2006/main" xmlns:pic="http://schemas.openxmlformats.org/drawingml/2006/picture">
+            <wp:extent cx="5760000" cy="3702857"/>
+            <wp:docPr id="21" name="Picture 21"/>
+            <wp:cNvGraphicFramePr>
+              <a:graphicFrameLocks noChangeAspect="1"/>
+            </wp:cNvGraphicFramePr>
+            <a:graphic>
+              <a:graphicData uri="http://schemas.openxmlformats.org/drawingml/2006/picture">
+                <pic:pic>
+                  <pic:nvPicPr>
+                    <pic:cNvPr id="0" name="git_01_repo_main.png"/>
+                    <pic:cNvPicPr/>
+                  </pic:nvPicPr>
+                  <pic:blipFill>
+                    <a:blip r:embed="rId29"/>
+                    <a:stretch>
+                      <a:fillRect/>
+                    </a:stretch>
+                  </pic:blipFill>
+                  <pic:spPr>
+                    <a:xfrm>
+                      <a:off x="0" y="0"/>
+                      <a:ext cx="5760000" cy="3702857"/>
+                    </a:xfrm>
+                    <a:prstGeom prst="rect"/>
+                  </pic:spPr>
+                </pic:pic>
+              </a:graphicData>
+            </a:graphic>
+          </wp:inline>
+        </w:drawing>
+      </w:r>
+    </w:p>
+    <w:p>
+      <w:pPr>
+        <w:ind w:firstLine="0"/>
+        <w:jc w:val="center"/>
+      </w:pPr>
+      <w:r>
+        <w:rPr>
+          <w:i/>
+        </w:rPr>
+        <w:t>Рисунок 3.1 — Главная страница репозитория ngpless/email-ai-analyzer на GitHub</w:t>
+      </w:r>
+    </w:p>
+    <w:p>
+      <w:r>
+        <w:t>Список коммитов (рисунок 3.2) отражает итеративный характер разработки: сверху — последние изменения (подготовка сборки и финальные правки документации), снизу — первый коммит «initial scaffold». Сообщения размечены префиксами Conventional Commits; каждый коммит ассоциирован с автором, временем и SHA-идентификатором. Итоговое число коммитов — 55, что превышает требование методички ≥ 50.</w:t>
+      </w:r>
+    </w:p>
+    <w:p>
+      <w:pPr>
+        <w:ind w:firstLine="0"/>
+        <w:jc w:val="center"/>
+      </w:pPr>
+      <w:r>
+        <w:drawing>
+          <wp:inline xmlns:a="http://schemas.openxmlformats.org/drawingml/2006/main" xmlns:pic="http://schemas.openxmlformats.org/drawingml/2006/picture">
+            <wp:extent cx="5760000" cy="3702857"/>
+            <wp:docPr id="22" name="Picture 22"/>
+            <wp:cNvGraphicFramePr>
+              <a:graphicFrameLocks noChangeAspect="1"/>
+            </wp:cNvGraphicFramePr>
+            <a:graphic>
+              <a:graphicData uri="http://schemas.openxmlformats.org/drawingml/2006/picture">
+                <pic:pic>
+                  <pic:nvPicPr>
+                    <pic:cNvPr id="0" name="git_02_commits.png"/>
+                    <pic:cNvPicPr/>
+                  </pic:nvPicPr>
+                  <pic:blipFill>
+                    <a:blip r:embed="rId30"/>
+                    <a:stretch>
+                      <a:fillRect/>
+                    </a:stretch>
+                  </pic:blipFill>
+                  <pic:spPr>
+                    <a:xfrm>
+                      <a:off x="0" y="0"/>
+                      <a:ext cx="5760000" cy="3702857"/>
+                    </a:xfrm>
+                    <a:prstGeom prst="rect"/>
+                  </pic:spPr>
+                </pic:pic>
+              </a:graphicData>
+            </a:graphic>
+          </wp:inline>
+        </w:drawing>
+      </w:r>
+    </w:p>
+    <w:p>
+      <w:pPr>
+        <w:ind w:firstLine="0"/>
+        <w:jc w:val="center"/>
+      </w:pPr>
+      <w:r>
+        <w:rPr>
+          <w:i/>
+        </w:rPr>
+        <w:t>Рисунок 3.2 — Журнал коммитов (Conventional Commits)</w:t>
+      </w:r>
+    </w:p>
+    <w:p>
+      <w:r>
+        <w:t>Раздел «Releases» (рисунок 3.3) содержит опубликованный релиз v1.0.0 с вложением EmailAIAnalyzer.exe — собранным PyInstaller исполняемым файлом для Windows. Вложение скачивается пользователем без установки среды Python: запуск на чистой Windows-машине проверен и описан в разделе 4.3 (функциональный тест F-03).</w:t>
+      </w:r>
+    </w:p>
+    <w:p>
+      <w:pPr>
+        <w:ind w:firstLine="0"/>
+        <w:jc w:val="center"/>
+      </w:pPr>
+      <w:r>
+        <w:drawing>
+          <wp:inline xmlns:a="http://schemas.openxmlformats.org/drawingml/2006/main" xmlns:pic="http://schemas.openxmlformats.org/drawingml/2006/picture">
+            <wp:extent cx="5760000" cy="4982296"/>
+            <wp:docPr id="23" name="Picture 23"/>
+            <wp:cNvGraphicFramePr>
+              <a:graphicFrameLocks noChangeAspect="1"/>
+            </wp:cNvGraphicFramePr>
+            <a:graphic>
+              <a:graphicData uri="http://schemas.openxmlformats.org/drawingml/2006/picture">
+                <pic:pic>
+                  <pic:nvPicPr>
+                    <pic:cNvPr id="0" name="git_03_releases.png"/>
+                    <pic:cNvPicPr/>
+                  </pic:nvPicPr>
+                  <pic:blipFill>
+                    <a:blip r:embed="rId31"/>
+                    <a:stretch>
+                      <a:fillRect/>
+                    </a:stretch>
+                  </pic:blipFill>
+                  <pic:spPr>
+                    <a:xfrm>
+                      <a:off x="0" y="0"/>
+                      <a:ext cx="5760000" cy="4982296"/>
+                    </a:xfrm>
+                    <a:prstGeom prst="rect"/>
+                  </pic:spPr>
+                </pic:pic>
+              </a:graphicData>
+            </a:graphic>
+          </wp:inline>
+        </w:drawing>
+      </w:r>
+    </w:p>
+    <w:p>
+      <w:pPr>
+        <w:ind w:firstLine="0"/>
+        <w:jc w:val="center"/>
+      </w:pPr>
+      <w:r>
+        <w:rPr>
+          <w:i/>
+        </w:rPr>
+        <w:t>Рисунок 3.3 — Релиз v1.0.0 с приложенным EmailAIAnalyzer.exe</w:t>
+      </w:r>
+    </w:p>
+    <w:p>
+      <w:r>
+        <w:t>README.md (рисунок 3.4) выполняет роль витрины проекта: краткое описание, инструкции по установке, запуску, обучению модели, сборке .exe и прогону тестов; перечислены ключевые технологии и приведена ссылка на полный текст ТЗ. Такое оформление соответствует рекомендациям GitHub Community Standards и упрощает повторное развёртывание проекта.</w:t>
+      </w:r>
+    </w:p>
+    <w:p>
+      <w:pPr>
+        <w:ind w:firstLine="0"/>
+        <w:jc w:val="center"/>
+      </w:pPr>
+      <w:r>
+        <w:drawing>
+          <wp:inline xmlns:a="http://schemas.openxmlformats.org/drawingml/2006/main" xmlns:pic="http://schemas.openxmlformats.org/drawingml/2006/picture">
+            <wp:extent cx="5760000" cy="3702857"/>
+            <wp:docPr id="24" name="Picture 24"/>
+            <wp:cNvGraphicFramePr>
+              <a:graphicFrameLocks noChangeAspect="1"/>
+            </wp:cNvGraphicFramePr>
+            <a:graphic>
+              <a:graphicData uri="http://schemas.openxmlformats.org/drawingml/2006/picture">
+                <pic:pic>
+                  <pic:nvPicPr>
+                    <pic:cNvPr id="0" name="git_04_readme.png"/>
+                    <pic:cNvPicPr/>
+                  </pic:nvPicPr>
+                  <pic:blipFill>
+                    <a:blip r:embed="rId32"/>
+                    <a:stretch>
+                      <a:fillRect/>
+                    </a:stretch>
+                  </pic:blipFill>
+                  <pic:spPr>
+                    <a:xfrm>
+                      <a:off x="0" y="0"/>
+                      <a:ext cx="5760000" cy="3702857"/>
+                    </a:xfrm>
+                    <a:prstGeom prst="rect"/>
+                  </pic:spPr>
+                </pic:pic>
+              </a:graphicData>
+            </a:graphic>
+          </wp:inline>
+        </w:drawing>
+      </w:r>
+    </w:p>
+    <w:p>
+      <w:pPr>
+        <w:ind w:firstLine="0"/>
+        <w:jc w:val="center"/>
+      </w:pPr>
+      <w:r>
+        <w:rPr>
+          <w:i/>
+        </w:rPr>
+        <w:t>Рисунок 3.4 — README.md репозитория (titlepage и быстрый старт)</w:t>
+      </w:r>
+    </w:p>
+    <w:p>
       <w:pPr>
         <w:pStyle w:val="Heading2"/>
       </w:pPr>
@@ -2203,7 +3002,7 @@
     </w:p>
     <w:p>
       <w:r>
-        <w:t>Поток действий пользователя при импорте и анализе пакета писем формализован на рисунке 3.1 (UML Activity). Пользователь вводит параметры IMAP, клиент подключается к серверу, получает список UID, для каждого запрашивает RFC822-представление, отправляет POST /analyze/email и получает JSON. Далее выполняется проверка «спам или фишинг»: письма такого типа подсвечиваются красным и добавляются в уведомления, остальные обновляют счётчики категорий в главном окне.</w:t>
+        <w:t>Поток действий пользователя при импорте и анализе пакета писем формализован на рисунке 3.5 (UML Activity). Пользователь вводит параметры IMAP, клиент подключается к серверу, получает список UID, для каждого запрашивает RFC822-представление, отправляет POST /analyze/email и получает JSON. Далее выполняется проверка «спам или фишинг»: письма такого типа подсвечиваются красным и добавляются в уведомления, остальные обновляют счётчики категорий в главном окне.</w:t>
       </w:r>
     </w:p>
     <w:p>
@@ -2215,7 +3014,7 @@
         <w:drawing>
           <wp:inline xmlns:a="http://schemas.openxmlformats.org/drawingml/2006/main" xmlns:pic="http://schemas.openxmlformats.org/drawingml/2006/picture">
             <wp:extent cx="4680000" cy="12160328"/>
-            <wp:docPr id="12" name="Picture 12"/>
+            <wp:docPr id="25" name="Picture 25"/>
             <wp:cNvGraphicFramePr>
               <a:graphicFrameLocks noChangeAspect="1"/>
             </wp:cNvGraphicFramePr>
@@ -2227,7 +3026,7 @@
                     <pic:cNvPicPr/>
                   </pic:nvPicPr>
                   <pic:blipFill>
-                    <a:blip r:embed="rId20"/>
+                    <a:blip r:embed="rId33"/>
                     <a:stretch>
                       <a:fillRect/>
                     </a:stretch>
@@ -2255,7 +3054,7 @@
         <w:rPr>
           <w:i/>
         </w:rPr>
-        <w:t>Рисунок 3.1 — UML Activity: импорт и анализ пакета писем</w:t>
+        <w:t>Рисунок 3.5 — UML Activity: импорт и анализ пакета писем</w:t>
       </w:r>
     </w:p>
     <w:p>
@@ -2301,7 +3100,7 @@
         <w:drawing>
           <wp:inline xmlns:a="http://schemas.openxmlformats.org/drawingml/2006/main" xmlns:pic="http://schemas.openxmlformats.org/drawingml/2006/picture">
             <wp:extent cx="6120000" cy="706736"/>
-            <wp:docPr id="13" name="Picture 13"/>
+            <wp:docPr id="26" name="Picture 26"/>
             <wp:cNvGraphicFramePr>
               <a:graphicFrameLocks noChangeAspect="1"/>
             </wp:cNvGraphicFramePr>
@@ -2313,7 +3112,7 @@
                     <pic:cNvPicPr/>
                   </pic:nvPicPr>
                   <pic:blipFill>
-                    <a:blip r:embed="rId21"/>
+                    <a:blip r:embed="rId34"/>
                     <a:stretch>
                       <a:fillRect/>
                     </a:stretch>
@@ -2386,7 +3185,7 @@
         <w:drawing>
           <wp:inline xmlns:a="http://schemas.openxmlformats.org/drawingml/2006/main" xmlns:pic="http://schemas.openxmlformats.org/drawingml/2006/picture">
             <wp:extent cx="5760000" cy="3200000"/>
-            <wp:docPr id="14" name="Picture 14"/>
+            <wp:docPr id="27" name="Picture 27"/>
             <wp:cNvGraphicFramePr>
               <a:graphicFrameLocks noChangeAspect="1"/>
             </wp:cNvGraphicFramePr>
@@ -2398,7 +3197,7 @@
                     <pic:cNvPicPr/>
                   </pic:nvPicPr>
                   <pic:blipFill>
-                    <a:blip r:embed="rId22"/>
+                    <a:blip r:embed="rId35"/>
                     <a:stretch>
                       <a:fillRect/>
                     </a:stretch>
@@ -2509,7 +3308,7 @@
         <w:drawing>
           <wp:inline xmlns:a="http://schemas.openxmlformats.org/drawingml/2006/main" xmlns:pic="http://schemas.openxmlformats.org/drawingml/2006/picture">
             <wp:extent cx="5400000" cy="3375000"/>
-            <wp:docPr id="15" name="Picture 15"/>
+            <wp:docPr id="28" name="Picture 28"/>
             <wp:cNvGraphicFramePr>
               <a:graphicFrameLocks noChangeAspect="1"/>
             </wp:cNvGraphicFramePr>
@@ -2521,7 +3320,7 @@
                     <pic:cNvPicPr/>
                   </pic:nvPicPr>
                   <pic:blipFill>
-                    <a:blip r:embed="rId23"/>
+                    <a:blip r:embed="rId36"/>
                     <a:stretch>
                       <a:fillRect/>
                     </a:stretch>
@@ -2613,7 +3412,7 @@
         <w:drawing>
           <wp:inline xmlns:a="http://schemas.openxmlformats.org/drawingml/2006/main" xmlns:pic="http://schemas.openxmlformats.org/drawingml/2006/picture">
             <wp:extent cx="5760000" cy="804731"/>
-            <wp:docPr id="16" name="Picture 16"/>
+            <wp:docPr id="29" name="Picture 29"/>
             <wp:cNvGraphicFramePr>
               <a:graphicFrameLocks noChangeAspect="1"/>
             </wp:cNvGraphicFramePr>
@@ -2625,7 +3424,7 @@
                     <pic:cNvPicPr/>
                   </pic:nvPicPr>
                   <pic:blipFill>
-                    <a:blip r:embed="rId24"/>
+                    <a:blip r:embed="rId37"/>
                     <a:stretch>
                       <a:fillRect/>
                     </a:stretch>
@@ -2706,7 +3505,7 @@
         <w:drawing>
           <wp:inline xmlns:a="http://schemas.openxmlformats.org/drawingml/2006/main" xmlns:pic="http://schemas.openxmlformats.org/drawingml/2006/picture">
             <wp:extent cx="6120000" cy="1991630"/>
-            <wp:docPr id="17" name="Picture 17"/>
+            <wp:docPr id="30" name="Picture 30"/>
             <wp:cNvGraphicFramePr>
               <a:graphicFrameLocks noChangeAspect="1"/>
             </wp:cNvGraphicFramePr>
@@ -2718,7 +3517,7 @@
                     <pic:cNvPicPr/>
                   </pic:nvPicPr>
                   <pic:blipFill>
-                    <a:blip r:embed="rId25"/>
+                    <a:blip r:embed="rId38"/>
                     <a:stretch>
                       <a:fillRect/>
                     </a:stretch>
@@ -3017,7 +3816,7 @@
         <w:drawing>
           <wp:inline xmlns:a="http://schemas.openxmlformats.org/drawingml/2006/main" xmlns:pic="http://schemas.openxmlformats.org/drawingml/2006/picture">
             <wp:extent cx="6120000" cy="2898340"/>
-            <wp:docPr id="18" name="Picture 18"/>
+            <wp:docPr id="31" name="Picture 31"/>
             <wp:cNvGraphicFramePr>
               <a:graphicFrameLocks noChangeAspect="1"/>
             </wp:cNvGraphicFramePr>
@@ -3075,7 +3874,7 @@
         <w:drawing>
           <wp:inline xmlns:a="http://schemas.openxmlformats.org/drawingml/2006/main" xmlns:pic="http://schemas.openxmlformats.org/drawingml/2006/picture">
             <wp:extent cx="6120000" cy="715775"/>
-            <wp:docPr id="19" name="Picture 19"/>
+            <wp:docPr id="32" name="Picture 32"/>
             <wp:cNvGraphicFramePr>
               <a:graphicFrameLocks noChangeAspect="1"/>
             </wp:cNvGraphicFramePr>
@@ -3133,7 +3932,7 @@
         <w:drawing>
           <wp:inline xmlns:a="http://schemas.openxmlformats.org/drawingml/2006/main" xmlns:pic="http://schemas.openxmlformats.org/drawingml/2006/picture">
             <wp:extent cx="6480000" cy="2160000"/>
-            <wp:docPr id="20" name="Picture 20"/>
+            <wp:docPr id="33" name="Picture 33"/>
             <wp:cNvGraphicFramePr>
               <a:graphicFrameLocks noChangeAspect="1"/>
             </wp:cNvGraphicFramePr>
@@ -3191,7 +3990,7 @@
         <w:drawing>
           <wp:inline xmlns:a="http://schemas.openxmlformats.org/drawingml/2006/main" xmlns:pic="http://schemas.openxmlformats.org/drawingml/2006/picture">
             <wp:extent cx="6480000" cy="11472787"/>
-            <wp:docPr id="21" name="Picture 21"/>
+            <wp:docPr id="34" name="Picture 34"/>
             <wp:cNvGraphicFramePr>
               <a:graphicFrameLocks noChangeAspect="1"/>
             </wp:cNvGraphicFramePr>
@@ -3249,7 +4048,7 @@
         <w:drawing>
           <wp:inline xmlns:a="http://schemas.openxmlformats.org/drawingml/2006/main" xmlns:pic="http://schemas.openxmlformats.org/drawingml/2006/picture">
             <wp:extent cx="5040000" cy="13095738"/>
-            <wp:docPr id="22" name="Picture 22"/>
+            <wp:docPr id="35" name="Picture 35"/>
             <wp:cNvGraphicFramePr>
               <a:graphicFrameLocks noChangeAspect="1"/>
             </wp:cNvGraphicFramePr>
@@ -3261,7 +4060,7 @@
                     <pic:cNvPicPr/>
                   </pic:nvPicPr>
                   <pic:blipFill>
-                    <a:blip r:embed="rId20"/>
+                    <a:blip r:embed="rId33"/>
                     <a:stretch>
                       <a:fillRect/>
                     </a:stretch>
@@ -3307,7 +4106,7 @@
         <w:drawing>
           <wp:inline xmlns:a="http://schemas.openxmlformats.org/drawingml/2006/main" xmlns:pic="http://schemas.openxmlformats.org/drawingml/2006/picture">
             <wp:extent cx="6480000" cy="2108785"/>
-            <wp:docPr id="23" name="Picture 23"/>
+            <wp:docPr id="36" name="Picture 36"/>
             <wp:cNvGraphicFramePr>
               <a:graphicFrameLocks noChangeAspect="1"/>
             </wp:cNvGraphicFramePr>
@@ -3319,7 +4118,7 @@
                     <pic:cNvPicPr/>
                   </pic:nvPicPr>
                   <pic:blipFill>
-                    <a:blip r:embed="rId25"/>
+                    <a:blip r:embed="rId38"/>
                     <a:stretch>
                       <a:fillRect/>
                     </a:stretch>
@@ -3365,7 +4164,7 @@
         <w:drawing>
           <wp:inline xmlns:a="http://schemas.openxmlformats.org/drawingml/2006/main" xmlns:pic="http://schemas.openxmlformats.org/drawingml/2006/picture">
             <wp:extent cx="6480000" cy="2377435"/>
-            <wp:docPr id="24" name="Picture 24"/>
+            <wp:docPr id="37" name="Picture 37"/>
             <wp:cNvGraphicFramePr>
               <a:graphicFrameLocks noChangeAspect="1"/>
             </wp:cNvGraphicFramePr>
@@ -3423,7 +4222,7 @@
         <w:drawing>
           <wp:inline xmlns:a="http://schemas.openxmlformats.org/drawingml/2006/main" xmlns:pic="http://schemas.openxmlformats.org/drawingml/2006/picture">
             <wp:extent cx="6480000" cy="543880"/>
-            <wp:docPr id="25" name="Picture 25"/>
+            <wp:docPr id="38" name="Picture 38"/>
             <wp:cNvGraphicFramePr>
               <a:graphicFrameLocks noChangeAspect="1"/>
             </wp:cNvGraphicFramePr>
@@ -3481,7 +4280,7 @@
         <w:drawing>
           <wp:inline xmlns:a="http://schemas.openxmlformats.org/drawingml/2006/main" xmlns:pic="http://schemas.openxmlformats.org/drawingml/2006/picture">
             <wp:extent cx="6480000" cy="1997967"/>
-            <wp:docPr id="26" name="Picture 26"/>
+            <wp:docPr id="39" name="Picture 39"/>
             <wp:cNvGraphicFramePr>
               <a:graphicFrameLocks noChangeAspect="1"/>
             </wp:cNvGraphicFramePr>
@@ -3539,7 +4338,7 @@
         <w:drawing>
           <wp:inline xmlns:a="http://schemas.openxmlformats.org/drawingml/2006/main" xmlns:pic="http://schemas.openxmlformats.org/drawingml/2006/picture">
             <wp:extent cx="6480000" cy="5937814"/>
-            <wp:docPr id="27" name="Picture 27"/>
+            <wp:docPr id="40" name="Picture 40"/>
             <wp:cNvGraphicFramePr>
               <a:graphicFrameLocks noChangeAspect="1"/>
             </wp:cNvGraphicFramePr>
@@ -3597,7 +4396,7 @@
         <w:drawing>
           <wp:inline xmlns:a="http://schemas.openxmlformats.org/drawingml/2006/main" xmlns:pic="http://schemas.openxmlformats.org/drawingml/2006/picture">
             <wp:extent cx="6120000" cy="1791796"/>
-            <wp:docPr id="28" name="Picture 28"/>
+            <wp:docPr id="41" name="Picture 41"/>
             <wp:cNvGraphicFramePr>
               <a:graphicFrameLocks noChangeAspect="1"/>
             </wp:cNvGraphicFramePr>
@@ -3655,7 +4454,7 @@
         <w:drawing>
           <wp:inline xmlns:a="http://schemas.openxmlformats.org/drawingml/2006/main" xmlns:pic="http://schemas.openxmlformats.org/drawingml/2006/picture">
             <wp:extent cx="5040000" cy="13829333"/>
-            <wp:docPr id="29" name="Picture 29"/>
+            <wp:docPr id="42" name="Picture 42"/>
             <wp:cNvGraphicFramePr>
               <a:graphicFrameLocks noChangeAspect="1"/>
             </wp:cNvGraphicFramePr>
@@ -3713,7 +4512,7 @@
         <w:drawing>
           <wp:inline xmlns:a="http://schemas.openxmlformats.org/drawingml/2006/main" xmlns:pic="http://schemas.openxmlformats.org/drawingml/2006/picture">
             <wp:extent cx="6480000" cy="748308"/>
-            <wp:docPr id="30" name="Picture 30"/>
+            <wp:docPr id="43" name="Picture 43"/>
             <wp:cNvGraphicFramePr>
               <a:graphicFrameLocks noChangeAspect="1"/>
             </wp:cNvGraphicFramePr>
@@ -3725,7 +4524,7 @@
                     <pic:cNvPicPr/>
                   </pic:nvPicPr>
                   <pic:blipFill>
-                    <a:blip r:embed="rId21"/>
+                    <a:blip r:embed="rId34"/>
                     <a:stretch>
                       <a:fillRect/>
                     </a:stretch>
@@ -3771,7 +4570,7 @@
         <w:drawing>
           <wp:inline xmlns:a="http://schemas.openxmlformats.org/drawingml/2006/main" xmlns:pic="http://schemas.openxmlformats.org/drawingml/2006/picture">
             <wp:extent cx="6120000" cy="855027"/>
-            <wp:docPr id="31" name="Picture 31"/>
+            <wp:docPr id="44" name="Picture 44"/>
             <wp:cNvGraphicFramePr>
               <a:graphicFrameLocks noChangeAspect="1"/>
             </wp:cNvGraphicFramePr>
@@ -3783,7 +4582,7 @@
                     <pic:cNvPicPr/>
                   </pic:nvPicPr>
                   <pic:blipFill>
-                    <a:blip r:embed="rId24"/>
+                    <a:blip r:embed="rId37"/>
                     <a:stretch>
                       <a:fillRect/>
                     </a:stretch>
@@ -3848,7 +4647,7 @@
         <w:drawing>
           <wp:inline xmlns:a="http://schemas.openxmlformats.org/drawingml/2006/main" xmlns:pic="http://schemas.openxmlformats.org/drawingml/2006/picture">
             <wp:extent cx="5040000" cy="2800000"/>
-            <wp:docPr id="32" name="Picture 32"/>
+            <wp:docPr id="45" name="Picture 45"/>
             <wp:cNvGraphicFramePr>
               <a:graphicFrameLocks noChangeAspect="1"/>
             </wp:cNvGraphicFramePr>
@@ -3860,7 +4659,7 @@
                     <pic:cNvPicPr/>
                   </pic:nvPicPr>
                   <pic:blipFill>
-                    <a:blip r:embed="rId26"/>
+                    <a:blip r:embed="rId39"/>
                     <a:stretch>
                       <a:fillRect/>
                     </a:stretch>
@@ -3901,7 +4700,7 @@
         <w:drawing>
           <wp:inline xmlns:a="http://schemas.openxmlformats.org/drawingml/2006/main" xmlns:pic="http://schemas.openxmlformats.org/drawingml/2006/picture">
             <wp:extent cx="5040000" cy="3150000"/>
-            <wp:docPr id="33" name="Picture 33"/>
+            <wp:docPr id="46" name="Picture 46"/>
             <wp:cNvGraphicFramePr>
               <a:graphicFrameLocks noChangeAspect="1"/>
             </wp:cNvGraphicFramePr>
@@ -3913,7 +4712,7 @@
                     <pic:cNvPicPr/>
                   </pic:nvPicPr>
                   <pic:blipFill>
-                    <a:blip r:embed="rId27"/>
+                    <a:blip r:embed="rId40"/>
                     <a:stretch>
                       <a:fillRect/>
                     </a:stretch>
@@ -3954,7 +4753,7 @@
         <w:drawing>
           <wp:inline xmlns:a="http://schemas.openxmlformats.org/drawingml/2006/main" xmlns:pic="http://schemas.openxmlformats.org/drawingml/2006/picture">
             <wp:extent cx="5040000" cy="3854118"/>
-            <wp:docPr id="34" name="Picture 34"/>
+            <wp:docPr id="47" name="Picture 47"/>
             <wp:cNvGraphicFramePr>
               <a:graphicFrameLocks noChangeAspect="1"/>
             </wp:cNvGraphicFramePr>
@@ -3966,7 +4765,7 @@
                     <pic:cNvPicPr/>
                   </pic:nvPicPr>
                   <pic:blipFill>
-                    <a:blip r:embed="rId28"/>
+                    <a:blip r:embed="rId41"/>
                     <a:stretch>
                       <a:fillRect/>
                     </a:stretch>
@@ -4007,7 +4806,7 @@
         <w:drawing>
           <wp:inline xmlns:a="http://schemas.openxmlformats.org/drawingml/2006/main" xmlns:pic="http://schemas.openxmlformats.org/drawingml/2006/picture">
             <wp:extent cx="5040000" cy="3959999"/>
-            <wp:docPr id="35" name="Picture 35"/>
+            <wp:docPr id="48" name="Picture 48"/>
             <wp:cNvGraphicFramePr>
               <a:graphicFrameLocks noChangeAspect="1"/>
             </wp:cNvGraphicFramePr>
@@ -4019,7 +4818,7 @@
                     <pic:cNvPicPr/>
                   </pic:nvPicPr>
                   <pic:blipFill>
-                    <a:blip r:embed="rId29"/>
+                    <a:blip r:embed="rId42"/>
                     <a:stretch>
                       <a:fillRect/>
                     </a:stretch>
@@ -4060,7 +4859,7 @@
         <w:drawing>
           <wp:inline xmlns:a="http://schemas.openxmlformats.org/drawingml/2006/main" xmlns:pic="http://schemas.openxmlformats.org/drawingml/2006/picture">
             <wp:extent cx="5040000" cy="3360000"/>
-            <wp:docPr id="36" name="Picture 36"/>
+            <wp:docPr id="49" name="Picture 49"/>
             <wp:cNvGraphicFramePr>
               <a:graphicFrameLocks noChangeAspect="1"/>
             </wp:cNvGraphicFramePr>
@@ -4072,7 +4871,7 @@
                     <pic:cNvPicPr/>
                   </pic:nvPicPr>
                   <pic:blipFill>
-                    <a:blip r:embed="rId30"/>
+                    <a:blip r:embed="rId43"/>
                     <a:stretch>
                       <a:fillRect/>
                     </a:stretch>
@@ -4113,7 +4912,7 @@
         <w:drawing>
           <wp:inline xmlns:a="http://schemas.openxmlformats.org/drawingml/2006/main" xmlns:pic="http://schemas.openxmlformats.org/drawingml/2006/picture">
             <wp:extent cx="5040000" cy="3360000"/>
-            <wp:docPr id="37" name="Picture 37"/>
+            <wp:docPr id="50" name="Picture 50"/>
             <wp:cNvGraphicFramePr>
               <a:graphicFrameLocks noChangeAspect="1"/>
             </wp:cNvGraphicFramePr>
@@ -4125,7 +4924,7 @@
                     <pic:cNvPicPr/>
                   </pic:nvPicPr>
                   <pic:blipFill>
-                    <a:blip r:embed="rId31"/>
+                    <a:blip r:embed="rId44"/>
                     <a:stretch>
                       <a:fillRect/>
                     </a:stretch>
@@ -4166,7 +4965,7 @@
         <w:drawing>
           <wp:inline xmlns:a="http://schemas.openxmlformats.org/drawingml/2006/main" xmlns:pic="http://schemas.openxmlformats.org/drawingml/2006/picture">
             <wp:extent cx="5040000" cy="3464999"/>
-            <wp:docPr id="38" name="Picture 38"/>
+            <wp:docPr id="51" name="Picture 51"/>
             <wp:cNvGraphicFramePr>
               <a:graphicFrameLocks noChangeAspect="1"/>
             </wp:cNvGraphicFramePr>
@@ -4178,7 +4977,7 @@
                     <pic:cNvPicPr/>
                   </pic:nvPicPr>
                   <pic:blipFill>
-                    <a:blip r:embed="rId32"/>
+                    <a:blip r:embed="rId45"/>
                     <a:stretch>
                       <a:fillRect/>
                     </a:stretch>
@@ -4219,7 +5018,7 @@
         <w:drawing>
           <wp:inline xmlns:a="http://schemas.openxmlformats.org/drawingml/2006/main" xmlns:pic="http://schemas.openxmlformats.org/drawingml/2006/picture">
             <wp:extent cx="5040000" cy="2730000"/>
-            <wp:docPr id="39" name="Picture 39"/>
+            <wp:docPr id="52" name="Picture 52"/>
             <wp:cNvGraphicFramePr>
               <a:graphicFrameLocks noChangeAspect="1"/>
             </wp:cNvGraphicFramePr>
@@ -4231,7 +5030,7 @@
                     <pic:cNvPicPr/>
                   </pic:nvPicPr>
                   <pic:blipFill>
-                    <a:blip r:embed="rId33"/>
+                    <a:blip r:embed="rId46"/>
                     <a:stretch>
                       <a:fillRect/>
                     </a:stretch>
@@ -4272,7 +5071,7 @@
         <w:drawing>
           <wp:inline xmlns:a="http://schemas.openxmlformats.org/drawingml/2006/main" xmlns:pic="http://schemas.openxmlformats.org/drawingml/2006/picture">
             <wp:extent cx="5040000" cy="4095000"/>
-            <wp:docPr id="40" name="Picture 40"/>
+            <wp:docPr id="53" name="Picture 53"/>
             <wp:cNvGraphicFramePr>
               <a:graphicFrameLocks noChangeAspect="1"/>
             </wp:cNvGraphicFramePr>
@@ -4284,7 +5083,7 @@
                     <pic:cNvPicPr/>
                   </pic:nvPicPr>
                   <pic:blipFill>
-                    <a:blip r:embed="rId34"/>
+                    <a:blip r:embed="rId47"/>
                     <a:stretch>
                       <a:fillRect/>
                     </a:stretch>
@@ -4325,7 +5124,7 @@
         <w:drawing>
           <wp:inline xmlns:a="http://schemas.openxmlformats.org/drawingml/2006/main" xmlns:pic="http://schemas.openxmlformats.org/drawingml/2006/picture">
             <wp:extent cx="5040000" cy="3448421"/>
-            <wp:docPr id="41" name="Picture 41"/>
+            <wp:docPr id="54" name="Picture 54"/>
             <wp:cNvGraphicFramePr>
               <a:graphicFrameLocks noChangeAspect="1"/>
             </wp:cNvGraphicFramePr>
@@ -4337,7 +5136,7 @@
                     <pic:cNvPicPr/>
                   </pic:nvPicPr>
                   <pic:blipFill>
-                    <a:blip r:embed="rId35"/>
+                    <a:blip r:embed="rId48"/>
                     <a:stretch>
                       <a:fillRect/>
                     </a:stretch>
@@ -4378,7 +5177,7 @@
         <w:drawing>
           <wp:inline xmlns:a="http://schemas.openxmlformats.org/drawingml/2006/main" xmlns:pic="http://schemas.openxmlformats.org/drawingml/2006/picture">
             <wp:extent cx="5040000" cy="3876923"/>
-            <wp:docPr id="42" name="Picture 42"/>
+            <wp:docPr id="55" name="Picture 55"/>
             <wp:cNvGraphicFramePr>
               <a:graphicFrameLocks noChangeAspect="1"/>
             </wp:cNvGraphicFramePr>
@@ -4390,7 +5189,7 @@
                     <pic:cNvPicPr/>
                   </pic:nvPicPr>
                   <pic:blipFill>
-                    <a:blip r:embed="rId36"/>
+                    <a:blip r:embed="rId49"/>
                     <a:stretch>
                       <a:fillRect/>
                     </a:stretch>
@@ -4431,7 +5230,7 @@
         <w:drawing>
           <wp:inline xmlns:a="http://schemas.openxmlformats.org/drawingml/2006/main" xmlns:pic="http://schemas.openxmlformats.org/drawingml/2006/picture">
             <wp:extent cx="5040000" cy="3360000"/>
-            <wp:docPr id="43" name="Picture 43"/>
+            <wp:docPr id="56" name="Picture 56"/>
             <wp:cNvGraphicFramePr>
               <a:graphicFrameLocks noChangeAspect="1"/>
             </wp:cNvGraphicFramePr>
@@ -4443,7 +5242,7 @@
                     <pic:cNvPicPr/>
                   </pic:nvPicPr>
                   <pic:blipFill>
-                    <a:blip r:embed="rId37"/>
+                    <a:blip r:embed="rId50"/>
                     <a:stretch>
                       <a:fillRect/>
                     </a:stretch>
@@ -4484,7 +5283,7 @@
         <w:drawing>
           <wp:inline xmlns:a="http://schemas.openxmlformats.org/drawingml/2006/main" xmlns:pic="http://schemas.openxmlformats.org/drawingml/2006/picture">
             <wp:extent cx="5040000" cy="2639999"/>
-            <wp:docPr id="44" name="Picture 44"/>
+            <wp:docPr id="57" name="Picture 57"/>
             <wp:cNvGraphicFramePr>
               <a:graphicFrameLocks noChangeAspect="1"/>
             </wp:cNvGraphicFramePr>
@@ -4496,7 +5295,7 @@
                     <pic:cNvPicPr/>
                   </pic:nvPicPr>
                   <pic:blipFill>
-                    <a:blip r:embed="rId38"/>
+                    <a:blip r:embed="rId51"/>
                     <a:stretch>
                       <a:fillRect/>
                     </a:stretch>
@@ -4537,7 +5336,7 @@
         <w:drawing>
           <wp:inline xmlns:a="http://schemas.openxmlformats.org/drawingml/2006/main" xmlns:pic="http://schemas.openxmlformats.org/drawingml/2006/picture">
             <wp:extent cx="5040000" cy="3286957"/>
-            <wp:docPr id="45" name="Picture 45"/>
+            <wp:docPr id="58" name="Picture 58"/>
             <wp:cNvGraphicFramePr>
               <a:graphicFrameLocks noChangeAspect="1"/>
             </wp:cNvGraphicFramePr>
@@ -4549,7 +5348,7 @@
                     <pic:cNvPicPr/>
                   </pic:nvPicPr>
                   <pic:blipFill>
-                    <a:blip r:embed="rId39"/>
+                    <a:blip r:embed="rId52"/>
                     <a:stretch>
                       <a:fillRect/>
                     </a:stretch>

</xml_diff>